<commit_message>
Coloque el indice del marco teorico provisional
</commit_message>
<xml_diff>
--- a/Revisiones-Tesina/Marco-Teorico/ANTEPROYECTO AV4 GUSTAVO DE JESUS ESCOBAR MATA.docx
+++ b/Revisiones-Tesina/Marco-Teorico/ANTEPROYECTO AV4 GUSTAVO DE JESUS ESCOBAR MATA.docx
@@ -149,7 +149,7 @@
                     </pic:cNvPicPr>
                   </pic:nvPicPr>
                   <pic:blipFill>
-                    <a:blip r:embed="rId10" cstate="print">
+                    <a:blip r:embed="rId11" cstate="print">
                       <a:extLst>
                         <a:ext uri="{28A0092B-C50C-407E-A947-70E740481C1C}">
                           <a14:useLocalDpi xmlns:a14="http://schemas.microsoft.com/office/drawing/2010/main" val="0"/>
@@ -801,107 +801,57 @@
           <w:rFonts w:ascii="Arial" w:hAnsi="Arial" w:cs="Arial"/>
           <w:lang w:val="es-ES"/>
         </w:rPr>
-        <w:t xml:space="preserve">(Título y </w:t>
-      </w:r>
-      <w:proofErr w:type="gramStart"/>
-      <w:r>
-        <w:rPr>
-          <w:rFonts w:ascii="Arial" w:hAnsi="Arial" w:cs="Arial"/>
-          <w:lang w:val="es-ES"/>
-        </w:rPr>
-        <w:t xml:space="preserve">nombre)   </w:t>
-      </w:r>
-      <w:proofErr w:type="gramEnd"/>
-      <w:r>
-        <w:rPr>
-          <w:rFonts w:ascii="Arial" w:hAnsi="Arial" w:cs="Arial"/>
-          <w:lang w:val="es-ES"/>
-        </w:rPr>
-        <w:t xml:space="preserve">                                   </w:t>
-      </w:r>
-      <w:proofErr w:type="gramStart"/>
-      <w:r>
-        <w:rPr>
-          <w:rFonts w:ascii="Arial" w:hAnsi="Arial" w:cs="Arial"/>
-          <w:lang w:val="es-ES"/>
-        </w:rPr>
-        <w:t xml:space="preserve">   (</w:t>
-      </w:r>
-      <w:proofErr w:type="gramEnd"/>
-      <w:r>
-        <w:rPr>
-          <w:rFonts w:ascii="Arial" w:hAnsi="Arial" w:cs="Arial"/>
-          <w:lang w:val="es-ES"/>
-        </w:rPr>
-        <w:t>Título y nombre)</w:t>
-      </w:r>
-    </w:p>
-    <w:p>
-      <w:pPr>
-        <w:jc w:val="center"/>
-        <w:rPr>
-          <w:rFonts w:ascii="Arial" w:hAnsi="Arial" w:cs="Arial"/>
-          <w:lang w:val="es-ES"/>
-        </w:rPr>
-      </w:pPr>
-      <w:r>
-        <w:rPr>
-          <w:rFonts w:ascii="Arial" w:hAnsi="Arial" w:cs="Arial"/>
-          <w:lang w:val="es-ES"/>
-        </w:rPr>
-        <w:t xml:space="preserve">Revisor                                                        </w:t>
-      </w:r>
-      <w:proofErr w:type="spellStart"/>
-      <w:r>
-        <w:rPr>
-          <w:rFonts w:ascii="Arial" w:hAnsi="Arial" w:cs="Arial"/>
-          <w:lang w:val="es-ES"/>
-        </w:rPr>
-        <w:t>Revisor</w:t>
-      </w:r>
-      <w:proofErr w:type="spellEnd"/>
-    </w:p>
-    <w:p>
-      <w:pPr>
-        <w:jc w:val="center"/>
-        <w:rPr>
-          <w:rFonts w:ascii="Arial" w:hAnsi="Arial" w:cs="Arial"/>
-          <w:lang w:val="es-ES"/>
-        </w:rPr>
-      </w:pPr>
-    </w:p>
-    <w:p>
-      <w:pPr>
-        <w:jc w:val="center"/>
-        <w:rPr>
-          <w:rFonts w:ascii="Arial" w:hAnsi="Arial" w:cs="Arial"/>
-          <w:lang w:val="es-ES"/>
-        </w:rPr>
-      </w:pPr>
-    </w:p>
-    <w:p>
-      <w:pPr>
-        <w:jc w:val="center"/>
-        <w:rPr>
-          <w:rFonts w:ascii="Arial" w:hAnsi="Arial" w:cs="Arial"/>
-          <w:lang w:val="es-ES"/>
-        </w:rPr>
-      </w:pPr>
-      <w:proofErr w:type="spellStart"/>
-      <w:r>
-        <w:rPr>
-          <w:rFonts w:ascii="Arial" w:hAnsi="Arial" w:cs="Arial"/>
-          <w:lang w:val="es-ES"/>
-        </w:rPr>
-        <w:t>Vo.Bo</w:t>
-      </w:r>
-      <w:proofErr w:type="spellEnd"/>
-      <w:r>
-        <w:rPr>
-          <w:rFonts w:ascii="Arial" w:hAnsi="Arial" w:cs="Arial"/>
-          <w:lang w:val="es-ES"/>
-        </w:rPr>
-        <w:t>.</w:t>
+        <w:t>(Título y nombre)                                         (Título y nombre)</w:t>
+      </w:r>
+    </w:p>
+    <w:p>
+      <w:pPr>
+        <w:jc w:val="center"/>
+        <w:rPr>
+          <w:rFonts w:ascii="Arial" w:hAnsi="Arial" w:cs="Arial"/>
+          <w:lang w:val="es-ES"/>
+        </w:rPr>
+      </w:pPr>
+      <w:r>
+        <w:rPr>
+          <w:rFonts w:ascii="Arial" w:hAnsi="Arial" w:cs="Arial"/>
+          <w:lang w:val="es-ES"/>
+        </w:rPr>
+        <w:t>Revisor                                                        Revisor</w:t>
+      </w:r>
+    </w:p>
+    <w:p>
+      <w:pPr>
+        <w:jc w:val="center"/>
+        <w:rPr>
+          <w:rFonts w:ascii="Arial" w:hAnsi="Arial" w:cs="Arial"/>
+          <w:lang w:val="es-ES"/>
+        </w:rPr>
+      </w:pPr>
+    </w:p>
+    <w:p>
+      <w:pPr>
+        <w:jc w:val="center"/>
+        <w:rPr>
+          <w:rFonts w:ascii="Arial" w:hAnsi="Arial" w:cs="Arial"/>
+          <w:lang w:val="es-ES"/>
+        </w:rPr>
+      </w:pPr>
+    </w:p>
+    <w:p>
+      <w:pPr>
+        <w:jc w:val="center"/>
+        <w:rPr>
+          <w:rFonts w:ascii="Arial" w:hAnsi="Arial" w:cs="Arial"/>
+          <w:lang w:val="es-ES"/>
+        </w:rPr>
+      </w:pPr>
+      <w:r>
+        <w:rPr>
+          <w:rFonts w:ascii="Arial" w:hAnsi="Arial" w:cs="Arial"/>
+          <w:lang w:val="es-ES"/>
+        </w:rPr>
+        <w:t>Vo.Bo.</w:t>
       </w:r>
     </w:p>
     <w:p>
@@ -1449,9 +1399,20 @@
         <w:rPr>
           <w:rFonts w:ascii="Arial" w:hAnsi="Arial" w:cs="Arial"/>
         </w:rPr>
-        <w:t>(Subtítulo)……</w:t>
-      </w:r>
-      <w:proofErr w:type="gramStart"/>
+        <w:t>(Subtítulo)…………</w:t>
+      </w:r>
+      <w:r>
+        <w:rPr>
+          <w:rFonts w:ascii="Arial" w:hAnsi="Arial" w:cs="Arial"/>
+        </w:rPr>
+        <w:t>..</w:t>
+      </w:r>
+      <w:r>
+        <w:rPr>
+          <w:rFonts w:ascii="Arial" w:hAnsi="Arial" w:cs="Arial"/>
+        </w:rPr>
+        <w:t>……………………………………</w:t>
+      </w:r>
       <w:r>
         <w:rPr>
           <w:rFonts w:ascii="Arial" w:hAnsi="Arial" w:cs="Arial"/>
@@ -1462,140 +1423,83 @@
         <w:rPr>
           <w:rFonts w:ascii="Arial" w:hAnsi="Arial" w:cs="Arial"/>
         </w:rPr>
+        <w:t>…….</w:t>
+      </w:r>
+      <w:r>
+        <w:rPr>
+          <w:rFonts w:ascii="Arial" w:hAnsi="Arial" w:cs="Arial"/>
+        </w:rPr>
+        <w:t>1</w:t>
+      </w:r>
+    </w:p>
+    <w:p>
+      <w:pPr>
+        <w:rPr>
+          <w:rFonts w:ascii="Arial" w:hAnsi="Arial" w:cs="Arial"/>
+        </w:rPr>
+      </w:pPr>
+      <w:r>
+        <w:rPr>
+          <w:rFonts w:ascii="Arial" w:hAnsi="Arial" w:cs="Arial"/>
+          <w:lang w:val="es-ES"/>
+        </w:rPr>
+        <w:tab/>
+      </w:r>
+      <w:r>
+        <w:rPr>
+          <w:rFonts w:ascii="Arial" w:hAnsi="Arial" w:cs="Arial"/>
+        </w:rPr>
+        <w:t xml:space="preserve">           1.1.1 (Subtítulo)………………………………</w:t>
+      </w:r>
+      <w:r>
+        <w:rPr>
+          <w:rFonts w:ascii="Arial" w:hAnsi="Arial" w:cs="Arial"/>
+        </w:rPr>
+        <w:t>……………………</w:t>
+      </w:r>
+      <w:r>
+        <w:rPr>
+          <w:rFonts w:ascii="Arial" w:hAnsi="Arial" w:cs="Arial"/>
+        </w:rPr>
         <w:t>.</w:t>
       </w:r>
-      <w:proofErr w:type="gramEnd"/>
+      <w:r>
+        <w:rPr>
+          <w:rFonts w:ascii="Arial" w:hAnsi="Arial" w:cs="Arial"/>
+        </w:rPr>
+        <w:t>1</w:t>
+      </w:r>
+    </w:p>
+    <w:p>
+      <w:pPr>
+        <w:rPr>
+          <w:rFonts w:ascii="Arial" w:hAnsi="Arial" w:cs="Arial"/>
+        </w:rPr>
+      </w:pPr>
+      <w:r>
+        <w:rPr>
+          <w:rFonts w:ascii="Arial" w:hAnsi="Arial" w:cs="Arial"/>
+        </w:rPr>
+        <w:t xml:space="preserve">             1.2   (Subtítulo)……………………………………………………</w:t>
+      </w:r>
+      <w:r>
+        <w:rPr>
+          <w:rFonts w:ascii="Arial" w:hAnsi="Arial" w:cs="Arial"/>
+        </w:rPr>
+        <w:t>…….</w:t>
+      </w:r>
+      <w:r>
+        <w:rPr>
+          <w:rFonts w:ascii="Arial" w:hAnsi="Arial" w:cs="Arial"/>
+        </w:rPr>
+        <w:t>..</w:t>
+      </w:r>
       <w:r>
         <w:rPr>
           <w:rFonts w:ascii="Arial" w:hAnsi="Arial" w:cs="Arial"/>
         </w:rPr>
         <w:t>.</w:t>
       </w:r>
-      <w:r>
-        <w:rPr>
-          <w:rFonts w:ascii="Arial" w:hAnsi="Arial" w:cs="Arial"/>
-        </w:rPr>
-        <w:t>……………………………………</w:t>
-      </w:r>
-      <w:r>
-        <w:rPr>
-          <w:rFonts w:ascii="Arial" w:hAnsi="Arial" w:cs="Arial"/>
-        </w:rPr>
-        <w:t>……</w:t>
-      </w:r>
-      <w:proofErr w:type="gramStart"/>
-      <w:r>
-        <w:rPr>
-          <w:rFonts w:ascii="Arial" w:hAnsi="Arial" w:cs="Arial"/>
-        </w:rPr>
-        <w:t>…….</w:t>
-      </w:r>
-      <w:proofErr w:type="gramEnd"/>
-      <w:r>
-        <w:rPr>
-          <w:rFonts w:ascii="Arial" w:hAnsi="Arial" w:cs="Arial"/>
-        </w:rPr>
-        <w:t>1</w:t>
-      </w:r>
-    </w:p>
-    <w:p>
-      <w:pPr>
-        <w:rPr>
-          <w:rFonts w:ascii="Arial" w:hAnsi="Arial" w:cs="Arial"/>
-        </w:rPr>
-      </w:pPr>
-      <w:r>
-        <w:rPr>
-          <w:rFonts w:ascii="Arial" w:hAnsi="Arial" w:cs="Arial"/>
-          <w:lang w:val="es-ES"/>
-        </w:rPr>
-        <w:tab/>
-      </w:r>
-      <w:r>
-        <w:rPr>
-          <w:rFonts w:ascii="Arial" w:hAnsi="Arial" w:cs="Arial"/>
-        </w:rPr>
-        <w:t xml:space="preserve">           1.1.1 (Subtítulo)………………………………</w:t>
-      </w:r>
-      <w:r>
-        <w:rPr>
-          <w:rFonts w:ascii="Arial" w:hAnsi="Arial" w:cs="Arial"/>
-        </w:rPr>
-        <w:t>………………</w:t>
-      </w:r>
-      <w:proofErr w:type="gramStart"/>
-      <w:r>
-        <w:rPr>
-          <w:rFonts w:ascii="Arial" w:hAnsi="Arial" w:cs="Arial"/>
-        </w:rPr>
-        <w:t>……</w:t>
-      </w:r>
-      <w:r>
-        <w:rPr>
-          <w:rFonts w:ascii="Arial" w:hAnsi="Arial" w:cs="Arial"/>
-        </w:rPr>
-        <w:t>.</w:t>
-      </w:r>
-      <w:proofErr w:type="gramEnd"/>
-      <w:r>
-        <w:rPr>
-          <w:rFonts w:ascii="Arial" w:hAnsi="Arial" w:cs="Arial"/>
-        </w:rPr>
-        <w:t>1</w:t>
-      </w:r>
-    </w:p>
-    <w:p>
-      <w:pPr>
-        <w:rPr>
-          <w:rFonts w:ascii="Arial" w:hAnsi="Arial" w:cs="Arial"/>
-        </w:rPr>
-      </w:pPr>
-      <w:r>
-        <w:rPr>
-          <w:rFonts w:ascii="Arial" w:hAnsi="Arial" w:cs="Arial"/>
-        </w:rPr>
-        <w:t xml:space="preserve">             1.2</w:t>
-      </w:r>
-      <w:proofErr w:type="gramStart"/>
-      <w:r>
-        <w:rPr>
-          <w:rFonts w:ascii="Arial" w:hAnsi="Arial" w:cs="Arial"/>
-        </w:rPr>
-        <w:t xml:space="preserve">   (</w:t>
-      </w:r>
-      <w:proofErr w:type="gramEnd"/>
-      <w:r>
-        <w:rPr>
-          <w:rFonts w:ascii="Arial" w:hAnsi="Arial" w:cs="Arial"/>
-        </w:rPr>
-        <w:t>Subtítulo)……………………………………………………</w:t>
-      </w:r>
-      <w:r>
-        <w:rPr>
-          <w:rFonts w:ascii="Arial" w:hAnsi="Arial" w:cs="Arial"/>
-        </w:rPr>
-        <w:t>…</w:t>
-      </w:r>
-      <w:proofErr w:type="gramStart"/>
-      <w:r>
-        <w:rPr>
-          <w:rFonts w:ascii="Arial" w:hAnsi="Arial" w:cs="Arial"/>
-        </w:rPr>
-        <w:t>….</w:t>
-      </w:r>
-      <w:r>
-        <w:rPr>
-          <w:rFonts w:ascii="Arial" w:hAnsi="Arial" w:cs="Arial"/>
-        </w:rPr>
-        <w:t>..</w:t>
-      </w:r>
-      <w:r>
-        <w:rPr>
-          <w:rFonts w:ascii="Arial" w:hAnsi="Arial" w:cs="Arial"/>
-        </w:rPr>
-        <w:t>.</w:t>
-      </w:r>
-      <w:proofErr w:type="gramEnd"/>
       <w:r>
         <w:rPr>
           <w:rFonts w:ascii="Arial" w:hAnsi="Arial" w:cs="Arial"/>
@@ -1704,51 +1608,725 @@
           <w:rFonts w:ascii="Arial" w:hAnsi="Arial" w:cs="Arial"/>
           <w:lang w:val="es-ES"/>
         </w:rPr>
-        <w:t xml:space="preserve">              </w:t>
-      </w:r>
-      <w:r>
-        <w:rPr>
-          <w:rFonts w:ascii="Arial" w:hAnsi="Arial" w:cs="Arial"/>
-          <w:lang w:val="es-ES"/>
-        </w:rPr>
-        <w:t>2.1</w:t>
-      </w:r>
-      <w:proofErr w:type="gramStart"/>
-      <w:r>
-        <w:rPr>
-          <w:rFonts w:ascii="Arial" w:hAnsi="Arial" w:cs="Arial"/>
-          <w:lang w:val="es-ES"/>
-        </w:rPr>
-        <w:t xml:space="preserve">  </w:t>
-      </w:r>
-      <w:r>
-        <w:rPr>
-          <w:rFonts w:ascii="Arial" w:hAnsi="Arial" w:cs="Arial"/>
-          <w:lang w:val="es-ES"/>
+        <w:t>3.    JUSTIFICACIÓN</w:t>
+      </w:r>
+      <w:r>
+        <w:rPr>
+          <w:rFonts w:ascii="Arial" w:hAnsi="Arial" w:cs="Arial"/>
+          <w:lang w:val="es-ES"/>
+        </w:rPr>
+        <w:t>…………………………………………….........</w:t>
+      </w:r>
+      <w:r>
+        <w:rPr>
+          <w:rFonts w:ascii="Arial" w:hAnsi="Arial" w:cs="Arial"/>
+          <w:lang w:val="es-ES"/>
+        </w:rPr>
+        <w:t>.</w:t>
+      </w:r>
+      <w:r>
+        <w:rPr>
+          <w:rFonts w:ascii="Arial" w:hAnsi="Arial" w:cs="Arial"/>
+          <w:lang w:val="es-ES"/>
+        </w:rPr>
+        <w:t>..............</w:t>
+      </w:r>
+      <w:r>
+        <w:rPr>
+          <w:rFonts w:ascii="Arial" w:hAnsi="Arial" w:cs="Arial"/>
+          <w:lang w:val="es-ES"/>
+        </w:rPr>
+        <w:t>.3</w:t>
+      </w:r>
+    </w:p>
+    <w:p>
+      <w:pPr>
+        <w:rPr>
+          <w:rFonts w:ascii="Arial" w:hAnsi="Arial" w:cs="Arial"/>
+          <w:lang w:val="es-ES"/>
+        </w:rPr>
+      </w:pPr>
+    </w:p>
+    <w:p>
+      <w:pPr>
+        <w:rPr>
+          <w:rFonts w:ascii="Arial" w:hAnsi="Arial" w:cs="Arial"/>
+        </w:rPr>
+      </w:pPr>
+      <w:r>
+        <w:rPr>
+          <w:rFonts w:ascii="Arial" w:hAnsi="Arial" w:cs="Arial"/>
+        </w:rPr>
+        <w:t>4.    FORMULACIÓN DE OBJETIVOS…………………………..…</w:t>
+      </w:r>
+      <w:r>
+        <w:rPr>
+          <w:rFonts w:ascii="Arial" w:hAnsi="Arial" w:cs="Arial"/>
+        </w:rPr>
+        <w:t>……………</w:t>
+      </w:r>
+      <w:r>
+        <w:rPr>
+          <w:rFonts w:ascii="Arial" w:hAnsi="Arial" w:cs="Arial"/>
+        </w:rPr>
+        <w:t>4</w:t>
+      </w:r>
+    </w:p>
+    <w:p>
+      <w:pPr>
+        <w:rPr>
+          <w:rFonts w:ascii="Arial" w:hAnsi="Arial" w:cs="Arial"/>
+          <w:lang w:val="es-ES"/>
+        </w:rPr>
+      </w:pPr>
+    </w:p>
+    <w:p>
+      <w:pPr>
+        <w:rPr>
+          <w:rFonts w:ascii="Arial" w:hAnsi="Arial" w:cs="Arial"/>
+          <w:lang w:val="es-ES"/>
+        </w:rPr>
+      </w:pPr>
+      <w:r>
+        <w:rPr>
+          <w:rFonts w:ascii="Arial" w:hAnsi="Arial" w:cs="Arial"/>
+          <w:lang w:val="es-ES"/>
+        </w:rPr>
+        <w:t>5.    MARCO TEÓRICO</w:t>
+      </w:r>
+      <w:r>
+        <w:rPr>
+          <w:rFonts w:ascii="Arial" w:hAnsi="Arial" w:cs="Arial"/>
+          <w:lang w:val="es-ES"/>
+        </w:rPr>
+        <w:t>…………………………………………………</w:t>
+      </w:r>
+      <w:r>
+        <w:rPr>
+          <w:rFonts w:ascii="Arial" w:hAnsi="Arial" w:cs="Arial"/>
+          <w:lang w:val="es-ES"/>
+        </w:rPr>
+        <w:t>…………</w:t>
+      </w:r>
+      <w:r>
+        <w:rPr>
+          <w:rFonts w:ascii="Arial" w:hAnsi="Arial" w:cs="Arial"/>
+          <w:lang w:val="es-ES"/>
+        </w:rPr>
+        <w:t>5</w:t>
+      </w:r>
+    </w:p>
+    <w:p>
+      <w:pPr>
+        <w:ind w:left="709"/>
+        <w:rPr>
+          <w:rFonts w:ascii="Arial" w:hAnsi="Arial" w:cs="Arial"/>
+        </w:rPr>
+      </w:pPr>
+      <w:r>
+        <w:rPr>
+          <w:rFonts w:ascii="Arial" w:hAnsi="Arial" w:cs="Arial"/>
+        </w:rPr>
+        <w:t>5</w:t>
+      </w:r>
+      <w:r>
+        <w:rPr>
+          <w:rFonts w:ascii="Arial" w:hAnsi="Arial" w:cs="Arial"/>
+        </w:rPr>
+        <w:t>.1</w:t>
+      </w:r>
+      <w:r>
+        <w:rPr>
+          <w:rFonts w:ascii="Arial" w:hAnsi="Arial" w:cs="Arial"/>
         </w:rPr>
         <w:t xml:space="preserve"> </w:t>
       </w:r>
       <w:r>
         <w:rPr>
           <w:rFonts w:ascii="Arial" w:hAnsi="Arial" w:cs="Arial"/>
-          <w:lang w:val="es-ES"/>
-        </w:rPr>
-        <w:t>(</w:t>
-      </w:r>
-      <w:proofErr w:type="gramEnd"/>
-      <w:r>
-        <w:rPr>
-          <w:rFonts w:ascii="Arial" w:hAnsi="Arial" w:cs="Arial"/>
-          <w:lang w:val="es-ES"/>
-        </w:rPr>
-        <w:t xml:space="preserve">Subtítulo) </w:t>
-      </w:r>
-      <w:r>
-        <w:rPr>
-          <w:rFonts w:ascii="Arial" w:hAnsi="Arial" w:cs="Arial"/>
-          <w:lang w:val="es-ES"/>
-        </w:rPr>
-        <w:t>.......................................................................</w:t>
+        </w:rPr>
+        <w:t>Lavado de Dinero y Detección de Operaciones Sospechosas</w:t>
+      </w:r>
+    </w:p>
+    <w:p>
+      <w:pPr>
+        <w:ind w:left="1418"/>
+        <w:rPr>
+          <w:rFonts w:ascii="Arial" w:hAnsi="Arial" w:cs="Arial"/>
+        </w:rPr>
+      </w:pPr>
+      <w:r>
+        <w:rPr>
+          <w:rFonts w:ascii="Arial" w:hAnsi="Arial" w:cs="Arial"/>
+        </w:rPr>
+        <w:t>5</w:t>
+      </w:r>
+      <w:r>
+        <w:rPr>
+          <w:rFonts w:ascii="Arial" w:hAnsi="Arial" w:cs="Arial"/>
+        </w:rPr>
+        <w:t xml:space="preserve">.1.1 </w:t>
+      </w:r>
+      <w:r>
+        <w:rPr>
+          <w:rFonts w:ascii="Arial" w:hAnsi="Arial" w:cs="Arial"/>
+        </w:rPr>
+        <w:t>Concepto y Etapas del Lavado de Dinero</w:t>
+      </w:r>
+    </w:p>
+    <w:p>
+      <w:pPr>
+        <w:ind w:left="1418"/>
+        <w:rPr>
+          <w:rFonts w:ascii="Arial" w:hAnsi="Arial" w:cs="Arial"/>
+        </w:rPr>
+      </w:pPr>
+      <w:r>
+        <w:rPr>
+          <w:rFonts w:ascii="Arial" w:hAnsi="Arial" w:cs="Arial"/>
+        </w:rPr>
+        <w:t>5</w:t>
+      </w:r>
+      <w:r>
+        <w:rPr>
+          <w:rFonts w:ascii="Arial" w:hAnsi="Arial" w:cs="Arial"/>
+        </w:rPr>
+        <w:t>.1.</w:t>
+      </w:r>
+      <w:r>
+        <w:rPr>
+          <w:rFonts w:ascii="Arial" w:hAnsi="Arial" w:cs="Arial"/>
+        </w:rPr>
+        <w:t>2</w:t>
+      </w:r>
+      <w:r>
+        <w:rPr>
+          <w:rFonts w:ascii="Arial" w:hAnsi="Arial" w:cs="Arial"/>
+        </w:rPr>
+        <w:t xml:space="preserve"> </w:t>
+      </w:r>
+      <w:r>
+        <w:rPr>
+          <w:rFonts w:ascii="Arial" w:hAnsi="Arial" w:cs="Arial"/>
+        </w:rPr>
+        <w:t>Marco Normativo Internacional y Nacional</w:t>
+      </w:r>
+    </w:p>
+    <w:p>
+      <w:pPr>
+        <w:ind w:left="1418"/>
+        <w:rPr>
+          <w:rFonts w:ascii="Arial" w:hAnsi="Arial" w:cs="Arial"/>
+        </w:rPr>
+      </w:pPr>
+      <w:r>
+        <w:rPr>
+          <w:rFonts w:ascii="Arial" w:hAnsi="Arial" w:cs="Arial"/>
+        </w:rPr>
+        <w:t>5</w:t>
+      </w:r>
+      <w:r>
+        <w:rPr>
+          <w:rFonts w:ascii="Arial" w:hAnsi="Arial" w:cs="Arial"/>
+        </w:rPr>
+        <w:t>.1.</w:t>
+      </w:r>
+      <w:r>
+        <w:rPr>
+          <w:rFonts w:ascii="Arial" w:hAnsi="Arial" w:cs="Arial"/>
+        </w:rPr>
+        <w:t>3</w:t>
+      </w:r>
+      <w:r>
+        <w:rPr>
+          <w:rFonts w:ascii="Arial" w:hAnsi="Arial" w:cs="Arial"/>
+        </w:rPr>
+        <w:t xml:space="preserve"> </w:t>
+      </w:r>
+      <w:r>
+        <w:rPr>
+          <w:rFonts w:ascii="Arial" w:hAnsi="Arial" w:cs="Arial"/>
+        </w:rPr>
+        <w:t>Monitoreo Transaccional Tradicional</w:t>
+      </w:r>
+    </w:p>
+    <w:p>
+      <w:pPr>
+        <w:ind w:left="709"/>
+        <w:rPr>
+          <w:rFonts w:ascii="Arial" w:hAnsi="Arial" w:cs="Arial"/>
+        </w:rPr>
+      </w:pPr>
+      <w:r>
+        <w:rPr>
+          <w:rFonts w:ascii="Arial" w:hAnsi="Arial" w:cs="Arial"/>
+        </w:rPr>
+        <w:t>5</w:t>
+      </w:r>
+      <w:r>
+        <w:rPr>
+          <w:rFonts w:ascii="Arial" w:hAnsi="Arial" w:cs="Arial"/>
+        </w:rPr>
+        <w:t>.2</w:t>
+      </w:r>
+      <w:r>
+        <w:rPr>
+          <w:rFonts w:ascii="Arial" w:hAnsi="Arial" w:cs="Arial"/>
+        </w:rPr>
+        <w:t xml:space="preserve"> </w:t>
+      </w:r>
+      <w:r>
+        <w:rPr>
+          <w:rFonts w:ascii="Arial" w:hAnsi="Arial" w:cs="Arial"/>
+        </w:rPr>
+        <w:t>Modelos de Aprendizaje Automático para la Detección de</w:t>
+      </w:r>
+      <w:r>
+        <w:rPr>
+          <w:rFonts w:ascii="Arial" w:hAnsi="Arial" w:cs="Arial"/>
+        </w:rPr>
+        <w:t xml:space="preserve"> </w:t>
+      </w:r>
+      <w:r>
+        <w:rPr>
+          <w:rFonts w:ascii="Arial" w:hAnsi="Arial" w:cs="Arial"/>
+        </w:rPr>
+        <w:t>Lavado de Dinero</w:t>
+      </w:r>
+    </w:p>
+    <w:p>
+      <w:pPr>
+        <w:ind w:left="1418"/>
+        <w:rPr>
+          <w:rFonts w:ascii="Arial" w:hAnsi="Arial" w:cs="Arial"/>
+        </w:rPr>
+      </w:pPr>
+      <w:r>
+        <w:rPr>
+          <w:rFonts w:ascii="Arial" w:hAnsi="Arial" w:cs="Arial"/>
+        </w:rPr>
+        <w:t xml:space="preserve">5.2.1 </w:t>
+      </w:r>
+      <w:r>
+        <w:rPr>
+          <w:rFonts w:ascii="Arial" w:hAnsi="Arial" w:cs="Arial"/>
+        </w:rPr>
+        <w:t xml:space="preserve">Aprendizaje Supervisado con </w:t>
+      </w:r>
+      <w:r>
+        <w:rPr>
+          <w:rFonts w:ascii="Arial" w:hAnsi="Arial" w:cs="Arial"/>
+        </w:rPr>
+        <w:t>Clases Desbalanceadas</w:t>
+      </w:r>
+    </w:p>
+    <w:p>
+      <w:pPr>
+        <w:ind w:left="1418"/>
+        <w:rPr>
+          <w:rFonts w:ascii="Arial" w:hAnsi="Arial" w:cs="Arial"/>
+        </w:rPr>
+      </w:pPr>
+      <w:r>
+        <w:rPr>
+          <w:rFonts w:ascii="Arial" w:hAnsi="Arial" w:cs="Arial"/>
+        </w:rPr>
+        <w:t xml:space="preserve">5.2.2 </w:t>
+      </w:r>
+      <w:r>
+        <w:rPr>
+          <w:rFonts w:ascii="Arial" w:hAnsi="Arial" w:cs="Arial"/>
+        </w:rPr>
+        <w:t>Modelos de Árboles y Potenciación de Gradiente</w:t>
+      </w:r>
+    </w:p>
+    <w:p>
+      <w:pPr>
+        <w:ind w:left="1418"/>
+        <w:rPr>
+          <w:rFonts w:ascii="Arial" w:hAnsi="Arial" w:cs="Arial"/>
+        </w:rPr>
+      </w:pPr>
+      <w:r>
+        <w:rPr>
+          <w:rFonts w:ascii="Arial" w:hAnsi="Arial" w:cs="Arial"/>
+        </w:rPr>
+        <w:t xml:space="preserve">5.2.3 </w:t>
+      </w:r>
+      <w:r>
+        <w:rPr>
+          <w:rFonts w:ascii="Arial" w:hAnsi="Arial" w:cs="Arial"/>
+        </w:rPr>
+        <w:t>Aplicaciones en la Detección de Lavado de Dinero</w:t>
+      </w:r>
+    </w:p>
+    <w:p>
+      <w:pPr>
+        <w:ind w:left="709"/>
+        <w:rPr>
+          <w:rFonts w:ascii="Arial" w:hAnsi="Arial" w:cs="Arial"/>
+        </w:rPr>
+      </w:pPr>
+      <w:r>
+        <w:rPr>
+          <w:rFonts w:ascii="Arial" w:hAnsi="Arial" w:cs="Arial"/>
+        </w:rPr>
+        <w:t xml:space="preserve">5.3 Pérdida de </w:t>
+      </w:r>
+      <w:r>
+        <w:rPr>
+          <w:rFonts w:ascii="Arial" w:hAnsi="Arial" w:cs="Arial"/>
+        </w:rPr>
+        <w:t>Eficacia</w:t>
+      </w:r>
+      <w:r>
+        <w:rPr>
+          <w:rFonts w:ascii="Arial" w:hAnsi="Arial" w:cs="Arial"/>
+        </w:rPr>
+        <w:t xml:space="preserve"> de los Modelos en Producción</w:t>
+      </w:r>
+    </w:p>
+    <w:p>
+      <w:pPr>
+        <w:ind w:left="1418"/>
+        <w:rPr>
+          <w:rFonts w:ascii="Arial" w:hAnsi="Arial" w:cs="Arial"/>
+        </w:rPr>
+      </w:pPr>
+      <w:r>
+        <w:rPr>
+          <w:rFonts w:ascii="Arial" w:hAnsi="Arial" w:cs="Arial"/>
+        </w:rPr>
+        <w:t>5.3.1 Cambio de Concepto y Cambio de Datos</w:t>
+      </w:r>
+    </w:p>
+    <w:p>
+      <w:pPr>
+        <w:ind w:left="1418"/>
+        <w:rPr>
+          <w:rFonts w:ascii="Arial" w:hAnsi="Arial" w:cs="Arial"/>
+        </w:rPr>
+      </w:pPr>
+      <w:r>
+        <w:rPr>
+          <w:rFonts w:ascii="Arial" w:hAnsi="Arial" w:cs="Arial"/>
+        </w:rPr>
+        <w:t>5.3.2 Tipos y Causas de</w:t>
+      </w:r>
+      <w:r>
+        <w:rPr>
+          <w:rFonts w:ascii="Arial" w:hAnsi="Arial" w:cs="Arial"/>
+        </w:rPr>
+        <w:t>l</w:t>
+      </w:r>
+      <w:r>
+        <w:rPr>
+          <w:rFonts w:ascii="Arial" w:hAnsi="Arial" w:cs="Arial"/>
+        </w:rPr>
+        <w:t xml:space="preserve"> Cambio</w:t>
+      </w:r>
+    </w:p>
+    <w:p>
+      <w:pPr>
+        <w:ind w:left="1418"/>
+        <w:rPr>
+          <w:rFonts w:ascii="Arial" w:hAnsi="Arial" w:cs="Arial"/>
+        </w:rPr>
+      </w:pPr>
+      <w:r>
+        <w:rPr>
+          <w:rFonts w:ascii="Arial" w:hAnsi="Arial" w:cs="Arial"/>
+        </w:rPr>
+        <w:t>5.3.3 Etiquetas con Retraso</w:t>
+      </w:r>
+    </w:p>
+    <w:p>
+      <w:pPr>
+        <w:ind w:left="1418"/>
+        <w:rPr>
+          <w:rFonts w:ascii="Arial" w:hAnsi="Arial" w:cs="Arial"/>
+        </w:rPr>
+      </w:pPr>
+      <w:r>
+        <w:rPr>
+          <w:rFonts w:ascii="Arial" w:hAnsi="Arial" w:cs="Arial"/>
+        </w:rPr>
+        <w:t xml:space="preserve">5.3.4 Detección de la Pérdida de </w:t>
+      </w:r>
+      <w:r>
+        <w:rPr>
+          <w:rFonts w:ascii="Arial" w:hAnsi="Arial" w:cs="Arial"/>
+        </w:rPr>
+        <w:t>Eficacia</w:t>
+      </w:r>
+      <w:r>
+        <w:rPr>
+          <w:rFonts w:ascii="Arial" w:hAnsi="Arial" w:cs="Arial"/>
+        </w:rPr>
+        <w:t xml:space="preserve"> </w:t>
+      </w:r>
+    </w:p>
+    <w:p>
+      <w:pPr>
+        <w:ind w:left="709"/>
+        <w:rPr>
+          <w:rFonts w:ascii="Arial" w:hAnsi="Arial" w:cs="Arial"/>
+        </w:rPr>
+      </w:pPr>
+      <w:r>
+        <w:rPr>
+          <w:rFonts w:ascii="Arial" w:hAnsi="Arial" w:cs="Arial"/>
+        </w:rPr>
+        <w:t>5</w:t>
+      </w:r>
+      <w:r>
+        <w:rPr>
+          <w:rFonts w:ascii="Arial" w:hAnsi="Arial" w:cs="Arial"/>
+        </w:rPr>
+        <w:t>.</w:t>
+      </w:r>
+      <w:r>
+        <w:rPr>
+          <w:rFonts w:ascii="Arial" w:hAnsi="Arial" w:cs="Arial"/>
+        </w:rPr>
+        <w:t>4</w:t>
+      </w:r>
+      <w:r>
+        <w:rPr>
+          <w:rFonts w:ascii="Arial" w:hAnsi="Arial" w:cs="Arial"/>
+        </w:rPr>
+        <w:t xml:space="preserve"> </w:t>
+      </w:r>
+      <w:r>
+        <w:rPr>
+          <w:rFonts w:ascii="Arial" w:hAnsi="Arial" w:cs="Arial"/>
+        </w:rPr>
+        <w:t xml:space="preserve">Agentes de Inteligencia </w:t>
+      </w:r>
+      <w:r>
+        <w:rPr>
+          <w:rFonts w:ascii="Arial" w:hAnsi="Arial" w:cs="Arial"/>
+        </w:rPr>
+        <w:t>Artificial</w:t>
+      </w:r>
+    </w:p>
+    <w:p>
+      <w:pPr>
+        <w:ind w:left="1418"/>
+        <w:rPr>
+          <w:rFonts w:ascii="Arial" w:hAnsi="Arial" w:cs="Arial"/>
+        </w:rPr>
+      </w:pPr>
+      <w:r>
+        <w:rPr>
+          <w:rFonts w:ascii="Arial" w:hAnsi="Arial" w:cs="Arial"/>
+        </w:rPr>
+        <w:t>5.</w:t>
+      </w:r>
+      <w:r>
+        <w:rPr>
+          <w:rFonts w:ascii="Arial" w:hAnsi="Arial" w:cs="Arial"/>
+        </w:rPr>
+        <w:t>4</w:t>
+      </w:r>
+      <w:r>
+        <w:rPr>
+          <w:rFonts w:ascii="Arial" w:hAnsi="Arial" w:cs="Arial"/>
+        </w:rPr>
+        <w:t>.1 Modelos de Lenguaje de Gran Tamaño</w:t>
+      </w:r>
+    </w:p>
+    <w:p>
+      <w:pPr>
+        <w:ind w:left="1418"/>
+        <w:rPr>
+          <w:rFonts w:ascii="Arial" w:hAnsi="Arial" w:cs="Arial"/>
+        </w:rPr>
+      </w:pPr>
+      <w:r>
+        <w:rPr>
+          <w:rFonts w:ascii="Arial" w:hAnsi="Arial" w:cs="Arial"/>
+        </w:rPr>
+        <w:t>5.</w:t>
+      </w:r>
+      <w:r>
+        <w:rPr>
+          <w:rFonts w:ascii="Arial" w:hAnsi="Arial" w:cs="Arial"/>
+        </w:rPr>
+        <w:t>4</w:t>
+      </w:r>
+      <w:r>
+        <w:rPr>
+          <w:rFonts w:ascii="Arial" w:hAnsi="Arial" w:cs="Arial"/>
+        </w:rPr>
+        <w:t>.2 Agentes con Uso de Herramientas</w:t>
+      </w:r>
+    </w:p>
+    <w:p>
+      <w:pPr>
+        <w:ind w:left="1418"/>
+        <w:rPr>
+          <w:rFonts w:ascii="Arial" w:hAnsi="Arial" w:cs="Arial"/>
+        </w:rPr>
+      </w:pPr>
+      <w:r>
+        <w:rPr>
+          <w:rFonts w:ascii="Arial" w:hAnsi="Arial" w:cs="Arial"/>
+        </w:rPr>
+        <w:t>5.</w:t>
+      </w:r>
+      <w:r>
+        <w:rPr>
+          <w:rFonts w:ascii="Arial" w:hAnsi="Arial" w:cs="Arial"/>
+        </w:rPr>
+        <w:t>4</w:t>
+      </w:r>
+      <w:r>
+        <w:rPr>
+          <w:rFonts w:ascii="Arial" w:hAnsi="Arial" w:cs="Arial"/>
+        </w:rPr>
+        <w:t>.3 Sistemas Multiagente y Evaluación con Juez</w:t>
+      </w:r>
+    </w:p>
+    <w:p>
+      <w:pPr>
+        <w:ind w:left="709"/>
+        <w:rPr>
+          <w:rFonts w:ascii="Arial" w:hAnsi="Arial" w:cs="Arial"/>
+        </w:rPr>
+      </w:pPr>
+      <w:r>
+        <w:rPr>
+          <w:rFonts w:ascii="Arial" w:hAnsi="Arial" w:cs="Arial"/>
+        </w:rPr>
+        <w:t xml:space="preserve">5.5 Trabajos </w:t>
+      </w:r>
+      <w:r>
+        <w:rPr>
+          <w:rFonts w:ascii="Arial" w:hAnsi="Arial" w:cs="Arial"/>
+        </w:rPr>
+        <w:t>R</w:t>
+      </w:r>
+      <w:r>
+        <w:rPr>
+          <w:rFonts w:ascii="Arial" w:hAnsi="Arial" w:cs="Arial"/>
+        </w:rPr>
+        <w:t>elacionados</w:t>
+      </w:r>
+    </w:p>
+    <w:p>
+      <w:pPr>
+        <w:rPr>
+          <w:rFonts w:ascii="Arial" w:hAnsi="Arial" w:cs="Arial"/>
+          <w:lang w:val="es-ES"/>
+        </w:rPr>
+      </w:pPr>
+    </w:p>
+    <w:p>
+      <w:pPr>
+        <w:rPr>
+          <w:rFonts w:ascii="Arial" w:hAnsi="Arial" w:cs="Arial"/>
+        </w:rPr>
+      </w:pPr>
+      <w:r>
+        <w:rPr>
+          <w:rFonts w:ascii="Arial" w:hAnsi="Arial" w:cs="Arial"/>
+        </w:rPr>
+        <w:lastRenderedPageBreak/>
+        <w:t>6.    METODOLOGÍA………………………………………………....…</w:t>
+      </w:r>
+      <w:r>
+        <w:rPr>
+          <w:rFonts w:ascii="Arial" w:hAnsi="Arial" w:cs="Arial"/>
+        </w:rPr>
+        <w:t>………....</w:t>
+      </w:r>
+      <w:r>
+        <w:rPr>
+          <w:rFonts w:ascii="Arial" w:hAnsi="Arial" w:cs="Arial"/>
+        </w:rPr>
+        <w:t>6</w:t>
+      </w:r>
+    </w:p>
+    <w:p>
+      <w:pPr>
+        <w:rPr>
+          <w:rFonts w:ascii="Arial" w:hAnsi="Arial" w:cs="Arial"/>
+          <w:lang w:val="es-ES"/>
+        </w:rPr>
+      </w:pPr>
+    </w:p>
+    <w:p>
+      <w:pPr>
+        <w:rPr>
+          <w:rFonts w:ascii="Arial" w:hAnsi="Arial" w:cs="Arial"/>
+          <w:lang w:val="es-ES"/>
+        </w:rPr>
+      </w:pPr>
+      <w:r>
+        <w:rPr>
+          <w:rFonts w:ascii="Arial" w:hAnsi="Arial" w:cs="Arial"/>
+          <w:lang w:val="es-ES"/>
+        </w:rPr>
+        <w:t>7.    RESULTADOS Y CONCLUSIONES</w:t>
+      </w:r>
+      <w:r>
+        <w:rPr>
+          <w:rFonts w:ascii="Arial" w:hAnsi="Arial" w:cs="Arial"/>
+          <w:lang w:val="es-ES"/>
+        </w:rPr>
+        <w:t>……………………………</w:t>
+      </w:r>
+      <w:r>
+        <w:rPr>
+          <w:rFonts w:ascii="Arial" w:hAnsi="Arial" w:cs="Arial"/>
+          <w:lang w:val="es-ES"/>
+        </w:rPr>
+        <w:t>…………...</w:t>
+      </w:r>
+      <w:r>
+        <w:rPr>
+          <w:rFonts w:ascii="Arial" w:hAnsi="Arial" w:cs="Arial"/>
+          <w:lang w:val="es-ES"/>
+        </w:rPr>
+        <w:t>7</w:t>
+      </w:r>
+    </w:p>
+    <w:p>
+      <w:pPr>
+        <w:rPr>
+          <w:rFonts w:ascii="Arial" w:hAnsi="Arial" w:cs="Arial"/>
+          <w:lang w:val="es-ES"/>
+        </w:rPr>
+      </w:pPr>
+    </w:p>
+    <w:p>
+      <w:pPr>
+        <w:rPr>
+          <w:rFonts w:ascii="Arial" w:hAnsi="Arial" w:cs="Arial"/>
+          <w:lang w:val="es-ES"/>
+        </w:rPr>
+      </w:pPr>
+      <w:r>
+        <w:rPr>
+          <w:rFonts w:ascii="Arial" w:hAnsi="Arial" w:cs="Arial"/>
+          <w:lang w:val="es-ES"/>
+        </w:rPr>
+        <w:t>REFERENCIAS...</w:t>
+      </w:r>
+      <w:r>
+        <w:rPr>
+          <w:rFonts w:ascii="Arial" w:hAnsi="Arial" w:cs="Arial"/>
+          <w:lang w:val="es-ES"/>
+        </w:rPr>
+        <w:t>………………………………...................……</w:t>
+      </w:r>
+      <w:r>
+        <w:rPr>
+          <w:rFonts w:ascii="Arial" w:hAnsi="Arial" w:cs="Arial"/>
+          <w:lang w:val="es-ES"/>
+        </w:rPr>
+        <w:t>………</w:t>
       </w:r>
       <w:r>
         <w:rPr>
@@ -1762,388 +2340,82 @@
           <w:rFonts w:ascii="Arial" w:hAnsi="Arial" w:cs="Arial"/>
           <w:lang w:val="es-ES"/>
         </w:rPr>
-        <w:t>..2</w:t>
-      </w:r>
-    </w:p>
-    <w:p>
-      <w:pPr>
-        <w:rPr>
-          <w:rFonts w:ascii="Arial" w:hAnsi="Arial" w:cs="Arial"/>
-          <w:lang w:val="es-ES"/>
-        </w:rPr>
-      </w:pPr>
-    </w:p>
-    <w:p>
-      <w:pPr>
-        <w:rPr>
-          <w:rFonts w:ascii="Arial" w:hAnsi="Arial" w:cs="Arial"/>
-          <w:lang w:val="es-ES"/>
-        </w:rPr>
-      </w:pPr>
-      <w:r>
-        <w:rPr>
-          <w:rFonts w:ascii="Arial" w:hAnsi="Arial" w:cs="Arial"/>
-          <w:lang w:val="es-ES"/>
-        </w:rPr>
-        <w:t>3.    JUSTIFICACIÓN</w:t>
-      </w:r>
-      <w:r>
-        <w:rPr>
-          <w:rFonts w:ascii="Arial" w:hAnsi="Arial" w:cs="Arial"/>
-          <w:lang w:val="es-ES"/>
-        </w:rPr>
-        <w:t>…………………………………………….........</w:t>
-      </w:r>
-      <w:r>
-        <w:rPr>
-          <w:rFonts w:ascii="Arial" w:hAnsi="Arial" w:cs="Arial"/>
-          <w:lang w:val="es-ES"/>
+        <w:t>..</w:t>
+      </w:r>
+      <w:r>
+        <w:rPr>
+          <w:rFonts w:ascii="Arial" w:hAnsi="Arial" w:cs="Arial"/>
+          <w:lang w:val="es-ES"/>
+        </w:rPr>
+        <w:t>...</w:t>
+      </w:r>
+      <w:r>
+        <w:rPr>
+          <w:rFonts w:ascii="Arial" w:hAnsi="Arial" w:cs="Arial"/>
+          <w:lang w:val="es-ES"/>
+        </w:rPr>
+        <w:t>8</w:t>
+      </w:r>
+    </w:p>
+    <w:p>
+      <w:pPr>
+        <w:rPr>
+          <w:rFonts w:ascii="Arial" w:hAnsi="Arial" w:cs="Arial"/>
+          <w:lang w:val="es-ES"/>
+        </w:rPr>
+      </w:pPr>
+    </w:p>
+    <w:p>
+      <w:pPr>
+        <w:rPr>
+          <w:rFonts w:ascii="Arial" w:hAnsi="Arial" w:cs="Arial"/>
+        </w:rPr>
+      </w:pPr>
+      <w:r>
+        <w:rPr>
+          <w:rFonts w:ascii="Arial" w:hAnsi="Arial" w:cs="Arial"/>
+        </w:rPr>
+        <w:t>APÉNDICES</w:t>
+      </w:r>
+      <w:r>
+        <w:rPr>
+          <w:rFonts w:ascii="Arial" w:hAnsi="Arial" w:cs="Arial"/>
+        </w:rPr>
+        <w:t>..........</w:t>
+      </w:r>
+      <w:r>
+        <w:rPr>
+          <w:rFonts w:ascii="Arial" w:hAnsi="Arial" w:cs="Arial"/>
+        </w:rPr>
+        <w:t>…………………………………………….....……….......</w:t>
+      </w:r>
+      <w:r>
+        <w:rPr>
+          <w:rFonts w:ascii="Arial" w:hAnsi="Arial" w:cs="Arial"/>
         </w:rPr>
         <w:t>.</w:t>
       </w:r>
       <w:r>
         <w:rPr>
           <w:rFonts w:ascii="Arial" w:hAnsi="Arial" w:cs="Arial"/>
-          <w:lang w:val="es-ES"/>
-        </w:rPr>
-        <w:t>..............</w:t>
-      </w:r>
-      <w:r>
-        <w:rPr>
-          <w:rFonts w:ascii="Arial" w:hAnsi="Arial" w:cs="Arial"/>
-          <w:lang w:val="es-ES"/>
-        </w:rPr>
-        <w:t>.3</w:t>
-      </w:r>
-    </w:p>
-    <w:p>
-      <w:pPr>
-        <w:rPr>
-          <w:rFonts w:ascii="Arial" w:hAnsi="Arial" w:cs="Arial"/>
-          <w:lang w:val="es-ES"/>
-        </w:rPr>
-      </w:pPr>
-    </w:p>
-    <w:p>
-      <w:pPr>
-        <w:rPr>
-          <w:rFonts w:ascii="Arial" w:hAnsi="Arial" w:cs="Arial"/>
-        </w:rPr>
-      </w:pPr>
-      <w:r>
-        <w:rPr>
-          <w:rFonts w:ascii="Arial" w:hAnsi="Arial" w:cs="Arial"/>
-        </w:rPr>
-        <w:t>4.    FORMULACIÓN DE OBJETIVOS……………………</w:t>
-      </w:r>
-      <w:proofErr w:type="gramStart"/>
-      <w:r>
-        <w:rPr>
-          <w:rFonts w:ascii="Arial" w:hAnsi="Arial" w:cs="Arial"/>
-        </w:rPr>
-        <w:t>…….</w:t>
-      </w:r>
-      <w:proofErr w:type="gramEnd"/>
-      <w:r>
-        <w:rPr>
-          <w:rFonts w:ascii="Arial" w:hAnsi="Arial" w:cs="Arial"/>
-        </w:rPr>
-        <w:t>.…</w:t>
-      </w:r>
-      <w:r>
-        <w:rPr>
-          <w:rFonts w:ascii="Arial" w:hAnsi="Arial" w:cs="Arial"/>
-        </w:rPr>
-        <w:t>……………</w:t>
-      </w:r>
-      <w:r>
-        <w:rPr>
-          <w:rFonts w:ascii="Arial" w:hAnsi="Arial" w:cs="Arial"/>
-        </w:rPr>
-        <w:t>4</w:t>
-      </w:r>
-    </w:p>
-    <w:p>
-      <w:pPr>
-        <w:rPr>
-          <w:rFonts w:ascii="Arial" w:hAnsi="Arial" w:cs="Arial"/>
-          <w:lang w:val="es-ES"/>
-        </w:rPr>
-      </w:pPr>
-    </w:p>
-    <w:p>
-      <w:pPr>
-        <w:rPr>
-          <w:rFonts w:ascii="Arial" w:hAnsi="Arial" w:cs="Arial"/>
-          <w:lang w:val="es-ES"/>
-        </w:rPr>
-      </w:pPr>
-      <w:r>
-        <w:rPr>
-          <w:rFonts w:ascii="Arial" w:hAnsi="Arial" w:cs="Arial"/>
-          <w:lang w:val="es-ES"/>
-        </w:rPr>
-        <w:t>5.    MARCO TEÓRICO</w:t>
-      </w:r>
-      <w:r>
-        <w:rPr>
-          <w:rFonts w:ascii="Arial" w:hAnsi="Arial" w:cs="Arial"/>
-          <w:lang w:val="es-ES"/>
-        </w:rPr>
-        <w:t>…………………………………………………</w:t>
-      </w:r>
-      <w:r>
-        <w:rPr>
-          <w:rFonts w:ascii="Arial" w:hAnsi="Arial" w:cs="Arial"/>
-          <w:lang w:val="es-ES"/>
-        </w:rPr>
-        <w:t>…………</w:t>
-      </w:r>
-      <w:r>
-        <w:rPr>
-          <w:rFonts w:ascii="Arial" w:hAnsi="Arial" w:cs="Arial"/>
-          <w:lang w:val="es-ES"/>
-        </w:rPr>
-        <w:t>5</w:t>
-      </w:r>
-    </w:p>
-    <w:p>
-      <w:pPr>
-        <w:rPr>
-          <w:rFonts w:ascii="Arial" w:hAnsi="Arial" w:cs="Arial"/>
-          <w:lang w:val="es-ES"/>
-        </w:rPr>
-      </w:pPr>
-    </w:p>
-    <w:p>
-      <w:pPr>
-        <w:rPr>
-          <w:rFonts w:ascii="Arial" w:hAnsi="Arial" w:cs="Arial"/>
-        </w:rPr>
-      </w:pPr>
-      <w:r>
-        <w:rPr>
-          <w:rFonts w:ascii="Arial" w:hAnsi="Arial" w:cs="Arial"/>
-        </w:rPr>
-        <w:t>6.    METODOLOGÍA……………………………………………</w:t>
-      </w:r>
-      <w:proofErr w:type="gramStart"/>
-      <w:r>
-        <w:rPr>
-          <w:rFonts w:ascii="Arial" w:hAnsi="Arial" w:cs="Arial"/>
-        </w:rPr>
-        <w:t>…....</w:t>
-      </w:r>
-      <w:proofErr w:type="gramEnd"/>
-      <w:r>
-        <w:rPr>
-          <w:rFonts w:ascii="Arial" w:hAnsi="Arial" w:cs="Arial"/>
-        </w:rPr>
-        <w:t>…</w:t>
-      </w:r>
-      <w:r>
-        <w:rPr>
-          <w:rFonts w:ascii="Arial" w:hAnsi="Arial" w:cs="Arial"/>
-        </w:rPr>
-        <w:t>……</w:t>
-      </w:r>
-      <w:proofErr w:type="gramStart"/>
-      <w:r>
-        <w:rPr>
-          <w:rFonts w:ascii="Arial" w:hAnsi="Arial" w:cs="Arial"/>
-        </w:rPr>
-        <w:t>…....</w:t>
-      </w:r>
-      <w:proofErr w:type="gramEnd"/>
-      <w:r>
-        <w:rPr>
-          <w:rFonts w:ascii="Arial" w:hAnsi="Arial" w:cs="Arial"/>
-        </w:rPr>
-        <w:t>6</w:t>
-      </w:r>
-    </w:p>
-    <w:p>
-      <w:pPr>
-        <w:rPr>
-          <w:rFonts w:ascii="Arial" w:hAnsi="Arial" w:cs="Arial"/>
-          <w:lang w:val="es-ES"/>
-        </w:rPr>
-      </w:pPr>
-    </w:p>
-    <w:p>
-      <w:pPr>
-        <w:rPr>
-          <w:rFonts w:ascii="Arial" w:hAnsi="Arial" w:cs="Arial"/>
-          <w:lang w:val="es-ES"/>
-        </w:rPr>
-      </w:pPr>
-      <w:r>
-        <w:rPr>
-          <w:rFonts w:ascii="Arial" w:hAnsi="Arial" w:cs="Arial"/>
-          <w:lang w:val="es-ES"/>
-        </w:rPr>
-        <w:t>7.    RESULTADOS Y CONCLUSIONES</w:t>
-      </w:r>
-      <w:r>
-        <w:rPr>
-          <w:rFonts w:ascii="Arial" w:hAnsi="Arial" w:cs="Arial"/>
-          <w:lang w:val="es-ES"/>
-        </w:rPr>
-        <w:t>……………………………</w:t>
-      </w:r>
-      <w:r>
-        <w:rPr>
-          <w:rFonts w:ascii="Arial" w:hAnsi="Arial" w:cs="Arial"/>
-          <w:lang w:val="es-ES"/>
-        </w:rPr>
-        <w:t>…………...</w:t>
-      </w:r>
-      <w:r>
-        <w:rPr>
-          <w:rFonts w:ascii="Arial" w:hAnsi="Arial" w:cs="Arial"/>
-          <w:lang w:val="es-ES"/>
-        </w:rPr>
-        <w:t>7</w:t>
-      </w:r>
-    </w:p>
-    <w:p>
-      <w:pPr>
-        <w:rPr>
-          <w:rFonts w:ascii="Arial" w:hAnsi="Arial" w:cs="Arial"/>
-          <w:lang w:val="es-ES"/>
-        </w:rPr>
-      </w:pPr>
-    </w:p>
-    <w:p>
-      <w:pPr>
-        <w:rPr>
-          <w:rFonts w:ascii="Arial" w:hAnsi="Arial" w:cs="Arial"/>
-          <w:lang w:val="es-ES"/>
-        </w:rPr>
-      </w:pPr>
-      <w:r>
-        <w:rPr>
-          <w:rFonts w:ascii="Arial" w:hAnsi="Arial" w:cs="Arial"/>
-          <w:lang w:val="es-ES"/>
-        </w:rPr>
-        <w:t>REFERENCIAS...</w:t>
-      </w:r>
-      <w:r>
-        <w:rPr>
-          <w:rFonts w:ascii="Arial" w:hAnsi="Arial" w:cs="Arial"/>
-          <w:lang w:val="es-ES"/>
-        </w:rPr>
-        <w:t>………………………………...................……</w:t>
-      </w:r>
-      <w:r>
-        <w:rPr>
-          <w:rFonts w:ascii="Arial" w:hAnsi="Arial" w:cs="Arial"/>
-          <w:lang w:val="es-ES"/>
-        </w:rPr>
-        <w:t>………</w:t>
-      </w:r>
-      <w:r>
-        <w:rPr>
-          <w:rFonts w:ascii="Arial" w:hAnsi="Arial" w:cs="Arial"/>
-          <w:lang w:val="es-ES"/>
-        </w:rPr>
-        <w:t>.......</w:t>
-      </w:r>
-      <w:r>
-        <w:rPr>
-          <w:rFonts w:ascii="Arial" w:hAnsi="Arial" w:cs="Arial"/>
-          <w:lang w:val="es-ES"/>
-        </w:rPr>
-        <w:t>..</w:t>
-      </w:r>
-      <w:r>
-        <w:rPr>
-          <w:rFonts w:ascii="Arial" w:hAnsi="Arial" w:cs="Arial"/>
-          <w:lang w:val="es-ES"/>
+        </w:rPr>
+        <w:t>.</w:t>
+      </w:r>
+      <w:r>
+        <w:rPr>
+          <w:rFonts w:ascii="Arial" w:hAnsi="Arial" w:cs="Arial"/>
+        </w:rPr>
+        <w:t>.</w:t>
+      </w:r>
+      <w:r>
+        <w:rPr>
+          <w:rFonts w:ascii="Arial" w:hAnsi="Arial" w:cs="Arial"/>
         </w:rPr>
         <w:t>...</w:t>
       </w:r>
       <w:r>
         <w:rPr>
           <w:rFonts w:ascii="Arial" w:hAnsi="Arial" w:cs="Arial"/>
-          <w:lang w:val="es-ES"/>
-        </w:rPr>
-        <w:t>8</w:t>
-      </w:r>
-    </w:p>
-    <w:p>
-      <w:pPr>
-        <w:rPr>
-          <w:rFonts w:ascii="Arial" w:hAnsi="Arial" w:cs="Arial"/>
-          <w:lang w:val="es-ES"/>
-        </w:rPr>
-      </w:pPr>
-    </w:p>
-    <w:p>
-      <w:pPr>
-        <w:rPr>
-          <w:rFonts w:ascii="Arial" w:hAnsi="Arial" w:cs="Arial"/>
-        </w:rPr>
-      </w:pPr>
-      <w:r>
-        <w:rPr>
-          <w:rFonts w:ascii="Arial" w:hAnsi="Arial" w:cs="Arial"/>
-        </w:rPr>
-        <w:t>APÉNDICES</w:t>
-      </w:r>
-      <w:r>
-        <w:rPr>
-          <w:rFonts w:ascii="Arial" w:hAnsi="Arial" w:cs="Arial"/>
-        </w:rPr>
-        <w:t>..........</w:t>
-      </w:r>
-      <w:r>
-        <w:rPr>
-          <w:rFonts w:ascii="Arial" w:hAnsi="Arial" w:cs="Arial"/>
-        </w:rPr>
-        <w:t>…………………………………………</w:t>
-      </w:r>
-      <w:proofErr w:type="gramStart"/>
-      <w:r>
-        <w:rPr>
-          <w:rFonts w:ascii="Arial" w:hAnsi="Arial" w:cs="Arial"/>
-        </w:rPr>
-        <w:t>…....</w:t>
-      </w:r>
-      <w:proofErr w:type="gramEnd"/>
-      <w:r>
-        <w:rPr>
-          <w:rFonts w:ascii="Arial" w:hAnsi="Arial" w:cs="Arial"/>
-        </w:rPr>
-        <w:t>.……….......</w:t>
-      </w:r>
-      <w:r>
-        <w:rPr>
-          <w:rFonts w:ascii="Arial" w:hAnsi="Arial" w:cs="Arial"/>
-        </w:rPr>
-        <w:t>.</w:t>
-      </w:r>
-      <w:r>
-        <w:rPr>
-          <w:rFonts w:ascii="Arial" w:hAnsi="Arial" w:cs="Arial"/>
-        </w:rPr>
-        <w:t>.</w:t>
-      </w:r>
-      <w:r>
-        <w:rPr>
-          <w:rFonts w:ascii="Arial" w:hAnsi="Arial" w:cs="Arial"/>
-        </w:rPr>
-        <w:t>.</w:t>
-      </w:r>
-      <w:r>
-        <w:rPr>
-          <w:rFonts w:ascii="Arial" w:hAnsi="Arial" w:cs="Arial"/>
-        </w:rPr>
-        <w:t>...</w:t>
-      </w:r>
-      <w:r>
-        <w:rPr>
-          <w:rFonts w:ascii="Arial" w:hAnsi="Arial" w:cs="Arial"/>
         </w:rPr>
         <w:t>9</w:t>
       </w:r>
@@ -2172,21 +2444,7 @@
         <w:rPr>
           <w:rFonts w:ascii="Arial" w:hAnsi="Arial" w:cs="Arial"/>
         </w:rPr>
-        <w:t>...........…………………………………………</w:t>
-      </w:r>
-      <w:proofErr w:type="gramStart"/>
-      <w:r>
-        <w:rPr>
-          <w:rFonts w:ascii="Arial" w:hAnsi="Arial" w:cs="Arial"/>
-        </w:rPr>
-        <w:t>…....</w:t>
-      </w:r>
-      <w:proofErr w:type="gramEnd"/>
-      <w:r>
-        <w:rPr>
-          <w:rFonts w:ascii="Arial" w:hAnsi="Arial" w:cs="Arial"/>
-        </w:rPr>
-        <w:t>.……….............</w:t>
+        <w:t>...........…………………………………………….....……….............</w:t>
       </w:r>
       <w:r>
         <w:rPr>
@@ -3798,8 +4056,8 @@
           <w:lang w:val="es-ES"/>
         </w:rPr>
         <w:sectPr>
-          <w:footerReference w:type="even" r:id="rId11"/>
-          <w:footerReference w:type="default" r:id="rId12"/>
+          <w:footerReference w:type="even" r:id="rId12"/>
+          <w:footerReference w:type="default" r:id="rId13"/>
           <w:pgSz w:w="12240" w:h="15840"/>
           <w:pgMar w:top="1418" w:right="1750" w:bottom="1418" w:left="2268" w:header="708" w:footer="708" w:gutter="0"/>
           <w:pgNumType w:fmt="lowerRoman" w:start="1"/>
@@ -4097,19 +4355,11 @@
         </w:rPr>
         <w:t xml:space="preserve">Redacción alusiva al primer subtema de este capítulo. </w:t>
       </w:r>
-      <w:proofErr w:type="spellStart"/>
-      <w:r>
-        <w:rPr>
-          <w:rFonts w:ascii="Arial" w:hAnsi="Arial" w:cs="Arial"/>
-        </w:rPr>
-        <w:t>JkadkjfhkhdsfkDFLKLKJdklfj</w:t>
-      </w:r>
-      <w:proofErr w:type="spellEnd"/>
-      <w:r>
-        <w:rPr>
-          <w:rFonts w:ascii="Arial" w:hAnsi="Arial" w:cs="Arial"/>
-        </w:rPr>
-        <w:t>.</w:t>
+      <w:r>
+        <w:rPr>
+          <w:rFonts w:ascii="Arial" w:hAnsi="Arial" w:cs="Arial"/>
+        </w:rPr>
+        <w:t>JkadkjfhkhdsfkDFLKLKJdklfj.</w:t>
       </w:r>
     </w:p>
     <w:p>
@@ -4130,65 +4380,8 @@
           <w:rFonts w:ascii="Arial" w:hAnsi="Arial" w:cs="Arial"/>
         </w:rPr>
         <w:tab/>
-      </w:r>
-      <w:proofErr w:type="gramStart"/>
-      <w:r>
-        <w:rPr>
-          <w:rFonts w:ascii="Arial" w:hAnsi="Arial" w:cs="Arial"/>
-        </w:rPr>
-        <w:t>Nfdkjdksfjng.nsfd.gn .</w:t>
-      </w:r>
-      <w:proofErr w:type="spellStart"/>
-      <w:r>
-        <w:rPr>
-          <w:rFonts w:ascii="Arial" w:hAnsi="Arial" w:cs="Arial"/>
-        </w:rPr>
-        <w:t>lnkfglkfg</w:t>
-      </w:r>
-      <w:proofErr w:type="spellEnd"/>
-      <w:proofErr w:type="gramEnd"/>
-      <w:r>
-        <w:rPr>
-          <w:rFonts w:ascii="Arial" w:hAnsi="Arial" w:cs="Arial"/>
-        </w:rPr>
-        <w:t xml:space="preserve"> </w:t>
-      </w:r>
-      <w:proofErr w:type="spellStart"/>
-      <w:r>
-        <w:rPr>
-          <w:rFonts w:ascii="Arial" w:hAnsi="Arial" w:cs="Arial"/>
-        </w:rPr>
-        <w:t>lkdjfgñlkjsdñflkgjlkjfdg</w:t>
-      </w:r>
-      <w:proofErr w:type="spellEnd"/>
-      <w:r>
-        <w:rPr>
-          <w:rFonts w:ascii="Arial" w:hAnsi="Arial" w:cs="Arial"/>
-        </w:rPr>
-        <w:t xml:space="preserve"> </w:t>
-      </w:r>
-      <w:proofErr w:type="spellStart"/>
-      <w:r>
-        <w:rPr>
-          <w:rFonts w:ascii="Arial" w:hAnsi="Arial" w:cs="Arial"/>
-        </w:rPr>
-        <w:t>ñlsdjfglkjfdlkgj</w:t>
-      </w:r>
-      <w:proofErr w:type="spellEnd"/>
-      <w:r>
-        <w:rPr>
-          <w:rFonts w:ascii="Arial" w:hAnsi="Arial" w:cs="Arial"/>
-        </w:rPr>
-        <w:t xml:space="preserve"> </w:t>
-      </w:r>
-      <w:proofErr w:type="spellStart"/>
-      <w:r>
-        <w:rPr>
-          <w:rFonts w:ascii="Arial" w:hAnsi="Arial" w:cs="Arial"/>
-        </w:rPr>
-        <w:t>lkjglkjslkjg</w:t>
-      </w:r>
-      <w:proofErr w:type="spellEnd"/>
+        <w:t>Nfdkjdksfjng.nsfd.gn .lnkfglkfg lkdjfgñlkjsdñflkgjlkjfdg ñlsdjfglkjfdlkgj lkjglkjslkjg</w:t>
+      </w:r>
     </w:p>
     <w:p>
       <w:pPr>
@@ -4216,14 +4409,12 @@
         </w:rPr>
         <w:t>1.1.1</w:t>
       </w:r>
-      <w:proofErr w:type="gramStart"/>
       <w:r>
         <w:rPr>
           <w:rFonts w:ascii="Arial" w:hAnsi="Arial" w:cs="Arial"/>
         </w:rPr>
         <w:t xml:space="preserve">   (</w:t>
       </w:r>
-      <w:proofErr w:type="gramEnd"/>
       <w:r>
         <w:rPr>
           <w:rFonts w:ascii="Arial" w:hAnsi="Arial" w:cs="Arial"/>
@@ -4307,19 +4498,11 @@
         </w:rPr>
         <w:t xml:space="preserve">Redacción alusiva al primer subtema de este capítulo. </w:t>
       </w:r>
-      <w:proofErr w:type="spellStart"/>
-      <w:r>
-        <w:rPr>
-          <w:rFonts w:ascii="Arial" w:hAnsi="Arial" w:cs="Arial"/>
-        </w:rPr>
-        <w:t>JkadkjfhkhdsfkDFLKLKJdklfj</w:t>
-      </w:r>
-      <w:proofErr w:type="spellEnd"/>
-      <w:r>
-        <w:rPr>
-          <w:rFonts w:ascii="Arial" w:hAnsi="Arial" w:cs="Arial"/>
-        </w:rPr>
-        <w:t>.</w:t>
+      <w:r>
+        <w:rPr>
+          <w:rFonts w:ascii="Arial" w:hAnsi="Arial" w:cs="Arial"/>
+        </w:rPr>
+        <w:t>JkadkjfhkhdsfkDFLKLKJdklfj.</w:t>
       </w:r>
     </w:p>
     <w:p>
@@ -4533,14 +4716,12 @@
         </w:rPr>
         <w:t>2.1.1</w:t>
       </w:r>
-      <w:proofErr w:type="gramStart"/>
       <w:r>
         <w:rPr>
           <w:rFonts w:ascii="Arial" w:hAnsi="Arial" w:cs="Arial"/>
         </w:rPr>
         <w:t xml:space="preserve">   (</w:t>
       </w:r>
-      <w:proofErr w:type="gramEnd"/>
       <w:r>
         <w:rPr>
           <w:rFonts w:ascii="Arial" w:hAnsi="Arial" w:cs="Arial"/>
@@ -4953,47 +5134,11 @@
         </w:rPr>
         <w:t>(</w:t>
       </w:r>
-      <w:proofErr w:type="spellStart"/>
-      <w:r>
-        <w:rPr>
-          <w:rFonts w:ascii="Arial" w:hAnsi="Arial" w:cs="Arial"/>
-        </w:rPr>
-        <w:t>United</w:t>
-      </w:r>
-      <w:proofErr w:type="spellEnd"/>
-      <w:r>
-        <w:rPr>
-          <w:rFonts w:ascii="Arial" w:hAnsi="Arial" w:cs="Arial"/>
-        </w:rPr>
-        <w:t xml:space="preserve"> Nations Office </w:t>
-      </w:r>
-      <w:proofErr w:type="spellStart"/>
-      <w:r>
-        <w:rPr>
-          <w:rFonts w:ascii="Arial" w:hAnsi="Arial" w:cs="Arial"/>
-        </w:rPr>
-        <w:t>on</w:t>
-      </w:r>
-      <w:proofErr w:type="spellEnd"/>
-      <w:r>
-        <w:rPr>
-          <w:rFonts w:ascii="Arial" w:hAnsi="Arial" w:cs="Arial"/>
-        </w:rPr>
-        <w:t xml:space="preserve"> Drugs and </w:t>
-      </w:r>
-      <w:proofErr w:type="spellStart"/>
-      <w:r>
-        <w:rPr>
-          <w:rFonts w:ascii="Arial" w:hAnsi="Arial" w:cs="Arial"/>
-        </w:rPr>
-        <w:t>Crime</w:t>
-      </w:r>
-      <w:proofErr w:type="spellEnd"/>
-      <w:r>
-        <w:rPr>
-          <w:rFonts w:ascii="Arial" w:hAnsi="Arial" w:cs="Arial"/>
-        </w:rPr>
-        <w:t xml:space="preserve"> </w:t>
+      <w:r>
+        <w:rPr>
+          <w:rFonts w:ascii="Arial" w:hAnsi="Arial" w:cs="Arial"/>
+        </w:rPr>
+        <w:t xml:space="preserve">United Nations Office on Drugs and Crime </w:t>
       </w:r>
       <w:r>
         <w:rPr>
@@ -5084,49 +5229,7 @@
           <w:rFonts w:ascii="Arial" w:hAnsi="Arial" w:cs="Arial"/>
         </w:rPr>
         <w:lastRenderedPageBreak/>
-        <w:t>proliferación de armas de destrucción masiva, y sus recomendaciones son reconocidas como el estándar global en la materia (</w:t>
-      </w:r>
-      <w:proofErr w:type="spellStart"/>
-      <w:r>
-        <w:rPr>
-          <w:rFonts w:ascii="Arial" w:hAnsi="Arial" w:cs="Arial"/>
-        </w:rPr>
-        <w:t>Financial</w:t>
-      </w:r>
-      <w:proofErr w:type="spellEnd"/>
-      <w:r>
-        <w:rPr>
-          <w:rFonts w:ascii="Arial" w:hAnsi="Arial" w:cs="Arial"/>
-        </w:rPr>
-        <w:t xml:space="preserve"> </w:t>
-      </w:r>
-      <w:proofErr w:type="spellStart"/>
-      <w:r>
-        <w:rPr>
-          <w:rFonts w:ascii="Arial" w:hAnsi="Arial" w:cs="Arial"/>
-        </w:rPr>
-        <w:t>Action</w:t>
-      </w:r>
-      <w:proofErr w:type="spellEnd"/>
-      <w:r>
-        <w:rPr>
-          <w:rFonts w:ascii="Arial" w:hAnsi="Arial" w:cs="Arial"/>
-        </w:rPr>
-        <w:t xml:space="preserve"> </w:t>
-      </w:r>
-      <w:proofErr w:type="spellStart"/>
-      <w:r>
-        <w:rPr>
-          <w:rFonts w:ascii="Arial" w:hAnsi="Arial" w:cs="Arial"/>
-        </w:rPr>
-        <w:t>Task</w:t>
-      </w:r>
-      <w:proofErr w:type="spellEnd"/>
-      <w:r>
-        <w:rPr>
-          <w:rFonts w:ascii="Arial" w:hAnsi="Arial" w:cs="Arial"/>
-        </w:rPr>
-        <w:t xml:space="preserve"> Force [FATF], 202</w:t>
+        <w:t>proliferación de armas de destrucción masiva, y sus recomendaciones son reconocidas como el estándar global en la materia (Financial Action Task Force [FATF], 202</w:t>
       </w:r>
       <w:r>
         <w:rPr>
@@ -5246,21 +5349,7 @@
         <w:rPr>
           <w:rFonts w:ascii="Arial" w:hAnsi="Arial" w:cs="Arial"/>
         </w:rPr>
-        <w:t xml:space="preserve">Este esfuerzo internacional se vio reflejado en México de manera gradual: en 1990 se incorporó el delito de lavado de dinero al Código Fiscal de la Federación, se emitieron las primeras disposiciones generales para el sistema financiero y, en 2000, el país ingresó como miembro de pleno derecho al GAFI (Núñez Camacho, 2008, pp. </w:t>
-      </w:r>
-      <w:proofErr w:type="spellStart"/>
-      <w:r>
-        <w:rPr>
-          <w:rFonts w:ascii="Arial" w:hAnsi="Arial" w:cs="Arial"/>
-        </w:rPr>
-        <w:t>xxi-xxii</w:t>
-      </w:r>
-      <w:proofErr w:type="spellEnd"/>
-      <w:r>
-        <w:rPr>
-          <w:rFonts w:ascii="Arial" w:hAnsi="Arial" w:cs="Arial"/>
-        </w:rPr>
-        <w:t>)</w:t>
+        <w:t>Este esfuerzo internacional se vio reflejado en México de manera gradual: en 1990 se incorporó el delito de lavado de dinero al Código Fiscal de la Federación, se emitieron las primeras disposiciones generales para el sistema financiero y, en 2000, el país ingresó como miembro de pleno derecho al GAFI (Núñez Camacho, 2008, pp. xxi-xxii)</w:t>
       </w:r>
       <w:r>
         <w:rPr>
@@ -5290,21 +5379,7 @@
         <w:rPr>
           <w:rFonts w:ascii="Arial" w:hAnsi="Arial" w:cs="Arial"/>
         </w:rPr>
-        <w:t xml:space="preserve">, ese marco se traduce en la obligación de contar con sistemas automatizados que detecten y monitoreen operaciones, generen alertas y sustenten el reporte de operaciones inusuales (CNBV, 2017, </w:t>
-      </w:r>
-      <w:proofErr w:type="spellStart"/>
-      <w:r>
-        <w:rPr>
-          <w:rFonts w:ascii="Arial" w:hAnsi="Arial" w:cs="Arial"/>
-        </w:rPr>
-        <w:t>diap</w:t>
-      </w:r>
-      <w:proofErr w:type="spellEnd"/>
-      <w:r>
-        <w:rPr>
-          <w:rFonts w:ascii="Arial" w:hAnsi="Arial" w:cs="Arial"/>
-        </w:rPr>
-        <w:t>. 25 y 31). Sin embargo, la Evaluación Nacional de Riesgos reconoce deficiencias en estos sistemas, principalmente en la parametrización de sus escenarios de alerta (UIF, 2023, p. 23).</w:t>
+        <w:t>, ese marco se traduce en la obligación de contar con sistemas automatizados que detecten y monitoreen operaciones, generen alertas y sustenten el reporte de operaciones inusuales (CNBV, 2017, diap. 25 y 31). Sin embargo, la Evaluación Nacional de Riesgos reconoce deficiencias en estos sistemas, principalmente en la parametrización de sus escenarios de alerta (UIF, 2023, p. 23).</w:t>
       </w:r>
     </w:p>
     <w:p>
@@ -5359,21 +5434,7 @@
         <w:rPr>
           <w:rFonts w:ascii="Arial" w:hAnsi="Arial" w:cs="Arial"/>
         </w:rPr>
-        <w:t xml:space="preserve">, los modelos que detectan operaciones sospechosas pierden eficacia con el tiempo, porque cambian los datos y también las formas de operar de quienes lavan dinero (Gama et ál., 2014; Rocha-Salazar et ál., 2021). Además, hay que confirmar que una operación fue realmente </w:t>
-      </w:r>
-      <w:proofErr w:type="gramStart"/>
-      <w:r>
-        <w:rPr>
-          <w:rFonts w:ascii="Arial" w:hAnsi="Arial" w:cs="Arial"/>
-        </w:rPr>
-        <w:t>lavado</w:t>
-      </w:r>
-      <w:proofErr w:type="gramEnd"/>
-      <w:r>
-        <w:rPr>
-          <w:rFonts w:ascii="Arial" w:hAnsi="Arial" w:cs="Arial"/>
-        </w:rPr>
-        <w:t xml:space="preserve"> de dinero</w:t>
+        <w:t>, los modelos que detectan operaciones sospechosas pierden eficacia con el tiempo, porque cambian los datos y también las formas de operar de quienes lavan dinero (Gama et ál., 2014; Rocha-Salazar et ál., 2021). Además, hay que confirmar que una operación fue realmente lavado de dinero</w:t>
       </w:r>
       <w:r>
         <w:rPr>
@@ -5598,7 +5659,25 @@
         <w:rPr>
           <w:rFonts w:ascii="Arial" w:hAnsi="Arial" w:cs="Arial"/>
         </w:rPr>
-        <w:t xml:space="preserve">En México, la Comisión Nacional Bancaria y de Valores (CNBV) impuso 220.4 millones de pesos en multas por prevención de lavado de dinero en 2024 y 359.0 millones en 2025, frente a 82.9 millones en 2023, lo que equivale a multiplicar por 4.3 el monto en dos años y a casi un tercio de todas las multas de 2025 (CNBV, 2026; cálculos propios). Entre las causas figuran deficiencias en los sistemas automatizados de detección, monitoreo y reporte de operaciones. </w:t>
+        <w:t>En México, la Comisión Nacional Bancaria y de Valores (CNBV) impuso 220.4 millones de pesos en multas por prevención de lavado de dinero en 2024 y 359.0 millones en 2025, frente a 82.9 millones en 2023, lo que equivale a multiplicar por 4.3 el monto en dos años y a casi un tercio de todas las multas de 2025 (CNBV, 2026; cálculos propios). Entre las causas figuran deficiencias en los sistemas automatizados de detección, monitoreo y reporte de operaciones</w:t>
+      </w:r>
+      <w:r>
+        <w:rPr>
+          <w:rFonts w:ascii="Arial" w:hAnsi="Arial" w:cs="Arial"/>
+        </w:rPr>
+        <w:t xml:space="preserve"> </w:t>
+      </w:r>
+      <w:r>
+        <w:rPr>
+          <w:rFonts w:ascii="Arial" w:hAnsi="Arial" w:cs="Arial"/>
+        </w:rPr>
+        <w:t>(CNBV, 2026)</w:t>
+      </w:r>
+      <w:r>
+        <w:rPr>
+          <w:rFonts w:ascii="Arial" w:hAnsi="Arial" w:cs="Arial"/>
+        </w:rPr>
+        <w:t xml:space="preserve">. </w:t>
       </w:r>
       <w:r>
         <w:rPr>
@@ -5616,13 +5695,31 @@
         <w:rPr>
           <w:rFonts w:ascii="Arial" w:hAnsi="Arial" w:cs="Arial"/>
         </w:rPr>
-        <w:t>Por ejemplo, el caso de u</w:t>
-      </w:r>
-      <w:r>
-        <w:rPr>
-          <w:rFonts w:ascii="Arial" w:hAnsi="Arial" w:cs="Arial"/>
-        </w:rPr>
-        <w:t>na institución financiera de EE. UU., solo 34 de 6,113 alarmas se reportaron a las autoridades (Zhang y Trubey, 2019, citado en Jensen y Iosifidis, 2023). Así, ya sea por no vigilar lo suficiente o por saturarse de alertas, un</w:t>
+        <w:t>En</w:t>
+      </w:r>
+      <w:r>
+        <w:rPr>
+          <w:rFonts w:ascii="Arial" w:hAnsi="Arial" w:cs="Arial"/>
+        </w:rPr>
+        <w:t xml:space="preserve"> u</w:t>
+      </w:r>
+      <w:r>
+        <w:rPr>
+          <w:rFonts w:ascii="Arial" w:hAnsi="Arial" w:cs="Arial"/>
+        </w:rPr>
+        <w:t>na institución financiera de EE. UU., solo 34 de 6,113 alarmas se reportaron a las autoridades (Zhang y Trubey, 2019, c</w:t>
+      </w:r>
+      <w:r>
+        <w:rPr>
+          <w:rFonts w:ascii="Arial" w:hAnsi="Arial" w:cs="Arial"/>
+        </w:rPr>
+        <w:t>omo se citó</w:t>
+      </w:r>
+      <w:r>
+        <w:rPr>
+          <w:rFonts w:ascii="Arial" w:hAnsi="Arial" w:cs="Arial"/>
+        </w:rPr>
+        <w:t xml:space="preserve"> en Jensen y Iosifidis, 2023). Así, ya sea por no vigilar lo suficiente o por saturarse de alertas, un</w:t>
       </w:r>
       <w:r>
         <w:rPr>
@@ -5664,19 +5761,31 @@
         <w:rPr>
           <w:rFonts w:ascii="Arial" w:hAnsi="Arial" w:cs="Arial"/>
         </w:rPr>
-        <w:t>El</w:t>
-      </w:r>
-      <w:r>
-        <w:rPr>
-          <w:rFonts w:ascii="Arial" w:hAnsi="Arial" w:cs="Arial"/>
-        </w:rPr>
-        <w:t xml:space="preserve"> atender este problema </w:t>
-      </w:r>
-      <w:r>
-        <w:rPr>
-          <w:rFonts w:ascii="Arial" w:hAnsi="Arial" w:cs="Arial"/>
-        </w:rPr>
-        <w:t>en una etapa temprana impacta para las instituciones, analistas de cumplimiento y la sociedad</w:t>
+        <w:t>A</w:t>
+      </w:r>
+      <w:r>
+        <w:rPr>
+          <w:rFonts w:ascii="Arial" w:hAnsi="Arial" w:cs="Arial"/>
+        </w:rPr>
+        <w:t xml:space="preserve">tender este problema </w:t>
+      </w:r>
+      <w:r>
+        <w:rPr>
+          <w:rFonts w:ascii="Arial" w:hAnsi="Arial" w:cs="Arial"/>
+        </w:rPr>
+        <w:t>de manera</w:t>
+      </w:r>
+      <w:r>
+        <w:rPr>
+          <w:rFonts w:ascii="Arial" w:hAnsi="Arial" w:cs="Arial"/>
+        </w:rPr>
+        <w:t xml:space="preserve"> temprana </w:t>
+      </w:r>
+      <w:r>
+        <w:rPr>
+          <w:rFonts w:ascii="Arial" w:hAnsi="Arial" w:cs="Arial"/>
+        </w:rPr>
+        <w:t>beneficia a las instituciones financieras, a los analistas de cumplimiento y a la sociedad</w:t>
       </w:r>
       <w:r>
         <w:rPr>
@@ -5688,43 +5797,19 @@
         <w:rPr>
           <w:rFonts w:ascii="Arial" w:hAnsi="Arial" w:cs="Arial"/>
         </w:rPr>
-        <w:t xml:space="preserve">aprobaciones de </w:t>
-      </w:r>
-      <w:r>
-        <w:rPr>
-          <w:rFonts w:ascii="Arial" w:hAnsi="Arial" w:cs="Arial"/>
-        </w:rPr>
-        <w:t>operaciones</w:t>
-      </w:r>
-      <w:r>
-        <w:rPr>
-          <w:rFonts w:ascii="Arial" w:hAnsi="Arial" w:cs="Arial"/>
-        </w:rPr>
-        <w:t xml:space="preserve"> con origen</w:t>
-      </w:r>
-      <w:r>
-        <w:rPr>
-          <w:rFonts w:ascii="Arial" w:hAnsi="Arial" w:cs="Arial"/>
-        </w:rPr>
-        <w:t xml:space="preserve"> ilícit</w:t>
-      </w:r>
-      <w:r>
-        <w:rPr>
-          <w:rFonts w:ascii="Arial" w:hAnsi="Arial" w:cs="Arial"/>
-        </w:rPr>
-        <w:t>o</w:t>
-      </w:r>
-      <w:r>
-        <w:rPr>
-          <w:rFonts w:ascii="Arial" w:hAnsi="Arial" w:cs="Arial"/>
-        </w:rPr>
-        <w:t>. Para los analistas de cumplimiento, recibir además una explicación de la causa les permitiría dec</w:t>
-      </w:r>
-      <w:r>
-        <w:rPr>
-          <w:rFonts w:ascii="Arial" w:hAnsi="Arial" w:cs="Arial"/>
-        </w:rPr>
-        <w:t>ir</w:t>
+        <w:t>que operaciones de origen ilícito pasen sin ser detectadas</w:t>
+      </w:r>
+      <w:r>
+        <w:rPr>
+          <w:rFonts w:ascii="Arial" w:hAnsi="Arial" w:cs="Arial"/>
+        </w:rPr>
+        <w:t>. Para los analistas de cumplimiento, recibir además una explicación de la causa les permitiría de</w:t>
+      </w:r>
+      <w:r>
+        <w:rPr>
+          <w:rFonts w:ascii="Arial" w:hAnsi="Arial" w:cs="Arial"/>
+        </w:rPr>
+        <w:t>cidir con mayor rapidez</w:t>
       </w:r>
       <w:r>
         <w:rPr>
@@ -5748,20 +5833,44 @@
         <w:rPr>
           <w:rFonts w:ascii="Arial" w:hAnsi="Arial" w:cs="Arial"/>
         </w:rPr>
-        <w:t>debido a que</w:t>
-      </w:r>
-      <w:r>
-        <w:rPr>
-          <w:rFonts w:ascii="Arial" w:hAnsi="Arial" w:cs="Arial"/>
-        </w:rPr>
-        <w:t xml:space="preserve"> se debilita a quienes lo practican y se protege la </w:t>
+        <w:t>porque</w:t>
+      </w:r>
+      <w:r>
+        <w:rPr>
+          <w:rFonts w:ascii="Arial" w:hAnsi="Arial" w:cs="Arial"/>
+        </w:rPr>
+        <w:t xml:space="preserve"> se d</w:t>
+      </w:r>
+      <w:r>
+        <w:rPr>
+          <w:rFonts w:ascii="Arial" w:hAnsi="Arial" w:cs="Arial"/>
+        </w:rPr>
+        <w:t xml:space="preserve">ificulta la </w:t>
       </w:r>
       <w:r>
         <w:rPr>
           <w:rFonts w:ascii="Arial" w:hAnsi="Arial" w:cs="Arial"/>
         </w:rPr>
         <w:lastRenderedPageBreak/>
-        <w:t>integridad del sistema financiero (Rocha-Salazar et ál., 2021). Estos beneficios aplican a las instituciones que ya utilizan modelos para detectar operaciones sospechosas</w:t>
+        <w:t xml:space="preserve">actividad de quienes lavan dinero y se </w:t>
+      </w:r>
+      <w:r>
+        <w:rPr>
+          <w:rFonts w:ascii="Arial" w:hAnsi="Arial" w:cs="Arial"/>
+        </w:rPr>
+        <w:t xml:space="preserve">protege </w:t>
+      </w:r>
+      <w:r>
+        <w:rPr>
+          <w:rFonts w:ascii="Arial" w:hAnsi="Arial" w:cs="Arial"/>
+        </w:rPr>
+        <w:t>la integridad del sistema financiero</w:t>
+      </w:r>
+      <w:r>
+        <w:rPr>
+          <w:rFonts w:ascii="Arial" w:hAnsi="Arial" w:cs="Arial"/>
+        </w:rPr>
+        <w:t xml:space="preserve"> (Rocha-Salazar et ál., 2021). Estos beneficios aplican a las instituciones que ya utilizan modelos para detectar operaciones sospechosas</w:t>
       </w:r>
       <w:r>
         <w:rPr>
@@ -5797,27 +5906,13 @@
         <w:rPr>
           <w:rFonts w:ascii="Arial" w:hAnsi="Arial" w:cs="Arial"/>
         </w:rPr>
-        <w:t xml:space="preserve">El uso de agentes y modelos de lenguaje para combatir el lavado de dinero se ha centrado en detectar operaciones sospechosas (Mohamed et ál., 2026; </w:t>
-      </w:r>
-      <w:proofErr w:type="spellStart"/>
-      <w:r>
-        <w:rPr>
-          <w:rFonts w:ascii="Arial" w:hAnsi="Arial" w:cs="Arial"/>
-        </w:rPr>
-        <w:t>Pirmorad</w:t>
-      </w:r>
-      <w:proofErr w:type="spellEnd"/>
-      <w:r>
-        <w:rPr>
-          <w:rFonts w:ascii="Arial" w:hAnsi="Arial" w:cs="Arial"/>
-        </w:rPr>
-        <w:t>, 2025), mientras que</w:t>
-      </w:r>
-      <w:r>
-        <w:rPr>
-          <w:rFonts w:ascii="Arial" w:hAnsi="Arial" w:cs="Arial"/>
-        </w:rPr>
-        <w:t>, por otro lado,</w:t>
+        <w:t>El uso de agentes y modelos de lenguaje para combatir el lavado de dinero se ha centrado en detectar operaciones sospechosas (Mohamed et ál., 2026; Pirmorad, 2025), mientras que</w:t>
+      </w:r>
+      <w:r>
+        <w:rPr>
+          <w:rFonts w:ascii="Arial" w:hAnsi="Arial" w:cs="Arial"/>
+        </w:rPr>
+        <w:t>,</w:t>
       </w:r>
       <w:r>
         <w:rPr>
@@ -5859,49 +5954,7 @@
         <w:rPr>
           <w:rFonts w:ascii="Arial" w:hAnsi="Arial" w:cs="Arial"/>
         </w:rPr>
-        <w:t xml:space="preserve"> supera al monitoreo tradicional. Su </w:t>
-      </w:r>
-      <w:r>
-        <w:rPr>
-          <w:rFonts w:ascii="Arial" w:hAnsi="Arial" w:cs="Arial"/>
-        </w:rPr>
-        <w:t>implementación</w:t>
-      </w:r>
-      <w:r>
-        <w:rPr>
-          <w:rFonts w:ascii="Arial" w:hAnsi="Arial" w:cs="Arial"/>
-        </w:rPr>
-        <w:t xml:space="preserve"> es </w:t>
-      </w:r>
-      <w:r>
-        <w:rPr>
-          <w:rFonts w:ascii="Arial" w:hAnsi="Arial" w:cs="Arial"/>
-        </w:rPr>
-        <w:t>reciente</w:t>
-      </w:r>
-      <w:r>
-        <w:rPr>
-          <w:rFonts w:ascii="Arial" w:hAnsi="Arial" w:cs="Arial"/>
-        </w:rPr>
-        <w:t>, pues los agentes se emplean</w:t>
-      </w:r>
-      <w:r>
-        <w:rPr>
-          <w:rFonts w:ascii="Arial" w:hAnsi="Arial" w:cs="Arial"/>
-        </w:rPr>
-        <w:t xml:space="preserve"> en la actualidad</w:t>
-      </w:r>
-      <w:r>
-        <w:rPr>
-          <w:rFonts w:ascii="Arial" w:hAnsi="Arial" w:cs="Arial"/>
-        </w:rPr>
-        <w:t xml:space="preserve"> para diagnosticar fallas en otros entornos (Wang et ál., 2024) y su adopción en cumplimiento financiero apenas comienza.</w:t>
-      </w:r>
-      <w:r>
-        <w:rPr>
-          <w:rFonts w:ascii="Arial" w:hAnsi="Arial" w:cs="Arial"/>
-        </w:rPr>
-        <w:t xml:space="preserve"> </w:t>
+        <w:t xml:space="preserve"> supera al monitoreo tradicional. </w:t>
       </w:r>
     </w:p>
     <w:p>
@@ -5949,7 +6002,7 @@
         <w:rPr>
           <w:rFonts w:ascii="Arial" w:hAnsi="Arial" w:cs="Arial"/>
         </w:rPr>
-        <w:t xml:space="preserve"> Dado que, uno</w:t>
+        <w:t xml:space="preserve"> Dado que uno</w:t>
       </w:r>
       <w:r>
         <w:rPr>
@@ -5979,7 +6032,19 @@
         <w:rPr>
           <w:rFonts w:ascii="Arial" w:hAnsi="Arial" w:cs="Arial"/>
         </w:rPr>
-        <w:t xml:space="preserve"> de transacciones, calibradas con transacciones reales y con las operaciones de lavado plenamente identificadas (Altman et ál., 2023). Al tratarse de datos simulados, los resultados se interpretarán como evidencia en un entorno controlado y no como el desempeño que tendría el sistema en una institución financiera real.</w:t>
+        <w:t xml:space="preserve"> de transacciones, calibrad</w:t>
+      </w:r>
+      <w:r>
+        <w:rPr>
+          <w:rFonts w:ascii="Arial" w:hAnsi="Arial" w:cs="Arial"/>
+        </w:rPr>
+        <w:t>o</w:t>
+      </w:r>
+      <w:r>
+        <w:rPr>
+          <w:rFonts w:ascii="Arial" w:hAnsi="Arial" w:cs="Arial"/>
+        </w:rPr>
+        <w:t>s con transacciones reales y con las operaciones de lavado plenamente identificadas (Altman et ál., 2023). Al tratarse de datos simulados, los resultados se interpretarán como evidencia en un entorno controlado y no como el desempeño que tendría el sistema en una institución financiera real.</w:t>
       </w:r>
       <w:r>
         <w:rPr>
@@ -6210,7 +6275,25 @@
         <w:rPr>
           <w:rFonts w:ascii="Arial" w:hAnsi="Arial" w:cs="Arial"/>
         </w:rPr>
-        <w:t>Evaluar en qué medida un sistema de agentes de inteligencia artificial detecta a tiempo y explica la pérdida de eficiencia de un modelo de detección de lavado de dinero, en comparación con el monitoreo tradicional basado en reglas y umbrales fijos, en un entorno de producción simulado</w:t>
+        <w:t xml:space="preserve">Evaluar en qué medida un sistema de agentes de inteligencia artificial detecta a tiempo y explica la pérdida de </w:t>
+      </w:r>
+      <w:r>
+        <w:rPr>
+          <w:rFonts w:ascii="Arial" w:hAnsi="Arial" w:cs="Arial"/>
+        </w:rPr>
+        <w:t>e</w:t>
+      </w:r>
+      <w:r>
+        <w:rPr>
+          <w:rFonts w:ascii="Arial" w:hAnsi="Arial" w:cs="Arial"/>
+        </w:rPr>
+        <w:t>ficacia</w:t>
+      </w:r>
+      <w:r>
+        <w:rPr>
+          <w:rFonts w:ascii="Arial" w:hAnsi="Arial" w:cs="Arial"/>
+        </w:rPr>
+        <w:t xml:space="preserve"> de un modelo de detección de lavado de dinero, en comparación con el monitoreo tradicional basado en reglas y umbrales fijos, en un entorno de producción simulado</w:t>
       </w:r>
       <w:r>
         <w:rPr>
@@ -6300,7 +6383,15 @@
           <w:sz w:val="24"/>
           <w:szCs w:val="24"/>
         </w:rPr>
-        <w:t>Establecer escenarios simulados en los que un modelo de detección de lavado de dinero pierde eficacia por causas conocidas, para contar con referencias contra las cuales verificar la detección y el diagnostico</w:t>
+        <w:t xml:space="preserve">Establecer escenarios simulados en los que un modelo de detección de lavado de dinero pierde eficacia por causas conocidas, para contar con referencias contra las cuales verificar la detección y el </w:t>
+      </w:r>
+      <w:r>
+        <w:rPr>
+          <w:rFonts w:ascii="Arial" w:hAnsi="Arial" w:cs="Arial"/>
+          <w:sz w:val="24"/>
+          <w:szCs w:val="24"/>
+        </w:rPr>
+        <w:t>diagnóstico</w:t>
       </w:r>
       <w:r>
         <w:rPr>
@@ -6505,67 +6596,28 @@
     </w:p>
     <w:p>
       <w:pPr>
-        <w:jc w:val="center"/>
-        <w:rPr>
-          <w:rFonts w:ascii="Arial" w:hAnsi="Arial" w:cs="Arial"/>
-          <w:b/>
-        </w:rPr>
-      </w:pPr>
-    </w:p>
-    <w:p>
-      <w:pPr>
-        <w:rPr>
-          <w:rFonts w:ascii="Arial" w:hAnsi="Arial" w:cs="Arial"/>
-          <w:bCs/>
-        </w:rPr>
-      </w:pPr>
-    </w:p>
-    <w:p>
-      <w:pPr>
-        <w:pStyle w:val="Prrafodelista"/>
-        <w:numPr>
-          <w:ilvl w:val="1"/>
-          <w:numId w:val="5"/>
-        </w:numPr>
-        <w:spacing w:after="0" w:line="240" w:lineRule="auto"/>
-        <w:jc w:val="center"/>
-        <w:rPr>
-          <w:rFonts w:ascii="Arial" w:hAnsi="Arial" w:cs="Arial"/>
-          <w:b/>
-          <w:bCs/>
-          <w:sz w:val="24"/>
-          <w:szCs w:val="24"/>
-        </w:rPr>
-      </w:pPr>
-      <w:r>
-        <w:rPr>
-          <w:rFonts w:ascii="Arial" w:hAnsi="Arial" w:cs="Arial"/>
-          <w:b/>
-          <w:bCs/>
-          <w:sz w:val="24"/>
-          <w:szCs w:val="24"/>
-        </w:rPr>
-        <w:t>(Subtítulo</w:t>
-      </w:r>
-      <w:r>
-        <w:rPr>
-          <w:rFonts w:ascii="Arial" w:hAnsi="Arial" w:cs="Arial"/>
-          <w:b/>
-          <w:bCs/>
-          <w:sz w:val="24"/>
-          <w:szCs w:val="24"/>
-        </w:rPr>
-        <w:t xml:space="preserve"> de Primer Nivel</w:t>
-      </w:r>
-      <w:r>
-        <w:rPr>
-          <w:rFonts w:ascii="Arial" w:hAnsi="Arial" w:cs="Arial"/>
-          <w:b/>
-          <w:bCs/>
-          <w:sz w:val="24"/>
-          <w:szCs w:val="24"/>
-        </w:rPr>
-        <w:t>)</w:t>
+        <w:rPr>
+          <w:rFonts w:ascii="Arial" w:hAnsi="Arial" w:cs="Arial"/>
+          <w:bCs/>
+        </w:rPr>
+      </w:pPr>
+    </w:p>
+    <w:p>
+      <w:pPr>
+        <w:jc w:val="center"/>
+        <w:rPr>
+          <w:rFonts w:ascii="Arial" w:hAnsi="Arial" w:cs="Arial"/>
+          <w:b/>
+          <w:bCs/>
+        </w:rPr>
+      </w:pPr>
+      <w:r>
+        <w:rPr>
+          <w:rFonts w:ascii="Arial" w:hAnsi="Arial" w:cs="Arial"/>
+          <w:b/>
+          <w:bCs/>
+        </w:rPr>
+        <w:t>5.1 Lavado de Dinero y Detección de Operaciones Sospechosas</w:t>
       </w:r>
     </w:p>
     <w:p>
@@ -6599,46 +6651,33 @@
         <w:rPr>
           <w:rFonts w:ascii="Arial" w:hAnsi="Arial" w:cs="Arial"/>
         </w:rPr>
-        <w:t>(</w:t>
-      </w:r>
-      <w:r>
-        <w:rPr>
-          <w:rFonts w:ascii="Arial" w:hAnsi="Arial" w:cs="Arial"/>
-        </w:rPr>
-        <w:t>Subtitulo</w:t>
-      </w:r>
-      <w:r>
-        <w:rPr>
-          <w:rFonts w:ascii="Arial" w:hAnsi="Arial" w:cs="Arial"/>
-        </w:rPr>
-        <w:t xml:space="preserve"> de Segundo Nivel</w:t>
-      </w:r>
-      <w:r>
-        <w:rPr>
-          <w:rFonts w:ascii="Arial" w:hAnsi="Arial" w:cs="Arial"/>
-        </w:rPr>
-        <w:t>).</w:t>
-      </w:r>
-    </w:p>
-    <w:p>
-      <w:pPr>
-        <w:rPr>
-          <w:rFonts w:ascii="Arial" w:hAnsi="Arial" w:cs="Arial"/>
-        </w:rPr>
-      </w:pPr>
-      <w:r>
-        <w:rPr>
-          <w:rFonts w:ascii="Arial" w:hAnsi="Arial" w:cs="Arial"/>
-        </w:rPr>
-        <w:t xml:space="preserve">         </w:t>
-      </w:r>
-    </w:p>
-    <w:p>
-      <w:pPr>
-        <w:rPr>
-          <w:rFonts w:ascii="Arial" w:hAnsi="Arial" w:cs="Arial"/>
-        </w:rPr>
-      </w:pPr>
+        <w:t>Concepto y Etapas del Lavado de Dinero</w:t>
+      </w:r>
+    </w:p>
+    <w:p>
+      <w:pPr>
+        <w:rPr>
+          <w:rFonts w:ascii="Arial" w:hAnsi="Arial" w:cs="Arial"/>
+        </w:rPr>
+      </w:pPr>
+      <w:r>
+        <w:rPr>
+          <w:rFonts w:ascii="Arial" w:hAnsi="Arial" w:cs="Arial"/>
+        </w:rPr>
+        <w:t>5</w:t>
+      </w:r>
+      <w:r>
+        <w:rPr>
+          <w:rFonts w:ascii="Arial" w:hAnsi="Arial" w:cs="Arial"/>
+        </w:rPr>
+        <w:t>.1.</w:t>
+      </w:r>
+      <w:r>
+        <w:rPr>
+          <w:rFonts w:ascii="Arial" w:hAnsi="Arial" w:cs="Arial"/>
+        </w:rPr>
+        <w:t>2</w:t>
+      </w:r>
       <w:r>
         <w:rPr>
           <w:rFonts w:ascii="Arial" w:hAnsi="Arial" w:cs="Arial"/>
@@ -6649,25 +6688,11 @@
         <w:rPr>
           <w:rFonts w:ascii="Arial" w:hAnsi="Arial" w:cs="Arial"/>
         </w:rPr>
-        <w:tab/>
-      </w:r>
-      <w:r>
-        <w:rPr>
-          <w:rFonts w:ascii="Arial" w:hAnsi="Arial" w:cs="Arial"/>
-        </w:rPr>
-        <w:t xml:space="preserve">Redacción alusiva al primer subtema de este capítulo. </w:t>
-      </w:r>
-    </w:p>
-    <w:p>
-      <w:pPr>
-        <w:rPr>
-          <w:rFonts w:ascii="Arial" w:hAnsi="Arial" w:cs="Arial"/>
-        </w:rPr>
-      </w:pPr>
-    </w:p>
-    <w:p>
-      <w:pPr>
-        <w:ind w:firstLine="708"/>
+        <w:t>Marco Normativo Internacional y Nacional</w:t>
+      </w:r>
+    </w:p>
+    <w:p>
+      <w:pPr>
         <w:rPr>
           <w:rFonts w:ascii="Arial" w:hAnsi="Arial" w:cs="Arial"/>
         </w:rPr>
@@ -6682,146 +6707,320 @@
         <w:rPr>
           <w:rFonts w:ascii="Arial" w:hAnsi="Arial" w:cs="Arial"/>
         </w:rPr>
-        <w:t>.</w:t>
-      </w:r>
-      <w:r>
-        <w:rPr>
-          <w:rFonts w:ascii="Arial" w:hAnsi="Arial" w:cs="Arial"/>
-        </w:rPr>
-        <w:t>1.1.1</w:t>
-      </w:r>
-      <w:proofErr w:type="gramStart"/>
-      <w:r>
-        <w:rPr>
-          <w:rFonts w:ascii="Arial" w:hAnsi="Arial" w:cs="Arial"/>
-        </w:rPr>
-        <w:t xml:space="preserve">   (</w:t>
-      </w:r>
-      <w:proofErr w:type="gramEnd"/>
-      <w:r>
-        <w:rPr>
-          <w:rFonts w:ascii="Arial" w:hAnsi="Arial" w:cs="Arial"/>
-        </w:rPr>
-        <w:t>Subtítulo</w:t>
-      </w:r>
-      <w:r>
-        <w:rPr>
-          <w:rFonts w:ascii="Arial" w:hAnsi="Arial" w:cs="Arial"/>
-        </w:rPr>
-        <w:t xml:space="preserve"> de Tercer Nivel</w:t>
-      </w:r>
-      <w:r>
-        <w:rPr>
-          <w:rFonts w:ascii="Arial" w:hAnsi="Arial" w:cs="Arial"/>
-        </w:rPr>
-        <w:t>)</w:t>
-      </w:r>
-      <w:r>
-        <w:rPr>
-          <w:rFonts w:ascii="Arial" w:hAnsi="Arial" w:cs="Arial"/>
-        </w:rPr>
-        <w:t>.</w:t>
-      </w:r>
-    </w:p>
-    <w:p>
-      <w:pPr>
-        <w:rPr>
-          <w:rFonts w:ascii="Arial" w:hAnsi="Arial" w:cs="Arial"/>
-        </w:rPr>
-      </w:pPr>
-      <w:r>
-        <w:rPr>
-          <w:rFonts w:ascii="Arial" w:hAnsi="Arial" w:cs="Arial"/>
-        </w:rPr>
-        <w:t xml:space="preserve">    </w:t>
-      </w:r>
-    </w:p>
-    <w:p>
-      <w:pPr>
-        <w:ind w:firstLine="708"/>
-        <w:rPr>
-          <w:rFonts w:ascii="Arial" w:hAnsi="Arial" w:cs="Arial"/>
-        </w:rPr>
-      </w:pPr>
-      <w:r>
-        <w:rPr>
-          <w:rFonts w:ascii="Arial" w:hAnsi="Arial" w:cs="Arial"/>
-        </w:rPr>
-        <w:t>Redacción alusiva al segundo subtema de este capítulo.</w:t>
-      </w:r>
-    </w:p>
-    <w:p>
-      <w:pPr>
-        <w:rPr>
-          <w:rFonts w:ascii="Arial" w:hAnsi="Arial" w:cs="Arial"/>
-        </w:rPr>
-      </w:pPr>
-      <w:r>
-        <w:rPr>
-          <w:rFonts w:ascii="Arial" w:hAnsi="Arial" w:cs="Arial"/>
-        </w:rPr>
-        <w:t xml:space="preserve">   </w:t>
-      </w:r>
-    </w:p>
-    <w:p>
-      <w:pPr>
-        <w:pStyle w:val="Prrafodelista"/>
-        <w:numPr>
-          <w:ilvl w:val="4"/>
-          <w:numId w:val="5"/>
-        </w:numPr>
-        <w:ind w:left="2410" w:hanging="796"/>
-        <w:rPr>
-          <w:rFonts w:ascii="Arial" w:hAnsi="Arial" w:cs="Arial"/>
-          <w:sz w:val="24"/>
-          <w:szCs w:val="24"/>
-        </w:rPr>
-      </w:pPr>
-      <w:r>
-        <w:rPr>
-          <w:rFonts w:ascii="Arial" w:hAnsi="Arial" w:cs="Arial"/>
-          <w:sz w:val="24"/>
-          <w:szCs w:val="24"/>
-        </w:rPr>
-        <w:t>(Subtítulo</w:t>
-      </w:r>
-      <w:r>
-        <w:rPr>
-          <w:rFonts w:ascii="Arial" w:hAnsi="Arial" w:cs="Arial"/>
-          <w:sz w:val="24"/>
-          <w:szCs w:val="24"/>
-        </w:rPr>
-        <w:t xml:space="preserve"> de Cuarto Nivel</w:t>
-      </w:r>
-      <w:r>
-        <w:rPr>
-          <w:rFonts w:ascii="Arial" w:hAnsi="Arial" w:cs="Arial"/>
-          <w:sz w:val="24"/>
-          <w:szCs w:val="24"/>
-        </w:rPr>
-        <w:t xml:space="preserve">). </w:t>
-      </w:r>
-    </w:p>
-    <w:p>
-      <w:pPr>
-        <w:ind w:firstLine="708"/>
-        <w:rPr>
-          <w:rFonts w:ascii="Arial" w:hAnsi="Arial" w:cs="Arial"/>
-        </w:rPr>
-      </w:pPr>
-      <w:r>
-        <w:rPr>
-          <w:rFonts w:ascii="Arial" w:hAnsi="Arial" w:cs="Arial"/>
-        </w:rPr>
-        <w:t>Redacción alusiva al segundo subtema de este capítulo.</w:t>
-      </w:r>
-    </w:p>
-    <w:p>
-      <w:pPr>
-        <w:rPr>
-          <w:rFonts w:ascii="Arial" w:hAnsi="Arial" w:cs="Arial"/>
-        </w:rPr>
-      </w:pPr>
+        <w:t>.1.</w:t>
+      </w:r>
+      <w:r>
+        <w:rPr>
+          <w:rFonts w:ascii="Arial" w:hAnsi="Arial" w:cs="Arial"/>
+        </w:rPr>
+        <w:t>3</w:t>
+      </w:r>
+      <w:r>
+        <w:rPr>
+          <w:rFonts w:ascii="Arial" w:hAnsi="Arial" w:cs="Arial"/>
+        </w:rPr>
+        <w:t xml:space="preserve"> </w:t>
+      </w:r>
+      <w:r>
+        <w:rPr>
+          <w:rFonts w:ascii="Arial" w:hAnsi="Arial" w:cs="Arial"/>
+        </w:rPr>
+        <w:t>Monitoreo Transaccional Tradicional</w:t>
+      </w:r>
+    </w:p>
+    <w:p>
+      <w:pPr>
+        <w:rPr>
+          <w:rFonts w:ascii="Arial" w:hAnsi="Arial" w:cs="Arial"/>
+        </w:rPr>
+      </w:pPr>
+    </w:p>
+    <w:p>
+      <w:pPr>
+        <w:jc w:val="center"/>
+        <w:rPr>
+          <w:rFonts w:ascii="Arial" w:hAnsi="Arial" w:cs="Arial"/>
+          <w:b/>
+          <w:bCs/>
+        </w:rPr>
+      </w:pPr>
+      <w:r>
+        <w:rPr>
+          <w:rFonts w:ascii="Arial" w:hAnsi="Arial" w:cs="Arial"/>
+          <w:b/>
+          <w:bCs/>
+        </w:rPr>
+        <w:t>5.2 Modelos de Aprendizaje Automático para la Detección de Lavado de Dinero</w:t>
+      </w:r>
+    </w:p>
+    <w:p>
+      <w:pPr>
+        <w:jc w:val="center"/>
+        <w:rPr>
+          <w:rFonts w:ascii="Arial" w:hAnsi="Arial" w:cs="Arial"/>
+          <w:b/>
+          <w:bCs/>
+        </w:rPr>
+      </w:pPr>
+    </w:p>
+    <w:p>
+      <w:pPr>
+        <w:rPr>
+          <w:rFonts w:ascii="Arial" w:hAnsi="Arial" w:cs="Arial"/>
+        </w:rPr>
+      </w:pPr>
+      <w:r>
+        <w:rPr>
+          <w:rFonts w:ascii="Arial" w:hAnsi="Arial" w:cs="Arial"/>
+        </w:rPr>
+        <w:t xml:space="preserve">5.2.1 Aprendizaje Supervisado con </w:t>
+      </w:r>
+      <w:r>
+        <w:rPr>
+          <w:rFonts w:ascii="Arial" w:hAnsi="Arial" w:cs="Arial"/>
+        </w:rPr>
+        <w:t>Clases Desbalanceadas</w:t>
+      </w:r>
+    </w:p>
+    <w:p>
+      <w:pPr>
+        <w:rPr>
+          <w:rFonts w:ascii="Arial" w:hAnsi="Arial" w:cs="Arial"/>
+        </w:rPr>
+      </w:pPr>
+      <w:r>
+        <w:rPr>
+          <w:rFonts w:ascii="Arial" w:hAnsi="Arial" w:cs="Arial"/>
+        </w:rPr>
+        <w:t>5.2.2 Modelos de Árboles y Potenciación de Gradiente</w:t>
+      </w:r>
+    </w:p>
+    <w:p>
+      <w:pPr>
+        <w:rPr>
+          <w:rFonts w:ascii="Arial" w:hAnsi="Arial" w:cs="Arial"/>
+        </w:rPr>
+      </w:pPr>
+      <w:r>
+        <w:rPr>
+          <w:rFonts w:ascii="Arial" w:hAnsi="Arial" w:cs="Arial"/>
+        </w:rPr>
+        <w:t>5.2.3 Aplicaciones en la Detección de Lavado de Dinero</w:t>
+      </w:r>
+    </w:p>
+    <w:p>
+      <w:pPr>
+        <w:rPr>
+          <w:rFonts w:ascii="Arial" w:hAnsi="Arial" w:cs="Arial"/>
+        </w:rPr>
+      </w:pPr>
+    </w:p>
+    <w:p>
+      <w:pPr>
+        <w:jc w:val="center"/>
+        <w:rPr>
+          <w:rFonts w:ascii="Arial" w:hAnsi="Arial" w:cs="Arial"/>
+          <w:b/>
+          <w:bCs/>
+        </w:rPr>
+      </w:pPr>
+      <w:r>
+        <w:rPr>
+          <w:rFonts w:ascii="Arial" w:hAnsi="Arial" w:cs="Arial"/>
+          <w:b/>
+          <w:bCs/>
+        </w:rPr>
+        <w:t>5.3 Pérdida de Eficiencia de los Modelos en Producción</w:t>
+      </w:r>
+    </w:p>
+    <w:p>
+      <w:pPr>
+        <w:jc w:val="center"/>
+        <w:rPr>
+          <w:rFonts w:ascii="Arial" w:hAnsi="Arial" w:cs="Arial"/>
+          <w:b/>
+          <w:bCs/>
+        </w:rPr>
+      </w:pPr>
+    </w:p>
+    <w:p>
+      <w:pPr>
+        <w:rPr>
+          <w:rFonts w:ascii="Arial" w:hAnsi="Arial" w:cs="Arial"/>
+        </w:rPr>
+      </w:pPr>
+      <w:r>
+        <w:rPr>
+          <w:rFonts w:ascii="Arial" w:hAnsi="Arial" w:cs="Arial"/>
+        </w:rPr>
+        <w:t>5.3.1 Cambio de Concepto y Cambio de Datos</w:t>
+      </w:r>
+    </w:p>
+    <w:p>
+      <w:pPr>
+        <w:rPr>
+          <w:rFonts w:ascii="Arial" w:hAnsi="Arial" w:cs="Arial"/>
+        </w:rPr>
+      </w:pPr>
+      <w:r>
+        <w:rPr>
+          <w:rFonts w:ascii="Arial" w:hAnsi="Arial" w:cs="Arial"/>
+        </w:rPr>
+        <w:t>5.3.2 Tipos y Causas de</w:t>
+      </w:r>
+      <w:r>
+        <w:rPr>
+          <w:rFonts w:ascii="Arial" w:hAnsi="Arial" w:cs="Arial"/>
+        </w:rPr>
+        <w:t>l</w:t>
+      </w:r>
+      <w:r>
+        <w:rPr>
+          <w:rFonts w:ascii="Arial" w:hAnsi="Arial" w:cs="Arial"/>
+        </w:rPr>
+        <w:t xml:space="preserve"> Cambio</w:t>
+      </w:r>
+    </w:p>
+    <w:p>
+      <w:pPr>
+        <w:rPr>
+          <w:rFonts w:ascii="Arial" w:hAnsi="Arial" w:cs="Arial"/>
+        </w:rPr>
+      </w:pPr>
+      <w:r>
+        <w:rPr>
+          <w:rFonts w:ascii="Arial" w:hAnsi="Arial" w:cs="Arial"/>
+        </w:rPr>
+        <w:t>5.3.3 Etiquetas con Retraso</w:t>
+      </w:r>
+    </w:p>
+    <w:p>
+      <w:pPr>
+        <w:rPr>
+          <w:rFonts w:ascii="Arial" w:hAnsi="Arial" w:cs="Arial"/>
+        </w:rPr>
+      </w:pPr>
+      <w:r>
+        <w:rPr>
+          <w:rFonts w:ascii="Arial" w:hAnsi="Arial" w:cs="Arial"/>
+        </w:rPr>
+        <w:t xml:space="preserve">5.3.4 Detección de la Pérdida de Eficiencia </w:t>
+      </w:r>
+    </w:p>
+    <w:p>
+      <w:pPr>
+        <w:rPr>
+          <w:rFonts w:ascii="Arial" w:hAnsi="Arial" w:cs="Arial"/>
+        </w:rPr>
+      </w:pPr>
+    </w:p>
+    <w:p>
+      <w:pPr>
+        <w:jc w:val="center"/>
+        <w:rPr>
+          <w:rFonts w:ascii="Arial" w:hAnsi="Arial" w:cs="Arial"/>
+          <w:b/>
+          <w:bCs/>
+        </w:rPr>
+      </w:pPr>
+      <w:r>
+        <w:rPr>
+          <w:rFonts w:ascii="Arial" w:hAnsi="Arial" w:cs="Arial"/>
+          <w:b/>
+          <w:bCs/>
+        </w:rPr>
+        <w:t>5.4 Agentes de Inteligencia Artificial</w:t>
+      </w:r>
+    </w:p>
+    <w:p>
+      <w:pPr>
+        <w:jc w:val="center"/>
+        <w:rPr>
+          <w:rFonts w:ascii="Arial" w:hAnsi="Arial" w:cs="Arial"/>
+          <w:b/>
+          <w:bCs/>
+        </w:rPr>
+      </w:pPr>
+    </w:p>
+    <w:p>
+      <w:pPr>
+        <w:rPr>
+          <w:rFonts w:ascii="Arial" w:hAnsi="Arial" w:cs="Arial"/>
+        </w:rPr>
+      </w:pPr>
+      <w:r>
+        <w:rPr>
+          <w:rFonts w:ascii="Arial" w:hAnsi="Arial" w:cs="Arial"/>
+        </w:rPr>
+        <w:t>5.4.1 Modelos de Lenguaje de Gran Tamaño</w:t>
+      </w:r>
+    </w:p>
+    <w:p>
+      <w:pPr>
+        <w:rPr>
+          <w:rFonts w:ascii="Arial" w:hAnsi="Arial" w:cs="Arial"/>
+        </w:rPr>
+      </w:pPr>
+      <w:r>
+        <w:rPr>
+          <w:rFonts w:ascii="Arial" w:hAnsi="Arial" w:cs="Arial"/>
+        </w:rPr>
+        <w:t>5.4.2 Agentes con Uso de Herramientas</w:t>
+      </w:r>
+    </w:p>
+    <w:p>
+      <w:pPr>
+        <w:rPr>
+          <w:rFonts w:ascii="Arial" w:hAnsi="Arial" w:cs="Arial"/>
+        </w:rPr>
+      </w:pPr>
+      <w:r>
+        <w:rPr>
+          <w:rFonts w:ascii="Arial" w:hAnsi="Arial" w:cs="Arial"/>
+        </w:rPr>
+        <w:t>5.4.3 Sistemas Multiagente y Evaluación con Juez</w:t>
+      </w:r>
+    </w:p>
+    <w:p>
+      <w:pPr>
+        <w:rPr>
+          <w:rFonts w:ascii="Arial" w:hAnsi="Arial" w:cs="Arial"/>
+        </w:rPr>
+      </w:pPr>
+    </w:p>
+    <w:p>
+      <w:pPr>
+        <w:jc w:val="center"/>
+        <w:rPr>
+          <w:rFonts w:ascii="Arial" w:hAnsi="Arial" w:cs="Arial"/>
+          <w:b/>
+          <w:bCs/>
+        </w:rPr>
+      </w:pPr>
+      <w:r>
+        <w:rPr>
+          <w:rFonts w:ascii="Arial" w:hAnsi="Arial" w:cs="Arial"/>
+          <w:b/>
+          <w:bCs/>
+        </w:rPr>
+        <w:t xml:space="preserve">5.5 Trabajos </w:t>
+      </w:r>
+      <w:r>
+        <w:rPr>
+          <w:rFonts w:ascii="Arial" w:hAnsi="Arial" w:cs="Arial"/>
+          <w:b/>
+          <w:bCs/>
+        </w:rPr>
+        <w:t>R</w:t>
+      </w:r>
+      <w:r>
+        <w:rPr>
+          <w:rFonts w:ascii="Arial" w:hAnsi="Arial" w:cs="Arial"/>
+          <w:b/>
+          <w:bCs/>
+        </w:rPr>
+        <w:t>elacionados</w:t>
+      </w:r>
     </w:p>
     <w:p>
       <w:pPr>
@@ -7113,14 +7312,12 @@
         </w:rPr>
         <w:t>1.1.1</w:t>
       </w:r>
-      <w:proofErr w:type="gramStart"/>
       <w:r>
         <w:rPr>
           <w:rFonts w:ascii="Arial" w:hAnsi="Arial" w:cs="Arial"/>
         </w:rPr>
         <w:t xml:space="preserve">   (</w:t>
       </w:r>
-      <w:proofErr w:type="gramEnd"/>
       <w:r>
         <w:rPr>
           <w:rFonts w:ascii="Arial" w:hAnsi="Arial" w:cs="Arial"/>
@@ -7514,14 +7711,12 @@
         </w:rPr>
         <w:t>1.1.1</w:t>
       </w:r>
-      <w:proofErr w:type="gramStart"/>
       <w:r>
         <w:rPr>
           <w:rFonts w:ascii="Arial" w:hAnsi="Arial" w:cs="Arial"/>
         </w:rPr>
         <w:t xml:space="preserve">   (</w:t>
       </w:r>
-      <w:proofErr w:type="gramEnd"/>
       <w:r>
         <w:rPr>
           <w:rFonts w:ascii="Arial" w:hAnsi="Arial" w:cs="Arial"/>
@@ -8037,7 +8232,6 @@
         </w:rPr>
         <w:t xml:space="preserve">. </w:t>
       </w:r>
-      <w:proofErr w:type="spellStart"/>
       <w:r>
         <w:rPr>
           <w:rFonts w:ascii="Arial" w:hAnsi="Arial" w:cs="Arial"/>
@@ -8045,7 +8239,13 @@
         </w:rPr>
         <w:t>Aranzadi</w:t>
       </w:r>
-      <w:proofErr w:type="spellEnd"/>
+      <w:r>
+        <w:rPr>
+          <w:rFonts w:ascii="Arial" w:hAnsi="Arial" w:cs="Arial"/>
+          <w:lang w:val="en-US"/>
+        </w:rPr>
+        <w:t>.</w:t>
+      </w:r>
     </w:p>
     <w:p>
       <w:pPr>
@@ -8070,7 +8270,6 @@
         </w:rPr>
         <w:t xml:space="preserve">(s.f.). </w:t>
       </w:r>
-      <w:proofErr w:type="spellStart"/>
       <w:r>
         <w:rPr>
           <w:rFonts w:ascii="Arial" w:hAnsi="Arial" w:cs="Arial"/>
@@ -8079,7 +8278,6 @@
         </w:rPr>
         <w:t>Overview</w:t>
       </w:r>
-      <w:proofErr w:type="spellEnd"/>
       <w:r>
         <w:rPr>
           <w:rFonts w:ascii="Arial" w:hAnsi="Arial" w:cs="Arial"/>
@@ -8274,63 +8472,7 @@
         <w:rPr>
           <w:rFonts w:ascii="Arial" w:hAnsi="Arial" w:cs="Arial"/>
         </w:rPr>
-        <w:t xml:space="preserve">Gama, J., </w:t>
-      </w:r>
-      <w:proofErr w:type="spellStart"/>
-      <w:r>
-        <w:rPr>
-          <w:rFonts w:ascii="Arial" w:hAnsi="Arial" w:cs="Arial"/>
-        </w:rPr>
-        <w:t>Žliobaitė</w:t>
-      </w:r>
-      <w:proofErr w:type="spellEnd"/>
-      <w:r>
-        <w:rPr>
-          <w:rFonts w:ascii="Arial" w:hAnsi="Arial" w:cs="Arial"/>
-        </w:rPr>
-        <w:t xml:space="preserve">, I., </w:t>
-      </w:r>
-      <w:proofErr w:type="spellStart"/>
-      <w:r>
-        <w:rPr>
-          <w:rFonts w:ascii="Arial" w:hAnsi="Arial" w:cs="Arial"/>
-        </w:rPr>
-        <w:t>Bifet</w:t>
-      </w:r>
-      <w:proofErr w:type="spellEnd"/>
-      <w:r>
-        <w:rPr>
-          <w:rFonts w:ascii="Arial" w:hAnsi="Arial" w:cs="Arial"/>
-        </w:rPr>
-        <w:t xml:space="preserve">, A., </w:t>
-      </w:r>
-      <w:proofErr w:type="spellStart"/>
-      <w:r>
-        <w:rPr>
-          <w:rFonts w:ascii="Arial" w:hAnsi="Arial" w:cs="Arial"/>
-        </w:rPr>
-        <w:t>Pechenizkiy</w:t>
-      </w:r>
-      <w:proofErr w:type="spellEnd"/>
-      <w:r>
-        <w:rPr>
-          <w:rFonts w:ascii="Arial" w:hAnsi="Arial" w:cs="Arial"/>
-        </w:rPr>
-        <w:t xml:space="preserve">, M. y </w:t>
-      </w:r>
-      <w:proofErr w:type="spellStart"/>
-      <w:r>
-        <w:rPr>
-          <w:rFonts w:ascii="Arial" w:hAnsi="Arial" w:cs="Arial"/>
-        </w:rPr>
-        <w:t>Bouchachia</w:t>
-      </w:r>
-      <w:proofErr w:type="spellEnd"/>
-      <w:r>
-        <w:rPr>
-          <w:rFonts w:ascii="Arial" w:hAnsi="Arial" w:cs="Arial"/>
-        </w:rPr>
-        <w:t xml:space="preserve">, A. (2014). </w:t>
+        <w:t xml:space="preserve">Gama, J., Žliobaitė, I., Bifet, A., Pechenizkiy, M. y Bouchachia, A. (2014). </w:t>
       </w:r>
       <w:r>
         <w:rPr>
@@ -8353,23 +8495,7 @@
           <w:rFonts w:ascii="Arial" w:hAnsi="Arial" w:cs="Arial"/>
           <w:lang w:val="en-US"/>
         </w:rPr>
-        <w:t xml:space="preserve">(4), </w:t>
-      </w:r>
-      <w:proofErr w:type="spellStart"/>
-      <w:r>
-        <w:rPr>
-          <w:rFonts w:ascii="Arial" w:hAnsi="Arial" w:cs="Arial"/>
-          <w:lang w:val="en-US"/>
-        </w:rPr>
-        <w:t>Artículo</w:t>
-      </w:r>
-      <w:proofErr w:type="spellEnd"/>
-      <w:r>
-        <w:rPr>
-          <w:rFonts w:ascii="Arial" w:hAnsi="Arial" w:cs="Arial"/>
-          <w:lang w:val="en-US"/>
-        </w:rPr>
-        <w:t xml:space="preserve"> 44.</w:t>
+        <w:t>(4), Artículo 44.</w:t>
       </w:r>
     </w:p>
     <w:p>
@@ -8380,205 +8506,19 @@
         <w:jc w:val="both"/>
         <w:rPr>
           <w:rFonts w:ascii="Arial" w:hAnsi="Arial" w:cs="Arial"/>
-          <w:lang w:val="en-US"/>
-        </w:rPr>
-      </w:pPr>
-      <w:r>
-        <w:rPr>
-          <w:rFonts w:ascii="Arial" w:hAnsi="Arial" w:cs="Arial"/>
-          <w:highlight w:val="yellow"/>
-          <w:lang w:val="en-US"/>
-        </w:rPr>
-        <w:t xml:space="preserve">Sethi, A., Gupta, P., </w:t>
-      </w:r>
-      <w:proofErr w:type="spellStart"/>
-      <w:r>
-        <w:rPr>
-          <w:rFonts w:ascii="Arial" w:hAnsi="Arial" w:cs="Arial"/>
-          <w:highlight w:val="yellow"/>
-          <w:lang w:val="en-US"/>
-        </w:rPr>
-        <w:t>Kansotia</w:t>
-      </w:r>
-      <w:proofErr w:type="spellEnd"/>
-      <w:r>
-        <w:rPr>
-          <w:rFonts w:ascii="Arial" w:hAnsi="Arial" w:cs="Arial"/>
-          <w:highlight w:val="yellow"/>
-          <w:lang w:val="en-US"/>
-        </w:rPr>
-        <w:t xml:space="preserve">, S., Kant, K. y </w:t>
-      </w:r>
-      <w:proofErr w:type="spellStart"/>
-      <w:r>
-        <w:rPr>
-          <w:rFonts w:ascii="Arial" w:hAnsi="Arial" w:cs="Arial"/>
-          <w:highlight w:val="yellow"/>
-          <w:lang w:val="en-US"/>
-        </w:rPr>
-        <w:t>Srivasatava</w:t>
-      </w:r>
-      <w:proofErr w:type="spellEnd"/>
-      <w:r>
-        <w:rPr>
-          <w:rFonts w:ascii="Arial" w:hAnsi="Arial" w:cs="Arial"/>
-          <w:highlight w:val="yellow"/>
-          <w:lang w:val="en-US"/>
-        </w:rPr>
-        <w:t xml:space="preserve">, N. (2026). Proactive detection of model degradation in financial fraud prediction with delayed </w:t>
-      </w:r>
-      <w:r>
-        <w:rPr>
-          <w:rFonts w:ascii="Arial" w:hAnsi="Arial" w:cs="Arial"/>
-          <w:highlight w:val="yellow"/>
-          <w:lang w:val="en-US"/>
-        </w:rPr>
-        <w:lastRenderedPageBreak/>
-        <w:t xml:space="preserve">labels. En </w:t>
+        </w:rPr>
+      </w:pPr>
+      <w:r>
+        <w:rPr>
+          <w:rFonts w:ascii="Arial" w:hAnsi="Arial" w:cs="Arial"/>
+        </w:rPr>
+        <w:t xml:space="preserve">Comisión Nacional Bancaria y de Valores. (2026). </w:t>
       </w:r>
       <w:r>
         <w:rPr>
           <w:rFonts w:ascii="Arial" w:hAnsi="Arial" w:cs="Arial"/>
           <w:i/>
           <w:iCs/>
-          <w:highlight w:val="yellow"/>
-          <w:lang w:val="en-US"/>
-        </w:rPr>
-        <w:t>Machine learning and knowledge discovery in databases: Applied data science track (ECML PKDD 2025)</w:t>
-      </w:r>
-      <w:r>
-        <w:rPr>
-          <w:rFonts w:ascii="Arial" w:hAnsi="Arial" w:cs="Arial"/>
-          <w:highlight w:val="yellow"/>
-          <w:lang w:val="en-US"/>
-        </w:rPr>
-        <w:t xml:space="preserve"> (pp. 265-281). </w:t>
-      </w:r>
-      <w:r>
-        <w:rPr>
-          <w:rFonts w:ascii="Arial" w:hAnsi="Arial" w:cs="Arial"/>
-          <w:highlight w:val="yellow"/>
-          <w:lang w:val="en-US"/>
-        </w:rPr>
-        <w:t>Springer.</w:t>
-      </w:r>
-    </w:p>
-    <w:p>
-      <w:pPr>
-        <w:pStyle w:val="NormalWeb"/>
-        <w:spacing w:before="240" w:beforeAutospacing="0"/>
-        <w:ind w:left="567" w:hanging="567"/>
-        <w:jc w:val="both"/>
-        <w:rPr>
-          <w:rFonts w:ascii="Arial" w:hAnsi="Arial" w:cs="Arial"/>
-        </w:rPr>
-      </w:pPr>
-      <w:r>
-        <w:rPr>
-          <w:rFonts w:ascii="Arial" w:hAnsi="Arial" w:cs="Arial"/>
-          <w:lang w:val="en-US"/>
-        </w:rPr>
-        <w:t>Wang</w:t>
-      </w:r>
-      <w:r>
-        <w:rPr>
-          <w:rFonts w:ascii="Arial" w:hAnsi="Arial" w:cs="Arial"/>
-          <w:lang w:val="en-US"/>
-        </w:rPr>
-        <w:t xml:space="preserve">, </w:t>
-      </w:r>
-      <w:proofErr w:type="spellStart"/>
-      <w:r>
-        <w:rPr>
-          <w:rFonts w:ascii="Arial" w:hAnsi="Arial" w:cs="Arial"/>
-          <w:lang w:val="en-US"/>
-        </w:rPr>
-        <w:t>Zefan</w:t>
-      </w:r>
-      <w:proofErr w:type="spellEnd"/>
-      <w:r>
-        <w:rPr>
-          <w:rFonts w:ascii="Arial" w:hAnsi="Arial" w:cs="Arial"/>
-          <w:lang w:val="en-US"/>
-        </w:rPr>
-        <w:t xml:space="preserve">., et </w:t>
-      </w:r>
-      <w:proofErr w:type="spellStart"/>
-      <w:r>
-        <w:rPr>
-          <w:rFonts w:ascii="Arial" w:hAnsi="Arial" w:cs="Arial"/>
-          <w:lang w:val="en-US"/>
-        </w:rPr>
-        <w:t>ál</w:t>
-      </w:r>
-      <w:proofErr w:type="spellEnd"/>
-      <w:r>
-        <w:rPr>
-          <w:rFonts w:ascii="Arial" w:hAnsi="Arial" w:cs="Arial"/>
-          <w:lang w:val="en-US"/>
-        </w:rPr>
-        <w:t xml:space="preserve">. (2024). </w:t>
-      </w:r>
-      <w:proofErr w:type="spellStart"/>
-      <w:r>
-        <w:rPr>
-          <w:rFonts w:ascii="Arial" w:hAnsi="Arial" w:cs="Arial"/>
-          <w:lang w:val="en-US"/>
-        </w:rPr>
-        <w:t>RCAgent</w:t>
-      </w:r>
-      <w:proofErr w:type="spellEnd"/>
-      <w:r>
-        <w:rPr>
-          <w:rFonts w:ascii="Arial" w:hAnsi="Arial" w:cs="Arial"/>
-          <w:lang w:val="en-US"/>
-        </w:rPr>
-        <w:t xml:space="preserve">: Cloud root cause analysis by autonomous agents with tool-augmented large language models. En </w:t>
-      </w:r>
-      <w:r>
-        <w:rPr>
-          <w:rFonts w:ascii="Arial" w:hAnsi="Arial" w:cs="Arial"/>
-          <w:i/>
-          <w:iCs/>
-          <w:lang w:val="en-US"/>
-        </w:rPr>
-        <w:t>Proceedings of the 33rd ACM International Conference on Information and Knowledge Management (CIKM '24)</w:t>
-      </w:r>
-      <w:r>
-        <w:rPr>
-          <w:rFonts w:ascii="Arial" w:hAnsi="Arial" w:cs="Arial"/>
-          <w:lang w:val="en-US"/>
-        </w:rPr>
-        <w:t xml:space="preserve">. </w:t>
-      </w:r>
-      <w:r>
-        <w:rPr>
-          <w:rFonts w:ascii="Arial" w:hAnsi="Arial" w:cs="Arial"/>
-        </w:rPr>
-        <w:t>ACM.</w:t>
-      </w:r>
-    </w:p>
-    <w:p>
-      <w:pPr>
-        <w:pStyle w:val="NormalWeb"/>
-        <w:spacing w:before="240" w:beforeAutospacing="0"/>
-        <w:ind w:left="567" w:hanging="567"/>
-        <w:jc w:val="both"/>
-        <w:rPr>
-          <w:rFonts w:ascii="Arial" w:hAnsi="Arial" w:cs="Arial"/>
-        </w:rPr>
-      </w:pPr>
-      <w:r>
-        <w:rPr>
-          <w:rFonts w:ascii="Arial" w:hAnsi="Arial" w:cs="Arial"/>
-        </w:rPr>
-        <w:t xml:space="preserve">Comisión Nacional Bancaria y de Valores. (2026). </w:t>
-      </w:r>
-      <w:r>
-        <w:rPr>
-          <w:rFonts w:ascii="Arial" w:hAnsi="Arial" w:cs="Arial"/>
-          <w:i/>
-          <w:iCs/>
         </w:rPr>
         <w:t>Registro de sanciones administrativas</w:t>
       </w:r>
@@ -8588,7 +8528,7 @@
         </w:rPr>
         <w:t xml:space="preserve">. Recuperado el 14 de octubre de 2026, de </w:t>
       </w:r>
-      <w:hyperlink r:id="rId13" w:history="1">
+      <w:hyperlink r:id="rId14" w:history="1">
         <w:r>
           <w:rPr>
             <w:rStyle w:val="Hipervnculo"/>
@@ -8613,6 +8553,7 @@
         <w:rPr>
           <w:rFonts w:ascii="Arial" w:hAnsi="Arial" w:cs="Arial"/>
         </w:rPr>
+        <w:lastRenderedPageBreak/>
         <w:t xml:space="preserve">Jensen, R. I. T. y Iosifidis, A. (2023). </w:t>
       </w:r>
       <w:r>
@@ -8655,23 +8596,7 @@
           <w:rFonts w:ascii="Arial" w:hAnsi="Arial" w:cs="Arial"/>
           <w:lang w:val="en-US"/>
         </w:rPr>
-        <w:t xml:space="preserve">Mohamed, R. E., Hussain, M., Jadidi, Z., Foo, E. y Azam, S. (2026). Towards agentic AI swarm modeling for blockchain-based money laundering detection. En S. Pal, K. Biswas, S. Kanhere, T. Myers y V. </w:t>
-      </w:r>
-      <w:proofErr w:type="spellStart"/>
-      <w:r>
-        <w:rPr>
-          <w:rFonts w:ascii="Arial" w:hAnsi="Arial" w:cs="Arial"/>
-          <w:lang w:val="en-US"/>
-        </w:rPr>
-        <w:t>Muthukkumarasamy</w:t>
-      </w:r>
-      <w:proofErr w:type="spellEnd"/>
-      <w:r>
-        <w:rPr>
-          <w:rFonts w:ascii="Arial" w:hAnsi="Arial" w:cs="Arial"/>
-          <w:lang w:val="en-US"/>
-        </w:rPr>
-        <w:t xml:space="preserve"> (Eds.), </w:t>
+        <w:t xml:space="preserve">Mohamed, R. E., Hussain, M., Jadidi, Z., Foo, E. y Azam, S. (2026). Towards agentic AI swarm modeling for blockchain-based money laundering detection. En S. Pal, K. Biswas, S. Kanhere, T. Myers y V. Muthukkumarasamy (Eds.), </w:t>
       </w:r>
       <w:r>
         <w:rPr>
@@ -8707,21 +8632,12 @@
           <w:rFonts w:ascii="Arial" w:hAnsi="Arial" w:cs="Arial"/>
         </w:rPr>
       </w:pPr>
-      <w:proofErr w:type="spellStart"/>
       <w:r>
         <w:rPr>
           <w:rFonts w:ascii="Arial" w:hAnsi="Arial" w:cs="Arial"/>
           <w:lang w:val="en-US"/>
         </w:rPr>
-        <w:t>Pirmorad</w:t>
-      </w:r>
-      <w:proofErr w:type="spellEnd"/>
-      <w:r>
-        <w:rPr>
-          <w:rFonts w:ascii="Arial" w:hAnsi="Arial" w:cs="Arial"/>
-          <w:lang w:val="en-US"/>
-        </w:rPr>
-        <w:t xml:space="preserve">, E. (2025). </w:t>
+        <w:t xml:space="preserve">Pirmorad, E. (2025). </w:t>
       </w:r>
       <w:r>
         <w:rPr>
@@ -8737,25 +8653,9 @@
           <w:rFonts w:ascii="Arial" w:hAnsi="Arial" w:cs="Arial"/>
           <w:lang w:val="en-US"/>
         </w:rPr>
-        <w:t xml:space="preserve"> [Preprint]. </w:t>
-      </w:r>
-      <w:proofErr w:type="spellStart"/>
-      <w:r>
-        <w:rPr>
-          <w:rFonts w:ascii="Arial" w:hAnsi="Arial" w:cs="Arial"/>
-          <w:lang w:val="en-US"/>
-        </w:rPr>
-        <w:t>arXiv</w:t>
-      </w:r>
-      <w:proofErr w:type="spellEnd"/>
-      <w:r>
-        <w:rPr>
-          <w:rFonts w:ascii="Arial" w:hAnsi="Arial" w:cs="Arial"/>
-          <w:lang w:val="en-US"/>
-        </w:rPr>
-        <w:t xml:space="preserve">. </w:t>
-      </w:r>
-      <w:hyperlink r:id="rId14" w:history="1">
+        <w:t xml:space="preserve"> [Preprint]. arXiv. </w:t>
+      </w:r>
+      <w:hyperlink r:id="rId15" w:history="1">
         <w:r>
           <w:rPr>
             <w:rStyle w:val="Hipervnculo"/>
@@ -8780,35 +8680,7 @@
         <w:rPr>
           <w:rFonts w:ascii="Arial" w:hAnsi="Arial" w:cs="Arial"/>
         </w:rPr>
-        <w:t xml:space="preserve">Sethi, A., Gupta, P., </w:t>
-      </w:r>
-      <w:proofErr w:type="spellStart"/>
-      <w:r>
-        <w:rPr>
-          <w:rFonts w:ascii="Arial" w:hAnsi="Arial" w:cs="Arial"/>
-        </w:rPr>
-        <w:t>Kansotia</w:t>
-      </w:r>
-      <w:proofErr w:type="spellEnd"/>
-      <w:r>
-        <w:rPr>
-          <w:rFonts w:ascii="Arial" w:hAnsi="Arial" w:cs="Arial"/>
-        </w:rPr>
-        <w:t xml:space="preserve">, S., Kant, K. y </w:t>
-      </w:r>
-      <w:proofErr w:type="spellStart"/>
-      <w:r>
-        <w:rPr>
-          <w:rFonts w:ascii="Arial" w:hAnsi="Arial" w:cs="Arial"/>
-        </w:rPr>
-        <w:t>Srivasatava</w:t>
-      </w:r>
-      <w:proofErr w:type="spellEnd"/>
-      <w:r>
-        <w:rPr>
-          <w:rFonts w:ascii="Arial" w:hAnsi="Arial" w:cs="Arial"/>
-        </w:rPr>
-        <w:t xml:space="preserve">, N. (2026). </w:t>
+        <w:t xml:space="preserve">Sethi, A., Gupta, P., Kansotia, S., Kant, K. y Srivasatava, N. (2026). </w:t>
       </w:r>
       <w:r>
         <w:rPr>
@@ -8859,21 +8731,12 @@
         </w:rPr>
         <w:t xml:space="preserve">Wang, Z., Liu, Z., Zhang, Y., Zhong, A., Wang, J., Yin, F., Fan, L., Wu, L. y Wen, Q. (2024). </w:t>
       </w:r>
-      <w:proofErr w:type="spellStart"/>
       <w:r>
         <w:rPr>
           <w:rFonts w:ascii="Arial" w:hAnsi="Arial" w:cs="Arial"/>
           <w:lang w:val="en-US"/>
         </w:rPr>
-        <w:t>RCAgent</w:t>
-      </w:r>
-      <w:proofErr w:type="spellEnd"/>
-      <w:r>
-        <w:rPr>
-          <w:rFonts w:ascii="Arial" w:hAnsi="Arial" w:cs="Arial"/>
-          <w:lang w:val="en-US"/>
-        </w:rPr>
-        <w:t xml:space="preserve">: Cloud root cause analysis by autonomous agents with tool-augmented large language models. En </w:t>
+        <w:t xml:space="preserve">RCAgent: Cloud root cause analysis by autonomous agents with tool-augmented large language models. En </w:t>
       </w:r>
       <w:r>
         <w:rPr>
@@ -8940,27 +8803,7 @@
           <w:iCs/>
           <w:lang w:val="en-US"/>
         </w:rPr>
-        <w:t>Advances in Neural Information Processing Systems 36 (</w:t>
-      </w:r>
-      <w:proofErr w:type="spellStart"/>
-      <w:r>
-        <w:rPr>
-          <w:rFonts w:ascii="Arial" w:hAnsi="Arial" w:cs="Arial"/>
-          <w:i/>
-          <w:iCs/>
-          <w:lang w:val="en-US"/>
-        </w:rPr>
-        <w:t>NeurIPS</w:t>
-      </w:r>
-      <w:proofErr w:type="spellEnd"/>
-      <w:r>
-        <w:rPr>
-          <w:rFonts w:ascii="Arial" w:hAnsi="Arial" w:cs="Arial"/>
-          <w:i/>
-          <w:iCs/>
-          <w:lang w:val="en-US"/>
-        </w:rPr>
-        <w:t xml:space="preserve"> 2023), Datasets and Benchmarks Track</w:t>
+        <w:t>Advances in Neural Information Processing Systems 36 (NeurIPS 2023), Datasets and Benchmarks Track</w:t>
       </w:r>
       <w:r>
         <w:rPr>
@@ -9318,6 +9161,92 @@
     </w:lvl>
   </w:abstractNum>
   <w:abstractNum w:abstractNumId="1" w15:restartNumberingAfterBreak="0">
+    <w:nsid w:val="28574F76"/>
+    <w:multiLevelType w:val="hybridMultilevel"/>
+    <w:tmpl w:val="676E759A"/>
+    <w:lvl w:ilvl="0" w:tplc="080A000F">
+      <w:start w:val="1"/>
+      <w:numFmt w:val="decimal"/>
+      <w:lvlText w:val="%1."/>
+      <w:lvlJc w:val="left"/>
+      <w:pPr>
+        <w:ind w:left="720" w:hanging="360"/>
+      </w:pPr>
+    </w:lvl>
+    <w:lvl w:ilvl="1" w:tplc="080A0019" w:tentative="1">
+      <w:start w:val="1"/>
+      <w:numFmt w:val="lowerLetter"/>
+      <w:lvlText w:val="%2."/>
+      <w:lvlJc w:val="left"/>
+      <w:pPr>
+        <w:ind w:left="1440" w:hanging="360"/>
+      </w:pPr>
+    </w:lvl>
+    <w:lvl w:ilvl="2" w:tplc="080A001B" w:tentative="1">
+      <w:start w:val="1"/>
+      <w:numFmt w:val="lowerRoman"/>
+      <w:lvlText w:val="%3."/>
+      <w:lvlJc w:val="right"/>
+      <w:pPr>
+        <w:ind w:left="2160" w:hanging="180"/>
+      </w:pPr>
+    </w:lvl>
+    <w:lvl w:ilvl="3" w:tplc="080A000F" w:tentative="1">
+      <w:start w:val="1"/>
+      <w:numFmt w:val="decimal"/>
+      <w:lvlText w:val="%4."/>
+      <w:lvlJc w:val="left"/>
+      <w:pPr>
+        <w:ind w:left="2880" w:hanging="360"/>
+      </w:pPr>
+    </w:lvl>
+    <w:lvl w:ilvl="4" w:tplc="080A0019" w:tentative="1">
+      <w:start w:val="1"/>
+      <w:numFmt w:val="lowerLetter"/>
+      <w:lvlText w:val="%5."/>
+      <w:lvlJc w:val="left"/>
+      <w:pPr>
+        <w:ind w:left="3600" w:hanging="360"/>
+      </w:pPr>
+    </w:lvl>
+    <w:lvl w:ilvl="5" w:tplc="080A001B" w:tentative="1">
+      <w:start w:val="1"/>
+      <w:numFmt w:val="lowerRoman"/>
+      <w:lvlText w:val="%6."/>
+      <w:lvlJc w:val="right"/>
+      <w:pPr>
+        <w:ind w:left="4320" w:hanging="180"/>
+      </w:pPr>
+    </w:lvl>
+    <w:lvl w:ilvl="6" w:tplc="080A000F" w:tentative="1">
+      <w:start w:val="1"/>
+      <w:numFmt w:val="decimal"/>
+      <w:lvlText w:val="%7."/>
+      <w:lvlJc w:val="left"/>
+      <w:pPr>
+        <w:ind w:left="5040" w:hanging="360"/>
+      </w:pPr>
+    </w:lvl>
+    <w:lvl w:ilvl="7" w:tplc="080A0019" w:tentative="1">
+      <w:start w:val="1"/>
+      <w:numFmt w:val="lowerLetter"/>
+      <w:lvlText w:val="%8."/>
+      <w:lvlJc w:val="left"/>
+      <w:pPr>
+        <w:ind w:left="5760" w:hanging="360"/>
+      </w:pPr>
+    </w:lvl>
+    <w:lvl w:ilvl="8" w:tplc="080A001B" w:tentative="1">
+      <w:start w:val="1"/>
+      <w:numFmt w:val="lowerRoman"/>
+      <w:lvlText w:val="%9."/>
+      <w:lvlJc w:val="right"/>
+      <w:pPr>
+        <w:ind w:left="6480" w:hanging="180"/>
+      </w:pPr>
+    </w:lvl>
+  </w:abstractNum>
+  <w:abstractNum w:abstractNumId="2" w15:restartNumberingAfterBreak="0">
     <w:nsid w:val="31960A79"/>
     <w:multiLevelType w:val="multilevel"/>
     <w:tmpl w:val="DEC4B81C"/>
@@ -9430,7 +9359,7 @@
       </w:pPr>
     </w:lvl>
   </w:abstractNum>
-  <w:abstractNum w:abstractNumId="2" w15:restartNumberingAfterBreak="0">
+  <w:abstractNum w:abstractNumId="3" w15:restartNumberingAfterBreak="0">
     <w:nsid w:val="3CDE4DBE"/>
     <w:multiLevelType w:val="multilevel"/>
     <w:tmpl w:val="80F016E0"/>
@@ -9543,7 +9472,7 @@
       </w:rPr>
     </w:lvl>
   </w:abstractNum>
-  <w:abstractNum w:abstractNumId="3" w15:restartNumberingAfterBreak="0">
+  <w:abstractNum w:abstractNumId="4" w15:restartNumberingAfterBreak="0">
     <w:nsid w:val="45354500"/>
     <w:multiLevelType w:val="multilevel"/>
     <w:tmpl w:val="8D56B062"/>
@@ -9656,7 +9585,7 @@
       </w:rPr>
     </w:lvl>
   </w:abstractNum>
-  <w:abstractNum w:abstractNumId="4" w15:restartNumberingAfterBreak="0">
+  <w:abstractNum w:abstractNumId="5" w15:restartNumberingAfterBreak="0">
     <w:nsid w:val="504D6B05"/>
     <w:multiLevelType w:val="multilevel"/>
     <w:tmpl w:val="FD7ACD86"/>
@@ -9769,7 +9698,7 @@
       </w:rPr>
     </w:lvl>
   </w:abstractNum>
-  <w:abstractNum w:abstractNumId="5" w15:restartNumberingAfterBreak="0">
+  <w:abstractNum w:abstractNumId="6" w15:restartNumberingAfterBreak="0">
     <w:nsid w:val="70C04931"/>
     <w:multiLevelType w:val="multilevel"/>
     <w:tmpl w:val="2F6E0ECC"/>
@@ -9882,7 +9811,7 @@
       </w:rPr>
     </w:lvl>
   </w:abstractNum>
-  <w:abstractNum w:abstractNumId="6" w15:restartNumberingAfterBreak="0">
+  <w:abstractNum w:abstractNumId="7" w15:restartNumberingAfterBreak="0">
     <w:nsid w:val="75701B6F"/>
     <w:multiLevelType w:val="multilevel"/>
     <w:tmpl w:val="6A468D32"/>
@@ -9995,7 +9924,7 @@
       </w:rPr>
     </w:lvl>
   </w:abstractNum>
-  <w:abstractNum w:abstractNumId="7" w15:restartNumberingAfterBreak="0">
+  <w:abstractNum w:abstractNumId="8" w15:restartNumberingAfterBreak="0">
     <w:nsid w:val="77154195"/>
     <w:multiLevelType w:val="multilevel"/>
     <w:tmpl w:val="7D8E2228"/>
@@ -10109,27 +10038,30 @@
     </w:lvl>
   </w:abstractNum>
   <w:num w:numId="1" w16cid:durableId="1148942483">
+    <w:abstractNumId w:val="7"/>
+  </w:num>
+  <w:num w:numId="2" w16cid:durableId="1546259195">
+    <w:abstractNumId w:val="8"/>
+  </w:num>
+  <w:num w:numId="3" w16cid:durableId="1335765134">
     <w:abstractNumId w:val="6"/>
   </w:num>
-  <w:num w:numId="2" w16cid:durableId="1546259195">
-    <w:abstractNumId w:val="7"/>
+  <w:num w:numId="4" w16cid:durableId="1114641647">
+    <w:abstractNumId w:val="4"/>
   </w:num>
-  <w:num w:numId="3" w16cid:durableId="1335765134">
-    <w:abstractNumId w:val="5"/>
-  </w:num>
-  <w:num w:numId="4" w16cid:durableId="1114641647">
+  <w:num w:numId="5" w16cid:durableId="165021496">
     <w:abstractNumId w:val="3"/>
   </w:num>
-  <w:num w:numId="5" w16cid:durableId="165021496">
-    <w:abstractNumId w:val="2"/>
-  </w:num>
   <w:num w:numId="6" w16cid:durableId="244343309">
-    <w:abstractNumId w:val="4"/>
+    <w:abstractNumId w:val="5"/>
   </w:num>
   <w:num w:numId="7" w16cid:durableId="78406583">
     <w:abstractNumId w:val="0"/>
   </w:num>
   <w:num w:numId="8" w16cid:durableId="427163988">
+    <w:abstractNumId w:val="2"/>
+  </w:num>
+  <w:num w:numId="9" w16cid:durableId="1716852240">
     <w:abstractNumId w:val="1"/>
   </w:num>
 </w:numbering>
@@ -11038,23 +10970,6 @@
 </file>
 
 <file path=customXml/item1.xml><?xml version="1.0" encoding="utf-8"?>
-<p:properties xmlns:p="http://schemas.microsoft.com/office/2006/metadata/properties" xmlns:xsi="http://www.w3.org/2001/XMLSchema-instance" xmlns:pc="http://schemas.microsoft.com/office/infopath/2007/PartnerControls">
-  <documentManagement>
-    <ReferenceId xmlns="d921d922-e586-4070-94cf-401e9ff1332c" xsi:nil="true"/>
-  </documentManagement>
-</p:properties>
-</file>
-
-<file path=customXml/item2.xml><?xml version="1.0" encoding="utf-8"?>
-<?mso-contentType ?>
-<FormTemplates xmlns="http://schemas.microsoft.com/sharepoint/v3/contenttype/forms">
-  <Display>DocumentLibraryForm</Display>
-  <Edit>DocumentLibraryForm</Edit>
-  <New>DocumentLibraryForm</New>
-</FormTemplates>
-</file>
-
-<file path=customXml/item3.xml><?xml version="1.0" encoding="utf-8"?>
 <ct:contentTypeSchema xmlns:ct="http://schemas.microsoft.com/office/2006/metadata/contentType" xmlns:ma="http://schemas.microsoft.com/office/2006/metadata/properties/metaAttributes" ct:_="" ma:_="" ma:contentTypeName="Document" ma:contentTypeID="0x0101006AF304BD0D0B7C4698522C08709C00BB" ma:contentTypeVersion="4" ma:contentTypeDescription="Create a new document." ma:contentTypeScope="" ma:versionID="d87bf246123dbc96f665515db9402ea3">
   <xsd:schema xmlns:xsd="http://www.w3.org/2001/XMLSchema" xmlns:xs="http://www.w3.org/2001/XMLSchema" xmlns:p="http://schemas.microsoft.com/office/2006/metadata/properties" xmlns:ns2="d921d922-e586-4070-94cf-401e9ff1332c" targetNamespace="http://schemas.microsoft.com/office/2006/metadata/properties" ma:root="true" ma:fieldsID="814706c9f71ffcccbcbebef487bdee00" ns2:_="">
     <xsd:import namespace="d921d922-e586-4070-94cf-401e9ff1332c"/>
@@ -11198,25 +11113,28 @@
 </ct:contentTypeSchema>
 </file>
 
-<file path=customXml/itemProps1.xml><?xml version="1.0" encoding="utf-8"?>
-<ds:datastoreItem xmlns:ds="http://schemas.openxmlformats.org/officeDocument/2006/customXml" ds:itemID="{0A485150-6D8C-4680-B13D-3C6444219884}">
-  <ds:schemaRefs>
-    <ds:schemaRef ds:uri="http://schemas.microsoft.com/office/2006/metadata/properties"/>
-    <ds:schemaRef ds:uri="http://schemas.microsoft.com/office/infopath/2007/PartnerControls"/>
-    <ds:schemaRef ds:uri="d921d922-e586-4070-94cf-401e9ff1332c"/>
-  </ds:schemaRefs>
-</ds:datastoreItem>
+<file path=customXml/item2.xml><?xml version="1.0" encoding="utf-8"?>
+<?mso-contentType ?>
+<FormTemplates xmlns="http://schemas.microsoft.com/sharepoint/v3/contenttype/forms">
+  <Display>DocumentLibraryForm</Display>
+  <Edit>DocumentLibraryForm</Edit>
+  <New>DocumentLibraryForm</New>
+</FormTemplates>
 </file>
 
-<file path=customXml/itemProps2.xml><?xml version="1.0" encoding="utf-8"?>
-<ds:datastoreItem xmlns:ds="http://schemas.openxmlformats.org/officeDocument/2006/customXml" ds:itemID="{C7DAC258-E4DA-446C-926C-E7A60E0F13CC}">
-  <ds:schemaRefs>
-    <ds:schemaRef ds:uri="http://schemas.microsoft.com/sharepoint/v3/contenttype/forms"/>
-  </ds:schemaRefs>
-</ds:datastoreItem>
+<file path=customXml/item3.xml><?xml version="1.0" encoding="utf-8"?>
+<p:properties xmlns:p="http://schemas.microsoft.com/office/2006/metadata/properties" xmlns:xsi="http://www.w3.org/2001/XMLSchema-instance" xmlns:pc="http://schemas.microsoft.com/office/infopath/2007/PartnerControls">
+  <documentManagement>
+    <ReferenceId xmlns="d921d922-e586-4070-94cf-401e9ff1332c" xsi:nil="true"/>
+  </documentManagement>
+</p:properties>
 </file>
 
-<file path=customXml/itemProps3.xml><?xml version="1.0" encoding="utf-8"?>
+<file path=customXml/item4.xml><?xml version="1.0" encoding="utf-8"?>
+<b:Sources xmlns:b="http://schemas.openxmlformats.org/officeDocument/2006/bibliography" xmlns="http://schemas.openxmlformats.org/officeDocument/2006/bibliography" SelectedStyle="\APASixthEditionOfficeOnline.xsl" StyleName="APA" Version="6"/>
+</file>
+
+<file path=customXml/itemProps1.xml><?xml version="1.0" encoding="utf-8"?>
 <ds:datastoreItem xmlns:ds="http://schemas.openxmlformats.org/officeDocument/2006/customXml" ds:itemID="{66617E81-A932-4195-A0D0-208078D8F9E1}">
   <ds:schemaRefs>
     <ds:schemaRef ds:uri="http://schemas.microsoft.com/office/2006/metadata/contentType"/>
@@ -11232,4 +11150,30 @@
     <ds:schemaRef ds:uri="http://schemas.microsoft.com/internal/obd"/>
   </ds:schemaRefs>
 </ds:datastoreItem>
+</file>
+
+<file path=customXml/itemProps2.xml><?xml version="1.0" encoding="utf-8"?>
+<ds:datastoreItem xmlns:ds="http://schemas.openxmlformats.org/officeDocument/2006/customXml" ds:itemID="{C7DAC258-E4DA-446C-926C-E7A60E0F13CC}">
+  <ds:schemaRefs>
+    <ds:schemaRef ds:uri="http://schemas.microsoft.com/sharepoint/v3/contenttype/forms"/>
+  </ds:schemaRefs>
+</ds:datastoreItem>
+</file>
+
+<file path=customXml/itemProps3.xml><?xml version="1.0" encoding="utf-8"?>
+<ds:datastoreItem xmlns:ds="http://schemas.openxmlformats.org/officeDocument/2006/customXml" ds:itemID="{0A485150-6D8C-4680-B13D-3C6444219884}">
+  <ds:schemaRefs>
+    <ds:schemaRef ds:uri="http://schemas.microsoft.com/office/2006/metadata/properties"/>
+    <ds:schemaRef ds:uri="http://schemas.microsoft.com/office/infopath/2007/PartnerControls"/>
+    <ds:schemaRef ds:uri="d921d922-e586-4070-94cf-401e9ff1332c"/>
+  </ds:schemaRefs>
+</ds:datastoreItem>
+</file>
+
+<file path=customXml/itemProps4.xml><?xml version="1.0" encoding="utf-8"?>
+<ds:datastoreItem xmlns:ds="http://schemas.openxmlformats.org/officeDocument/2006/customXml" ds:itemID="{2A81F8F4-56D4-4EE4-AC7B-B3FAD30CD657}">
+  <ds:schemaRefs>
+    <ds:schemaRef ds:uri="http://schemas.openxmlformats.org/officeDocument/2006/bibliography"/>
+  </ds:schemaRefs>
+</ds:datastoreItem>
 </file>
</xml_diff>

<commit_message>
Coloque el indice del marco teorico provisiona con las correccionesl
</commit_message>
<xml_diff>
--- a/Revisiones-Tesina/Marco-Teorico/ANTEPROYECTO AV4 GUSTAVO DE JESUS ESCOBAR MATA.docx
+++ b/Revisiones-Tesina/Marco-Teorico/ANTEPROYECTO AV4 GUSTAVO DE JESUS ESCOBAR MATA.docx
@@ -801,57 +801,107 @@
           <w:rFonts w:ascii="Arial" w:hAnsi="Arial" w:cs="Arial"/>
           <w:lang w:val="es-ES"/>
         </w:rPr>
-        <w:t>(Título y nombre)                                         (Título y nombre)</w:t>
-      </w:r>
-    </w:p>
-    <w:p>
-      <w:pPr>
-        <w:jc w:val="center"/>
-        <w:rPr>
-          <w:rFonts w:ascii="Arial" w:hAnsi="Arial" w:cs="Arial"/>
-          <w:lang w:val="es-ES"/>
-        </w:rPr>
-      </w:pPr>
-      <w:r>
-        <w:rPr>
-          <w:rFonts w:ascii="Arial" w:hAnsi="Arial" w:cs="Arial"/>
-          <w:lang w:val="es-ES"/>
-        </w:rPr>
-        <w:t>Revisor                                                        Revisor</w:t>
-      </w:r>
-    </w:p>
-    <w:p>
-      <w:pPr>
-        <w:jc w:val="center"/>
-        <w:rPr>
-          <w:rFonts w:ascii="Arial" w:hAnsi="Arial" w:cs="Arial"/>
-          <w:lang w:val="es-ES"/>
-        </w:rPr>
-      </w:pPr>
-    </w:p>
-    <w:p>
-      <w:pPr>
-        <w:jc w:val="center"/>
-        <w:rPr>
-          <w:rFonts w:ascii="Arial" w:hAnsi="Arial" w:cs="Arial"/>
-          <w:lang w:val="es-ES"/>
-        </w:rPr>
-      </w:pPr>
-    </w:p>
-    <w:p>
-      <w:pPr>
-        <w:jc w:val="center"/>
-        <w:rPr>
-          <w:rFonts w:ascii="Arial" w:hAnsi="Arial" w:cs="Arial"/>
-          <w:lang w:val="es-ES"/>
-        </w:rPr>
-      </w:pPr>
-      <w:r>
-        <w:rPr>
-          <w:rFonts w:ascii="Arial" w:hAnsi="Arial" w:cs="Arial"/>
-          <w:lang w:val="es-ES"/>
-        </w:rPr>
-        <w:t>Vo.Bo.</w:t>
+        <w:t xml:space="preserve">(Título y </w:t>
+      </w:r>
+      <w:proofErr w:type="gramStart"/>
+      <w:r>
+        <w:rPr>
+          <w:rFonts w:ascii="Arial" w:hAnsi="Arial" w:cs="Arial"/>
+          <w:lang w:val="es-ES"/>
+        </w:rPr>
+        <w:t xml:space="preserve">nombre)   </w:t>
+      </w:r>
+      <w:proofErr w:type="gramEnd"/>
+      <w:r>
+        <w:rPr>
+          <w:rFonts w:ascii="Arial" w:hAnsi="Arial" w:cs="Arial"/>
+          <w:lang w:val="es-ES"/>
+        </w:rPr>
+        <w:t xml:space="preserve">                                   </w:t>
+      </w:r>
+      <w:proofErr w:type="gramStart"/>
+      <w:r>
+        <w:rPr>
+          <w:rFonts w:ascii="Arial" w:hAnsi="Arial" w:cs="Arial"/>
+          <w:lang w:val="es-ES"/>
+        </w:rPr>
+        <w:t xml:space="preserve">   (</w:t>
+      </w:r>
+      <w:proofErr w:type="gramEnd"/>
+      <w:r>
+        <w:rPr>
+          <w:rFonts w:ascii="Arial" w:hAnsi="Arial" w:cs="Arial"/>
+          <w:lang w:val="es-ES"/>
+        </w:rPr>
+        <w:t>Título y nombre)</w:t>
+      </w:r>
+    </w:p>
+    <w:p>
+      <w:pPr>
+        <w:jc w:val="center"/>
+        <w:rPr>
+          <w:rFonts w:ascii="Arial" w:hAnsi="Arial" w:cs="Arial"/>
+          <w:lang w:val="es-ES"/>
+        </w:rPr>
+      </w:pPr>
+      <w:r>
+        <w:rPr>
+          <w:rFonts w:ascii="Arial" w:hAnsi="Arial" w:cs="Arial"/>
+          <w:lang w:val="es-ES"/>
+        </w:rPr>
+        <w:t xml:space="preserve">Revisor                                                        </w:t>
+      </w:r>
+      <w:proofErr w:type="spellStart"/>
+      <w:r>
+        <w:rPr>
+          <w:rFonts w:ascii="Arial" w:hAnsi="Arial" w:cs="Arial"/>
+          <w:lang w:val="es-ES"/>
+        </w:rPr>
+        <w:t>Revisor</w:t>
+      </w:r>
+      <w:proofErr w:type="spellEnd"/>
+    </w:p>
+    <w:p>
+      <w:pPr>
+        <w:jc w:val="center"/>
+        <w:rPr>
+          <w:rFonts w:ascii="Arial" w:hAnsi="Arial" w:cs="Arial"/>
+          <w:lang w:val="es-ES"/>
+        </w:rPr>
+      </w:pPr>
+    </w:p>
+    <w:p>
+      <w:pPr>
+        <w:jc w:val="center"/>
+        <w:rPr>
+          <w:rFonts w:ascii="Arial" w:hAnsi="Arial" w:cs="Arial"/>
+          <w:lang w:val="es-ES"/>
+        </w:rPr>
+      </w:pPr>
+    </w:p>
+    <w:p>
+      <w:pPr>
+        <w:jc w:val="center"/>
+        <w:rPr>
+          <w:rFonts w:ascii="Arial" w:hAnsi="Arial" w:cs="Arial"/>
+          <w:lang w:val="es-ES"/>
+        </w:rPr>
+      </w:pPr>
+      <w:proofErr w:type="spellStart"/>
+      <w:r>
+        <w:rPr>
+          <w:rFonts w:ascii="Arial" w:hAnsi="Arial" w:cs="Arial"/>
+          <w:lang w:val="es-ES"/>
+        </w:rPr>
+        <w:t>Vo.Bo</w:t>
+      </w:r>
+      <w:proofErr w:type="spellEnd"/>
+      <w:r>
+        <w:rPr>
+          <w:rFonts w:ascii="Arial" w:hAnsi="Arial" w:cs="Arial"/>
+          <w:lang w:val="es-ES"/>
+        </w:rPr>
+        <w:t>.</w:t>
       </w:r>
     </w:p>
     <w:p>
@@ -1399,7 +1449,139 @@
         <w:rPr>
           <w:rFonts w:ascii="Arial" w:hAnsi="Arial" w:cs="Arial"/>
         </w:rPr>
-        <w:t>(Subtítulo)…………</w:t>
+        <w:t>(Subtítulo)……</w:t>
+      </w:r>
+      <w:proofErr w:type="gramStart"/>
+      <w:r>
+        <w:rPr>
+          <w:rFonts w:ascii="Arial" w:hAnsi="Arial" w:cs="Arial"/>
+        </w:rPr>
+        <w:t>……</w:t>
+      </w:r>
+      <w:r>
+        <w:rPr>
+          <w:rFonts w:ascii="Arial" w:hAnsi="Arial" w:cs="Arial"/>
+        </w:rPr>
+        <w:t>.</w:t>
+      </w:r>
+      <w:proofErr w:type="gramEnd"/>
+      <w:r>
+        <w:rPr>
+          <w:rFonts w:ascii="Arial" w:hAnsi="Arial" w:cs="Arial"/>
+        </w:rPr>
+        <w:t>.</w:t>
+      </w:r>
+      <w:r>
+        <w:rPr>
+          <w:rFonts w:ascii="Arial" w:hAnsi="Arial" w:cs="Arial"/>
+        </w:rPr>
+        <w:t>……………………………………</w:t>
+      </w:r>
+      <w:r>
+        <w:rPr>
+          <w:rFonts w:ascii="Arial" w:hAnsi="Arial" w:cs="Arial"/>
+        </w:rPr>
+        <w:t>……</w:t>
+      </w:r>
+      <w:proofErr w:type="gramStart"/>
+      <w:r>
+        <w:rPr>
+          <w:rFonts w:ascii="Arial" w:hAnsi="Arial" w:cs="Arial"/>
+        </w:rPr>
+        <w:t>…….</w:t>
+      </w:r>
+      <w:proofErr w:type="gramEnd"/>
+      <w:r>
+        <w:rPr>
+          <w:rFonts w:ascii="Arial" w:hAnsi="Arial" w:cs="Arial"/>
+        </w:rPr>
+        <w:t>1</w:t>
+      </w:r>
+    </w:p>
+    <w:p>
+      <w:pPr>
+        <w:rPr>
+          <w:rFonts w:ascii="Arial" w:hAnsi="Arial" w:cs="Arial"/>
+        </w:rPr>
+      </w:pPr>
+      <w:r>
+        <w:rPr>
+          <w:rFonts w:ascii="Arial" w:hAnsi="Arial" w:cs="Arial"/>
+          <w:lang w:val="es-ES"/>
+        </w:rPr>
+        <w:tab/>
+      </w:r>
+      <w:r>
+        <w:rPr>
+          <w:rFonts w:ascii="Arial" w:hAnsi="Arial" w:cs="Arial"/>
+        </w:rPr>
+        <w:t xml:space="preserve">           1.1.1 (Subtítulo)………………………………</w:t>
+      </w:r>
+      <w:r>
+        <w:rPr>
+          <w:rFonts w:ascii="Arial" w:hAnsi="Arial" w:cs="Arial"/>
+        </w:rPr>
+        <w:t>………………</w:t>
+      </w:r>
+      <w:proofErr w:type="gramStart"/>
+      <w:r>
+        <w:rPr>
+          <w:rFonts w:ascii="Arial" w:hAnsi="Arial" w:cs="Arial"/>
+        </w:rPr>
+        <w:t>……</w:t>
+      </w:r>
+      <w:r>
+        <w:rPr>
+          <w:rFonts w:ascii="Arial" w:hAnsi="Arial" w:cs="Arial"/>
+        </w:rPr>
+        <w:t>.</w:t>
+      </w:r>
+      <w:proofErr w:type="gramEnd"/>
+      <w:r>
+        <w:rPr>
+          <w:rFonts w:ascii="Arial" w:hAnsi="Arial" w:cs="Arial"/>
+        </w:rPr>
+        <w:t>1</w:t>
+      </w:r>
+    </w:p>
+    <w:p>
+      <w:pPr>
+        <w:rPr>
+          <w:rFonts w:ascii="Arial" w:hAnsi="Arial" w:cs="Arial"/>
+        </w:rPr>
+      </w:pPr>
+      <w:r>
+        <w:rPr>
+          <w:rFonts w:ascii="Arial" w:hAnsi="Arial" w:cs="Arial"/>
+        </w:rPr>
+        <w:t xml:space="preserve">             1.2</w:t>
+      </w:r>
+      <w:proofErr w:type="gramStart"/>
+      <w:r>
+        <w:rPr>
+          <w:rFonts w:ascii="Arial" w:hAnsi="Arial" w:cs="Arial"/>
+        </w:rPr>
+        <w:t xml:space="preserve">   (</w:t>
+      </w:r>
+      <w:proofErr w:type="gramEnd"/>
+      <w:r>
+        <w:rPr>
+          <w:rFonts w:ascii="Arial" w:hAnsi="Arial" w:cs="Arial"/>
+        </w:rPr>
+        <w:t>Subtítulo)……………………………………………………</w:t>
+      </w:r>
+      <w:r>
+        <w:rPr>
+          <w:rFonts w:ascii="Arial" w:hAnsi="Arial" w:cs="Arial"/>
+        </w:rPr>
+        <w:t>…</w:t>
+      </w:r>
+      <w:proofErr w:type="gramStart"/>
+      <w:r>
+        <w:rPr>
+          <w:rFonts w:ascii="Arial" w:hAnsi="Arial" w:cs="Arial"/>
+        </w:rPr>
+        <w:t>….</w:t>
       </w:r>
       <w:r>
         <w:rPr>
@@ -1411,95 +1593,9 @@
         <w:rPr>
           <w:rFonts w:ascii="Arial" w:hAnsi="Arial" w:cs="Arial"/>
         </w:rPr>
-        <w:t>……………………………………</w:t>
-      </w:r>
-      <w:r>
-        <w:rPr>
-          <w:rFonts w:ascii="Arial" w:hAnsi="Arial" w:cs="Arial"/>
-        </w:rPr>
-        <w:t>……</w:t>
-      </w:r>
-      <w:r>
-        <w:rPr>
-          <w:rFonts w:ascii="Arial" w:hAnsi="Arial" w:cs="Arial"/>
-        </w:rPr>
-        <w:t>…….</w:t>
-      </w:r>
-      <w:r>
-        <w:rPr>
-          <w:rFonts w:ascii="Arial" w:hAnsi="Arial" w:cs="Arial"/>
-        </w:rPr>
-        <w:t>1</w:t>
-      </w:r>
-    </w:p>
-    <w:p>
-      <w:pPr>
-        <w:rPr>
-          <w:rFonts w:ascii="Arial" w:hAnsi="Arial" w:cs="Arial"/>
-        </w:rPr>
-      </w:pPr>
-      <w:r>
-        <w:rPr>
-          <w:rFonts w:ascii="Arial" w:hAnsi="Arial" w:cs="Arial"/>
-          <w:lang w:val="es-ES"/>
-        </w:rPr>
-        <w:tab/>
-      </w:r>
-      <w:r>
-        <w:rPr>
-          <w:rFonts w:ascii="Arial" w:hAnsi="Arial" w:cs="Arial"/>
-        </w:rPr>
-        <w:t xml:space="preserve">           1.1.1 (Subtítulo)………………………………</w:t>
-      </w:r>
-      <w:r>
-        <w:rPr>
-          <w:rFonts w:ascii="Arial" w:hAnsi="Arial" w:cs="Arial"/>
-        </w:rPr>
-        <w:t>……………………</w:t>
-      </w:r>
-      <w:r>
-        <w:rPr>
-          <w:rFonts w:ascii="Arial" w:hAnsi="Arial" w:cs="Arial"/>
-        </w:rPr>
         <w:t>.</w:t>
       </w:r>
-      <w:r>
-        <w:rPr>
-          <w:rFonts w:ascii="Arial" w:hAnsi="Arial" w:cs="Arial"/>
-        </w:rPr>
-        <w:t>1</w:t>
-      </w:r>
-    </w:p>
-    <w:p>
-      <w:pPr>
-        <w:rPr>
-          <w:rFonts w:ascii="Arial" w:hAnsi="Arial" w:cs="Arial"/>
-        </w:rPr>
-      </w:pPr>
-      <w:r>
-        <w:rPr>
-          <w:rFonts w:ascii="Arial" w:hAnsi="Arial" w:cs="Arial"/>
-        </w:rPr>
-        <w:t xml:space="preserve">             1.2   (Subtítulo)……………………………………………………</w:t>
-      </w:r>
-      <w:r>
-        <w:rPr>
-          <w:rFonts w:ascii="Arial" w:hAnsi="Arial" w:cs="Arial"/>
-        </w:rPr>
-        <w:t>…….</w:t>
-      </w:r>
-      <w:r>
-        <w:rPr>
-          <w:rFonts w:ascii="Arial" w:hAnsi="Arial" w:cs="Arial"/>
-        </w:rPr>
-        <w:t>..</w:t>
-      </w:r>
-      <w:r>
-        <w:rPr>
-          <w:rFonts w:ascii="Arial" w:hAnsi="Arial" w:cs="Arial"/>
-        </w:rPr>
-        <w:t>.</w:t>
-      </w:r>
+      <w:proofErr w:type="gramEnd"/>
       <w:r>
         <w:rPr>
           <w:rFonts w:ascii="Arial" w:hAnsi="Arial" w:cs="Arial"/>
@@ -1657,7 +1753,21 @@
         <w:rPr>
           <w:rFonts w:ascii="Arial" w:hAnsi="Arial" w:cs="Arial"/>
         </w:rPr>
-        <w:t>4.    FORMULACIÓN DE OBJETIVOS…………………………..…</w:t>
+        <w:t>4.    FORMULACIÓN DE OBJETIVOS……………………</w:t>
+      </w:r>
+      <w:proofErr w:type="gramStart"/>
+      <w:r>
+        <w:rPr>
+          <w:rFonts w:ascii="Arial" w:hAnsi="Arial" w:cs="Arial"/>
+        </w:rPr>
+        <w:t>…….</w:t>
+      </w:r>
+      <w:proofErr w:type="gramEnd"/>
+      <w:r>
+        <w:rPr>
+          <w:rFonts w:ascii="Arial" w:hAnsi="Arial" w:cs="Arial"/>
+        </w:rPr>
+        <w:t>.…</w:t>
       </w:r>
       <w:r>
         <w:rPr>
@@ -2185,7 +2295,21 @@
         <w:rPr>
           <w:rFonts w:ascii="Arial" w:hAnsi="Arial" w:cs="Arial"/>
         </w:rPr>
-        <w:t>.3 Sistemas Multiagente y Evaluación con Juez</w:t>
+        <w:t xml:space="preserve">.3 Sistemas </w:t>
+      </w:r>
+      <w:proofErr w:type="spellStart"/>
+      <w:r>
+        <w:rPr>
+          <w:rFonts w:ascii="Arial" w:hAnsi="Arial" w:cs="Arial"/>
+        </w:rPr>
+        <w:t>Multiagente</w:t>
+      </w:r>
+      <w:proofErr w:type="spellEnd"/>
+      <w:r>
+        <w:rPr>
+          <w:rFonts w:ascii="Arial" w:hAnsi="Arial" w:cs="Arial"/>
+        </w:rPr>
+        <w:t xml:space="preserve"> y Evaluación con Juez</w:t>
       </w:r>
     </w:p>
     <w:p>
@@ -2233,14 +2357,36 @@
           <w:rFonts w:ascii="Arial" w:hAnsi="Arial" w:cs="Arial"/>
         </w:rPr>
         <w:lastRenderedPageBreak/>
-        <w:t>6.    METODOLOGÍA………………………………………………....…</w:t>
-      </w:r>
-      <w:r>
-        <w:rPr>
-          <w:rFonts w:ascii="Arial" w:hAnsi="Arial" w:cs="Arial"/>
-        </w:rPr>
-        <w:t>………....</w:t>
-      </w:r>
+        <w:t>6.    METODOLOGÍA……………………………………………</w:t>
+      </w:r>
+      <w:proofErr w:type="gramStart"/>
+      <w:r>
+        <w:rPr>
+          <w:rFonts w:ascii="Arial" w:hAnsi="Arial" w:cs="Arial"/>
+        </w:rPr>
+        <w:t>…....</w:t>
+      </w:r>
+      <w:proofErr w:type="gramEnd"/>
+      <w:r>
+        <w:rPr>
+          <w:rFonts w:ascii="Arial" w:hAnsi="Arial" w:cs="Arial"/>
+        </w:rPr>
+        <w:t>…</w:t>
+      </w:r>
+      <w:r>
+        <w:rPr>
+          <w:rFonts w:ascii="Arial" w:hAnsi="Arial" w:cs="Arial"/>
+        </w:rPr>
+        <w:t>……</w:t>
+      </w:r>
+      <w:proofErr w:type="gramStart"/>
+      <w:r>
+        <w:rPr>
+          <w:rFonts w:ascii="Arial" w:hAnsi="Arial" w:cs="Arial"/>
+        </w:rPr>
+        <w:t>…....</w:t>
+      </w:r>
+      <w:proofErr w:type="gramEnd"/>
       <w:r>
         <w:rPr>
           <w:rFonts w:ascii="Arial" w:hAnsi="Arial" w:cs="Arial"/>
@@ -2387,7 +2533,21 @@
         <w:rPr>
           <w:rFonts w:ascii="Arial" w:hAnsi="Arial" w:cs="Arial"/>
         </w:rPr>
-        <w:t>…………………………………………….....……….......</w:t>
+        <w:t>…………………………………………</w:t>
+      </w:r>
+      <w:proofErr w:type="gramStart"/>
+      <w:r>
+        <w:rPr>
+          <w:rFonts w:ascii="Arial" w:hAnsi="Arial" w:cs="Arial"/>
+        </w:rPr>
+        <w:t>…....</w:t>
+      </w:r>
+      <w:proofErr w:type="gramEnd"/>
+      <w:r>
+        <w:rPr>
+          <w:rFonts w:ascii="Arial" w:hAnsi="Arial" w:cs="Arial"/>
+        </w:rPr>
+        <w:t>.……….......</w:t>
       </w:r>
       <w:r>
         <w:rPr>
@@ -2444,7 +2604,21 @@
         <w:rPr>
           <w:rFonts w:ascii="Arial" w:hAnsi="Arial" w:cs="Arial"/>
         </w:rPr>
-        <w:t>...........…………………………………………….....……….............</w:t>
+        <w:t>...........…………………………………………</w:t>
+      </w:r>
+      <w:proofErr w:type="gramStart"/>
+      <w:r>
+        <w:rPr>
+          <w:rFonts w:ascii="Arial" w:hAnsi="Arial" w:cs="Arial"/>
+        </w:rPr>
+        <w:t>…....</w:t>
+      </w:r>
+      <w:proofErr w:type="gramEnd"/>
+      <w:r>
+        <w:rPr>
+          <w:rFonts w:ascii="Arial" w:hAnsi="Arial" w:cs="Arial"/>
+        </w:rPr>
+        <w:t>.……….............</w:t>
       </w:r>
       <w:r>
         <w:rPr>
@@ -4355,11 +4529,19 @@
         </w:rPr>
         <w:t xml:space="preserve">Redacción alusiva al primer subtema de este capítulo. </w:t>
       </w:r>
-      <w:r>
-        <w:rPr>
-          <w:rFonts w:ascii="Arial" w:hAnsi="Arial" w:cs="Arial"/>
-        </w:rPr>
-        <w:t>JkadkjfhkhdsfkDFLKLKJdklfj.</w:t>
+      <w:proofErr w:type="spellStart"/>
+      <w:r>
+        <w:rPr>
+          <w:rFonts w:ascii="Arial" w:hAnsi="Arial" w:cs="Arial"/>
+        </w:rPr>
+        <w:t>JkadkjfhkhdsfkDFLKLKJdklfj</w:t>
+      </w:r>
+      <w:proofErr w:type="spellEnd"/>
+      <w:r>
+        <w:rPr>
+          <w:rFonts w:ascii="Arial" w:hAnsi="Arial" w:cs="Arial"/>
+        </w:rPr>
+        <w:t>.</w:t>
       </w:r>
     </w:p>
     <w:p>
@@ -4380,8 +4562,65 @@
           <w:rFonts w:ascii="Arial" w:hAnsi="Arial" w:cs="Arial"/>
         </w:rPr>
         <w:tab/>
-        <w:t>Nfdkjdksfjng.nsfd.gn .lnkfglkfg lkdjfgñlkjsdñflkgjlkjfdg ñlsdjfglkjfdlkgj lkjglkjslkjg</w:t>
-      </w:r>
+      </w:r>
+      <w:proofErr w:type="gramStart"/>
+      <w:r>
+        <w:rPr>
+          <w:rFonts w:ascii="Arial" w:hAnsi="Arial" w:cs="Arial"/>
+        </w:rPr>
+        <w:t>Nfdkjdksfjng.nsfd.gn .</w:t>
+      </w:r>
+      <w:proofErr w:type="spellStart"/>
+      <w:r>
+        <w:rPr>
+          <w:rFonts w:ascii="Arial" w:hAnsi="Arial" w:cs="Arial"/>
+        </w:rPr>
+        <w:t>lnkfglkfg</w:t>
+      </w:r>
+      <w:proofErr w:type="spellEnd"/>
+      <w:proofErr w:type="gramEnd"/>
+      <w:r>
+        <w:rPr>
+          <w:rFonts w:ascii="Arial" w:hAnsi="Arial" w:cs="Arial"/>
+        </w:rPr>
+        <w:t xml:space="preserve"> </w:t>
+      </w:r>
+      <w:proofErr w:type="spellStart"/>
+      <w:r>
+        <w:rPr>
+          <w:rFonts w:ascii="Arial" w:hAnsi="Arial" w:cs="Arial"/>
+        </w:rPr>
+        <w:t>lkdjfgñlkjsdñflkgjlkjfdg</w:t>
+      </w:r>
+      <w:proofErr w:type="spellEnd"/>
+      <w:r>
+        <w:rPr>
+          <w:rFonts w:ascii="Arial" w:hAnsi="Arial" w:cs="Arial"/>
+        </w:rPr>
+        <w:t xml:space="preserve"> </w:t>
+      </w:r>
+      <w:proofErr w:type="spellStart"/>
+      <w:r>
+        <w:rPr>
+          <w:rFonts w:ascii="Arial" w:hAnsi="Arial" w:cs="Arial"/>
+        </w:rPr>
+        <w:t>ñlsdjfglkjfdlkgj</w:t>
+      </w:r>
+      <w:proofErr w:type="spellEnd"/>
+      <w:r>
+        <w:rPr>
+          <w:rFonts w:ascii="Arial" w:hAnsi="Arial" w:cs="Arial"/>
+        </w:rPr>
+        <w:t xml:space="preserve"> </w:t>
+      </w:r>
+      <w:proofErr w:type="spellStart"/>
+      <w:r>
+        <w:rPr>
+          <w:rFonts w:ascii="Arial" w:hAnsi="Arial" w:cs="Arial"/>
+        </w:rPr>
+        <w:t>lkjglkjslkjg</w:t>
+      </w:r>
+      <w:proofErr w:type="spellEnd"/>
     </w:p>
     <w:p>
       <w:pPr>
@@ -4409,12 +4648,14 @@
         </w:rPr>
         <w:t>1.1.1</w:t>
       </w:r>
+      <w:proofErr w:type="gramStart"/>
       <w:r>
         <w:rPr>
           <w:rFonts w:ascii="Arial" w:hAnsi="Arial" w:cs="Arial"/>
         </w:rPr>
         <w:t xml:space="preserve">   (</w:t>
       </w:r>
+      <w:proofErr w:type="gramEnd"/>
       <w:r>
         <w:rPr>
           <w:rFonts w:ascii="Arial" w:hAnsi="Arial" w:cs="Arial"/>
@@ -4498,11 +4739,19 @@
         </w:rPr>
         <w:t xml:space="preserve">Redacción alusiva al primer subtema de este capítulo. </w:t>
       </w:r>
-      <w:r>
-        <w:rPr>
-          <w:rFonts w:ascii="Arial" w:hAnsi="Arial" w:cs="Arial"/>
-        </w:rPr>
-        <w:t>JkadkjfhkhdsfkDFLKLKJdklfj.</w:t>
+      <w:proofErr w:type="spellStart"/>
+      <w:r>
+        <w:rPr>
+          <w:rFonts w:ascii="Arial" w:hAnsi="Arial" w:cs="Arial"/>
+        </w:rPr>
+        <w:t>JkadkjfhkhdsfkDFLKLKJdklfj</w:t>
+      </w:r>
+      <w:proofErr w:type="spellEnd"/>
+      <w:r>
+        <w:rPr>
+          <w:rFonts w:ascii="Arial" w:hAnsi="Arial" w:cs="Arial"/>
+        </w:rPr>
+        <w:t>.</w:t>
       </w:r>
     </w:p>
     <w:p>
@@ -4716,12 +4965,14 @@
         </w:rPr>
         <w:t>2.1.1</w:t>
       </w:r>
+      <w:proofErr w:type="gramStart"/>
       <w:r>
         <w:rPr>
           <w:rFonts w:ascii="Arial" w:hAnsi="Arial" w:cs="Arial"/>
         </w:rPr>
         <w:t xml:space="preserve">   (</w:t>
       </w:r>
+      <w:proofErr w:type="gramEnd"/>
       <w:r>
         <w:rPr>
           <w:rFonts w:ascii="Arial" w:hAnsi="Arial" w:cs="Arial"/>
@@ -5134,11 +5385,47 @@
         </w:rPr>
         <w:t>(</w:t>
       </w:r>
-      <w:r>
-        <w:rPr>
-          <w:rFonts w:ascii="Arial" w:hAnsi="Arial" w:cs="Arial"/>
-        </w:rPr>
-        <w:t xml:space="preserve">United Nations Office on Drugs and Crime </w:t>
+      <w:proofErr w:type="spellStart"/>
+      <w:r>
+        <w:rPr>
+          <w:rFonts w:ascii="Arial" w:hAnsi="Arial" w:cs="Arial"/>
+        </w:rPr>
+        <w:t>United</w:t>
+      </w:r>
+      <w:proofErr w:type="spellEnd"/>
+      <w:r>
+        <w:rPr>
+          <w:rFonts w:ascii="Arial" w:hAnsi="Arial" w:cs="Arial"/>
+        </w:rPr>
+        <w:t xml:space="preserve"> Nations Office </w:t>
+      </w:r>
+      <w:proofErr w:type="spellStart"/>
+      <w:r>
+        <w:rPr>
+          <w:rFonts w:ascii="Arial" w:hAnsi="Arial" w:cs="Arial"/>
+        </w:rPr>
+        <w:t>on</w:t>
+      </w:r>
+      <w:proofErr w:type="spellEnd"/>
+      <w:r>
+        <w:rPr>
+          <w:rFonts w:ascii="Arial" w:hAnsi="Arial" w:cs="Arial"/>
+        </w:rPr>
+        <w:t xml:space="preserve"> Drugs and </w:t>
+      </w:r>
+      <w:proofErr w:type="spellStart"/>
+      <w:r>
+        <w:rPr>
+          <w:rFonts w:ascii="Arial" w:hAnsi="Arial" w:cs="Arial"/>
+        </w:rPr>
+        <w:t>Crime</w:t>
+      </w:r>
+      <w:proofErr w:type="spellEnd"/>
+      <w:r>
+        <w:rPr>
+          <w:rFonts w:ascii="Arial" w:hAnsi="Arial" w:cs="Arial"/>
+        </w:rPr>
+        <w:t xml:space="preserve"> </w:t>
       </w:r>
       <w:r>
         <w:rPr>
@@ -5229,7 +5516,49 @@
           <w:rFonts w:ascii="Arial" w:hAnsi="Arial" w:cs="Arial"/>
         </w:rPr>
         <w:lastRenderedPageBreak/>
-        <w:t>proliferación de armas de destrucción masiva, y sus recomendaciones son reconocidas como el estándar global en la materia (Financial Action Task Force [FATF], 202</w:t>
+        <w:t>proliferación de armas de destrucción masiva, y sus recomendaciones son reconocidas como el estándar global en la materia (</w:t>
+      </w:r>
+      <w:proofErr w:type="spellStart"/>
+      <w:r>
+        <w:rPr>
+          <w:rFonts w:ascii="Arial" w:hAnsi="Arial" w:cs="Arial"/>
+        </w:rPr>
+        <w:t>Financial</w:t>
+      </w:r>
+      <w:proofErr w:type="spellEnd"/>
+      <w:r>
+        <w:rPr>
+          <w:rFonts w:ascii="Arial" w:hAnsi="Arial" w:cs="Arial"/>
+        </w:rPr>
+        <w:t xml:space="preserve"> </w:t>
+      </w:r>
+      <w:proofErr w:type="spellStart"/>
+      <w:r>
+        <w:rPr>
+          <w:rFonts w:ascii="Arial" w:hAnsi="Arial" w:cs="Arial"/>
+        </w:rPr>
+        <w:t>Action</w:t>
+      </w:r>
+      <w:proofErr w:type="spellEnd"/>
+      <w:r>
+        <w:rPr>
+          <w:rFonts w:ascii="Arial" w:hAnsi="Arial" w:cs="Arial"/>
+        </w:rPr>
+        <w:t xml:space="preserve"> </w:t>
+      </w:r>
+      <w:proofErr w:type="spellStart"/>
+      <w:r>
+        <w:rPr>
+          <w:rFonts w:ascii="Arial" w:hAnsi="Arial" w:cs="Arial"/>
+        </w:rPr>
+        <w:t>Task</w:t>
+      </w:r>
+      <w:proofErr w:type="spellEnd"/>
+      <w:r>
+        <w:rPr>
+          <w:rFonts w:ascii="Arial" w:hAnsi="Arial" w:cs="Arial"/>
+        </w:rPr>
+        <w:t xml:space="preserve"> Force [FATF], 202</w:t>
       </w:r>
       <w:r>
         <w:rPr>
@@ -5349,7 +5678,21 @@
         <w:rPr>
           <w:rFonts w:ascii="Arial" w:hAnsi="Arial" w:cs="Arial"/>
         </w:rPr>
-        <w:t>Este esfuerzo internacional se vio reflejado en México de manera gradual: en 1990 se incorporó el delito de lavado de dinero al Código Fiscal de la Federación, se emitieron las primeras disposiciones generales para el sistema financiero y, en 2000, el país ingresó como miembro de pleno derecho al GAFI (Núñez Camacho, 2008, pp. xxi-xxii)</w:t>
+        <w:t xml:space="preserve">Este esfuerzo internacional se vio reflejado en México de manera gradual: en 1990 se incorporó el delito de lavado de dinero al Código Fiscal de la Federación, se emitieron las primeras disposiciones generales para el sistema financiero y, en 2000, el país ingresó como miembro de pleno derecho al GAFI (Núñez Camacho, 2008, pp. </w:t>
+      </w:r>
+      <w:proofErr w:type="spellStart"/>
+      <w:r>
+        <w:rPr>
+          <w:rFonts w:ascii="Arial" w:hAnsi="Arial" w:cs="Arial"/>
+        </w:rPr>
+        <w:t>xxi-xxii</w:t>
+      </w:r>
+      <w:proofErr w:type="spellEnd"/>
+      <w:r>
+        <w:rPr>
+          <w:rFonts w:ascii="Arial" w:hAnsi="Arial" w:cs="Arial"/>
+        </w:rPr>
+        <w:t>)</w:t>
       </w:r>
       <w:r>
         <w:rPr>
@@ -5379,7 +5722,21 @@
         <w:rPr>
           <w:rFonts w:ascii="Arial" w:hAnsi="Arial" w:cs="Arial"/>
         </w:rPr>
-        <w:t>, ese marco se traduce en la obligación de contar con sistemas automatizados que detecten y monitoreen operaciones, generen alertas y sustenten el reporte de operaciones inusuales (CNBV, 2017, diap. 25 y 31). Sin embargo, la Evaluación Nacional de Riesgos reconoce deficiencias en estos sistemas, principalmente en la parametrización de sus escenarios de alerta (UIF, 2023, p. 23).</w:t>
+        <w:t xml:space="preserve">, ese marco se traduce en la obligación de contar con sistemas automatizados que detecten y monitoreen operaciones, generen alertas y sustenten el reporte de operaciones inusuales (CNBV, 2017, </w:t>
+      </w:r>
+      <w:proofErr w:type="spellStart"/>
+      <w:r>
+        <w:rPr>
+          <w:rFonts w:ascii="Arial" w:hAnsi="Arial" w:cs="Arial"/>
+        </w:rPr>
+        <w:t>diap</w:t>
+      </w:r>
+      <w:proofErr w:type="spellEnd"/>
+      <w:r>
+        <w:rPr>
+          <w:rFonts w:ascii="Arial" w:hAnsi="Arial" w:cs="Arial"/>
+        </w:rPr>
+        <w:t>. 25 y 31). Sin embargo, la Evaluación Nacional de Riesgos reconoce deficiencias en estos sistemas, principalmente en la parametrización de sus escenarios de alerta (UIF, 2023, p. 23).</w:t>
       </w:r>
     </w:p>
     <w:p>
@@ -5434,7 +5791,21 @@
         <w:rPr>
           <w:rFonts w:ascii="Arial" w:hAnsi="Arial" w:cs="Arial"/>
         </w:rPr>
-        <w:t>, los modelos que detectan operaciones sospechosas pierden eficacia con el tiempo, porque cambian los datos y también las formas de operar de quienes lavan dinero (Gama et ál., 2014; Rocha-Salazar et ál., 2021). Además, hay que confirmar que una operación fue realmente lavado de dinero</w:t>
+        <w:t xml:space="preserve">, los modelos que detectan operaciones sospechosas pierden eficacia con el tiempo, porque cambian los datos y también las formas de operar de quienes lavan dinero (Gama et ál., 2014; Rocha-Salazar et ál., 2021). Además, hay que confirmar que una operación fue realmente </w:t>
+      </w:r>
+      <w:proofErr w:type="gramStart"/>
+      <w:r>
+        <w:rPr>
+          <w:rFonts w:ascii="Arial" w:hAnsi="Arial" w:cs="Arial"/>
+        </w:rPr>
+        <w:t>lavado</w:t>
+      </w:r>
+      <w:proofErr w:type="gramEnd"/>
+      <w:r>
+        <w:rPr>
+          <w:rFonts w:ascii="Arial" w:hAnsi="Arial" w:cs="Arial"/>
+        </w:rPr>
+        <w:t xml:space="preserve"> de dinero</w:t>
       </w:r>
       <w:r>
         <w:rPr>
@@ -5906,7 +6277,21 @@
         <w:rPr>
           <w:rFonts w:ascii="Arial" w:hAnsi="Arial" w:cs="Arial"/>
         </w:rPr>
-        <w:t>El uso de agentes y modelos de lenguaje para combatir el lavado de dinero se ha centrado en detectar operaciones sospechosas (Mohamed et ál., 2026; Pirmorad, 2025), mientras que</w:t>
+        <w:t xml:space="preserve">El uso de agentes y modelos de lenguaje para combatir el lavado de dinero se ha centrado en detectar operaciones sospechosas (Mohamed et ál., 2026; </w:t>
+      </w:r>
+      <w:proofErr w:type="spellStart"/>
+      <w:r>
+        <w:rPr>
+          <w:rFonts w:ascii="Arial" w:hAnsi="Arial" w:cs="Arial"/>
+        </w:rPr>
+        <w:t>Pirmorad</w:t>
+      </w:r>
+      <w:proofErr w:type="spellEnd"/>
+      <w:r>
+        <w:rPr>
+          <w:rFonts w:ascii="Arial" w:hAnsi="Arial" w:cs="Arial"/>
+        </w:rPr>
+        <w:t>, 2025), mientras que</w:t>
       </w:r>
       <w:r>
         <w:rPr>
@@ -6441,7 +6826,23 @@
           <w:sz w:val="24"/>
           <w:szCs w:val="24"/>
         </w:rPr>
-        <w:t>rdida de eficiencia y la proporción de causas que identifica correctamente, para medir su oportunidad y exactitud</w:t>
+        <w:t xml:space="preserve">rdida de </w:t>
+      </w:r>
+      <w:r>
+        <w:rPr>
+          <w:rFonts w:ascii="Arial" w:hAnsi="Arial" w:cs="Arial"/>
+          <w:sz w:val="24"/>
+          <w:szCs w:val="24"/>
+        </w:rPr>
+        <w:t>eficacia</w:t>
+      </w:r>
+      <w:r>
+        <w:rPr>
+          <w:rFonts w:ascii="Arial" w:hAnsi="Arial" w:cs="Arial"/>
+          <w:sz w:val="24"/>
+          <w:szCs w:val="24"/>
+        </w:rPr>
+        <w:t xml:space="preserve"> y la proporción de causas que identifica correctamente, para medir su oportunidad y exactitud</w:t>
       </w:r>
       <w:r>
         <w:rPr>
@@ -6830,7 +7231,31 @@
           <w:b/>
           <w:bCs/>
         </w:rPr>
-        <w:t>5.3 Pérdida de Eficiencia de los Modelos en Producción</w:t>
+        <w:t xml:space="preserve">5.3 Pérdida de </w:t>
+      </w:r>
+      <w:r>
+        <w:rPr>
+          <w:rFonts w:ascii="Arial" w:hAnsi="Arial" w:cs="Arial"/>
+          <w:b/>
+          <w:bCs/>
+        </w:rPr>
+        <w:t>E</w:t>
+      </w:r>
+      <w:r>
+        <w:rPr>
+          <w:rFonts w:ascii="Arial" w:hAnsi="Arial" w:cs="Arial"/>
+          <w:b/>
+          <w:bCs/>
+        </w:rPr>
+        <w:t>ficacia</w:t>
+      </w:r>
+      <w:r>
+        <w:rPr>
+          <w:rFonts w:ascii="Arial" w:hAnsi="Arial" w:cs="Arial"/>
+          <w:b/>
+          <w:bCs/>
+        </w:rPr>
+        <w:t xml:space="preserve"> de los Modelos en Producción</w:t>
       </w:r>
     </w:p>
     <w:p>
@@ -6904,7 +7329,25 @@
         <w:rPr>
           <w:rFonts w:ascii="Arial" w:hAnsi="Arial" w:cs="Arial"/>
         </w:rPr>
-        <w:t xml:space="preserve">5.3.4 Detección de la Pérdida de Eficiencia </w:t>
+        <w:t xml:space="preserve">5.3.4 Detección de la Pérdida de </w:t>
+      </w:r>
+      <w:r>
+        <w:rPr>
+          <w:rFonts w:ascii="Arial" w:hAnsi="Arial" w:cs="Arial"/>
+        </w:rPr>
+        <w:t>E</w:t>
+      </w:r>
+      <w:r>
+        <w:rPr>
+          <w:rFonts w:ascii="Arial" w:hAnsi="Arial" w:cs="Arial"/>
+        </w:rPr>
+        <w:t>ficacia</w:t>
+      </w:r>
+      <w:r>
+        <w:rPr>
+          <w:rFonts w:ascii="Arial" w:hAnsi="Arial" w:cs="Arial"/>
+        </w:rPr>
+        <w:t xml:space="preserve"> </w:t>
       </w:r>
     </w:p>
     <w:p>
@@ -6978,7 +7421,21 @@
         <w:rPr>
           <w:rFonts w:ascii="Arial" w:hAnsi="Arial" w:cs="Arial"/>
         </w:rPr>
-        <w:t>5.4.3 Sistemas Multiagente y Evaluación con Juez</w:t>
+        <w:t xml:space="preserve">5.4.3 Sistemas </w:t>
+      </w:r>
+      <w:proofErr w:type="spellStart"/>
+      <w:r>
+        <w:rPr>
+          <w:rFonts w:ascii="Arial" w:hAnsi="Arial" w:cs="Arial"/>
+        </w:rPr>
+        <w:t>Multiagente</w:t>
+      </w:r>
+      <w:proofErr w:type="spellEnd"/>
+      <w:r>
+        <w:rPr>
+          <w:rFonts w:ascii="Arial" w:hAnsi="Arial" w:cs="Arial"/>
+        </w:rPr>
+        <w:t xml:space="preserve"> y Evaluación con Juez</w:t>
       </w:r>
     </w:p>
     <w:p>
@@ -7312,12 +7769,14 @@
         </w:rPr>
         <w:t>1.1.1</w:t>
       </w:r>
+      <w:proofErr w:type="gramStart"/>
       <w:r>
         <w:rPr>
           <w:rFonts w:ascii="Arial" w:hAnsi="Arial" w:cs="Arial"/>
         </w:rPr>
         <w:t xml:space="preserve">   (</w:t>
       </w:r>
+      <w:proofErr w:type="gramEnd"/>
       <w:r>
         <w:rPr>
           <w:rFonts w:ascii="Arial" w:hAnsi="Arial" w:cs="Arial"/>
@@ -7711,12 +8170,14 @@
         </w:rPr>
         <w:t>1.1.1</w:t>
       </w:r>
+      <w:proofErr w:type="gramStart"/>
       <w:r>
         <w:rPr>
           <w:rFonts w:ascii="Arial" w:hAnsi="Arial" w:cs="Arial"/>
         </w:rPr>
         <w:t xml:space="preserve">   (</w:t>
       </w:r>
+      <w:proofErr w:type="gramEnd"/>
       <w:r>
         <w:rPr>
           <w:rFonts w:ascii="Arial" w:hAnsi="Arial" w:cs="Arial"/>
@@ -8232,6 +8693,7 @@
         </w:rPr>
         <w:t xml:space="preserve">. </w:t>
       </w:r>
+      <w:proofErr w:type="spellStart"/>
       <w:r>
         <w:rPr>
           <w:rFonts w:ascii="Arial" w:hAnsi="Arial" w:cs="Arial"/>
@@ -8239,6 +8701,7 @@
         </w:rPr>
         <w:t>Aranzadi</w:t>
       </w:r>
+      <w:proofErr w:type="spellEnd"/>
       <w:r>
         <w:rPr>
           <w:rFonts w:ascii="Arial" w:hAnsi="Arial" w:cs="Arial"/>
@@ -8270,6 +8733,7 @@
         </w:rPr>
         <w:t xml:space="preserve">(s.f.). </w:t>
       </w:r>
+      <w:proofErr w:type="spellStart"/>
       <w:r>
         <w:rPr>
           <w:rFonts w:ascii="Arial" w:hAnsi="Arial" w:cs="Arial"/>
@@ -8278,6 +8742,7 @@
         </w:rPr>
         <w:t>Overview</w:t>
       </w:r>
+      <w:proofErr w:type="spellEnd"/>
       <w:r>
         <w:rPr>
           <w:rFonts w:ascii="Arial" w:hAnsi="Arial" w:cs="Arial"/>
@@ -8472,7 +8937,63 @@
         <w:rPr>
           <w:rFonts w:ascii="Arial" w:hAnsi="Arial" w:cs="Arial"/>
         </w:rPr>
-        <w:t xml:space="preserve">Gama, J., Žliobaitė, I., Bifet, A., Pechenizkiy, M. y Bouchachia, A. (2014). </w:t>
+        <w:t xml:space="preserve">Gama, J., </w:t>
+      </w:r>
+      <w:proofErr w:type="spellStart"/>
+      <w:r>
+        <w:rPr>
+          <w:rFonts w:ascii="Arial" w:hAnsi="Arial" w:cs="Arial"/>
+        </w:rPr>
+        <w:t>Žliobaitė</w:t>
+      </w:r>
+      <w:proofErr w:type="spellEnd"/>
+      <w:r>
+        <w:rPr>
+          <w:rFonts w:ascii="Arial" w:hAnsi="Arial" w:cs="Arial"/>
+        </w:rPr>
+        <w:t xml:space="preserve">, I., </w:t>
+      </w:r>
+      <w:proofErr w:type="spellStart"/>
+      <w:r>
+        <w:rPr>
+          <w:rFonts w:ascii="Arial" w:hAnsi="Arial" w:cs="Arial"/>
+        </w:rPr>
+        <w:t>Bifet</w:t>
+      </w:r>
+      <w:proofErr w:type="spellEnd"/>
+      <w:r>
+        <w:rPr>
+          <w:rFonts w:ascii="Arial" w:hAnsi="Arial" w:cs="Arial"/>
+        </w:rPr>
+        <w:t xml:space="preserve">, A., </w:t>
+      </w:r>
+      <w:proofErr w:type="spellStart"/>
+      <w:r>
+        <w:rPr>
+          <w:rFonts w:ascii="Arial" w:hAnsi="Arial" w:cs="Arial"/>
+        </w:rPr>
+        <w:t>Pechenizkiy</w:t>
+      </w:r>
+      <w:proofErr w:type="spellEnd"/>
+      <w:r>
+        <w:rPr>
+          <w:rFonts w:ascii="Arial" w:hAnsi="Arial" w:cs="Arial"/>
+        </w:rPr>
+        <w:t xml:space="preserve">, M. y </w:t>
+      </w:r>
+      <w:proofErr w:type="spellStart"/>
+      <w:r>
+        <w:rPr>
+          <w:rFonts w:ascii="Arial" w:hAnsi="Arial" w:cs="Arial"/>
+        </w:rPr>
+        <w:t>Bouchachia</w:t>
+      </w:r>
+      <w:proofErr w:type="spellEnd"/>
+      <w:r>
+        <w:rPr>
+          <w:rFonts w:ascii="Arial" w:hAnsi="Arial" w:cs="Arial"/>
+        </w:rPr>
+        <w:t xml:space="preserve">, A. (2014). </w:t>
       </w:r>
       <w:r>
         <w:rPr>
@@ -8495,7 +9016,23 @@
           <w:rFonts w:ascii="Arial" w:hAnsi="Arial" w:cs="Arial"/>
           <w:lang w:val="en-US"/>
         </w:rPr>
-        <w:t>(4), Artículo 44.</w:t>
+        <w:t xml:space="preserve">(4), </w:t>
+      </w:r>
+      <w:proofErr w:type="spellStart"/>
+      <w:r>
+        <w:rPr>
+          <w:rFonts w:ascii="Arial" w:hAnsi="Arial" w:cs="Arial"/>
+          <w:lang w:val="en-US"/>
+        </w:rPr>
+        <w:t>Artículo</w:t>
+      </w:r>
+      <w:proofErr w:type="spellEnd"/>
+      <w:r>
+        <w:rPr>
+          <w:rFonts w:ascii="Arial" w:hAnsi="Arial" w:cs="Arial"/>
+          <w:lang w:val="en-US"/>
+        </w:rPr>
+        <w:t xml:space="preserve"> 44.</w:t>
       </w:r>
     </w:p>
     <w:p>
@@ -8596,7 +9133,23 @@
           <w:rFonts w:ascii="Arial" w:hAnsi="Arial" w:cs="Arial"/>
           <w:lang w:val="en-US"/>
         </w:rPr>
-        <w:t xml:space="preserve">Mohamed, R. E., Hussain, M., Jadidi, Z., Foo, E. y Azam, S. (2026). Towards agentic AI swarm modeling for blockchain-based money laundering detection. En S. Pal, K. Biswas, S. Kanhere, T. Myers y V. Muthukkumarasamy (Eds.), </w:t>
+        <w:t xml:space="preserve">Mohamed, R. E., Hussain, M., Jadidi, Z., Foo, E. y Azam, S. (2026). Towards agentic AI swarm modeling for blockchain-based money laundering detection. En S. Pal, K. Biswas, S. Kanhere, T. Myers y V. </w:t>
+      </w:r>
+      <w:proofErr w:type="spellStart"/>
+      <w:r>
+        <w:rPr>
+          <w:rFonts w:ascii="Arial" w:hAnsi="Arial" w:cs="Arial"/>
+          <w:lang w:val="en-US"/>
+        </w:rPr>
+        <w:t>Muthukkumarasamy</w:t>
+      </w:r>
+      <w:proofErr w:type="spellEnd"/>
+      <w:r>
+        <w:rPr>
+          <w:rFonts w:ascii="Arial" w:hAnsi="Arial" w:cs="Arial"/>
+          <w:lang w:val="en-US"/>
+        </w:rPr>
+        <w:t xml:space="preserve"> (Eds.), </w:t>
       </w:r>
       <w:r>
         <w:rPr>
@@ -8632,12 +9185,21 @@
           <w:rFonts w:ascii="Arial" w:hAnsi="Arial" w:cs="Arial"/>
         </w:rPr>
       </w:pPr>
+      <w:proofErr w:type="spellStart"/>
       <w:r>
         <w:rPr>
           <w:rFonts w:ascii="Arial" w:hAnsi="Arial" w:cs="Arial"/>
           <w:lang w:val="en-US"/>
         </w:rPr>
-        <w:t xml:space="preserve">Pirmorad, E. (2025). </w:t>
+        <w:t>Pirmorad</w:t>
+      </w:r>
+      <w:proofErr w:type="spellEnd"/>
+      <w:r>
+        <w:rPr>
+          <w:rFonts w:ascii="Arial" w:hAnsi="Arial" w:cs="Arial"/>
+          <w:lang w:val="en-US"/>
+        </w:rPr>
+        <w:t xml:space="preserve">, E. (2025). </w:t>
       </w:r>
       <w:r>
         <w:rPr>
@@ -8653,7 +9215,23 @@
           <w:rFonts w:ascii="Arial" w:hAnsi="Arial" w:cs="Arial"/>
           <w:lang w:val="en-US"/>
         </w:rPr>
-        <w:t xml:space="preserve"> [Preprint]. arXiv. </w:t>
+        <w:t xml:space="preserve"> [Preprint]. </w:t>
+      </w:r>
+      <w:proofErr w:type="spellStart"/>
+      <w:r>
+        <w:rPr>
+          <w:rFonts w:ascii="Arial" w:hAnsi="Arial" w:cs="Arial"/>
+          <w:lang w:val="en-US"/>
+        </w:rPr>
+        <w:t>arXiv</w:t>
+      </w:r>
+      <w:proofErr w:type="spellEnd"/>
+      <w:r>
+        <w:rPr>
+          <w:rFonts w:ascii="Arial" w:hAnsi="Arial" w:cs="Arial"/>
+          <w:lang w:val="en-US"/>
+        </w:rPr>
+        <w:t xml:space="preserve">. </w:t>
       </w:r>
       <w:hyperlink r:id="rId15" w:history="1">
         <w:r>
@@ -8680,7 +9258,35 @@
         <w:rPr>
           <w:rFonts w:ascii="Arial" w:hAnsi="Arial" w:cs="Arial"/>
         </w:rPr>
-        <w:t xml:space="preserve">Sethi, A., Gupta, P., Kansotia, S., Kant, K. y Srivasatava, N. (2026). </w:t>
+        <w:t xml:space="preserve">Sethi, A., Gupta, P., </w:t>
+      </w:r>
+      <w:proofErr w:type="spellStart"/>
+      <w:r>
+        <w:rPr>
+          <w:rFonts w:ascii="Arial" w:hAnsi="Arial" w:cs="Arial"/>
+        </w:rPr>
+        <w:t>Kansotia</w:t>
+      </w:r>
+      <w:proofErr w:type="spellEnd"/>
+      <w:r>
+        <w:rPr>
+          <w:rFonts w:ascii="Arial" w:hAnsi="Arial" w:cs="Arial"/>
+        </w:rPr>
+        <w:t xml:space="preserve">, S., Kant, K. y </w:t>
+      </w:r>
+      <w:proofErr w:type="spellStart"/>
+      <w:r>
+        <w:rPr>
+          <w:rFonts w:ascii="Arial" w:hAnsi="Arial" w:cs="Arial"/>
+        </w:rPr>
+        <w:t>Srivasatava</w:t>
+      </w:r>
+      <w:proofErr w:type="spellEnd"/>
+      <w:r>
+        <w:rPr>
+          <w:rFonts w:ascii="Arial" w:hAnsi="Arial" w:cs="Arial"/>
+        </w:rPr>
+        <w:t xml:space="preserve">, N. (2026). </w:t>
       </w:r>
       <w:r>
         <w:rPr>
@@ -8731,12 +9337,21 @@
         </w:rPr>
         <w:t xml:space="preserve">Wang, Z., Liu, Z., Zhang, Y., Zhong, A., Wang, J., Yin, F., Fan, L., Wu, L. y Wen, Q. (2024). </w:t>
       </w:r>
+      <w:proofErr w:type="spellStart"/>
       <w:r>
         <w:rPr>
           <w:rFonts w:ascii="Arial" w:hAnsi="Arial" w:cs="Arial"/>
           <w:lang w:val="en-US"/>
         </w:rPr>
-        <w:t xml:space="preserve">RCAgent: Cloud root cause analysis by autonomous agents with tool-augmented large language models. En </w:t>
+        <w:t>RCAgent</w:t>
+      </w:r>
+      <w:proofErr w:type="spellEnd"/>
+      <w:r>
+        <w:rPr>
+          <w:rFonts w:ascii="Arial" w:hAnsi="Arial" w:cs="Arial"/>
+          <w:lang w:val="en-US"/>
+        </w:rPr>
+        <w:t xml:space="preserve">: Cloud root cause analysis by autonomous agents with tool-augmented large language models. En </w:t>
       </w:r>
       <w:r>
         <w:rPr>
@@ -8803,7 +9418,27 @@
           <w:iCs/>
           <w:lang w:val="en-US"/>
         </w:rPr>
-        <w:t>Advances in Neural Information Processing Systems 36 (NeurIPS 2023), Datasets and Benchmarks Track</w:t>
+        <w:t>Advances in Neural Information Processing Systems 36 (</w:t>
+      </w:r>
+      <w:proofErr w:type="spellStart"/>
+      <w:r>
+        <w:rPr>
+          <w:rFonts w:ascii="Arial" w:hAnsi="Arial" w:cs="Arial"/>
+          <w:i/>
+          <w:iCs/>
+          <w:lang w:val="en-US"/>
+        </w:rPr>
+        <w:t>NeurIPS</w:t>
+      </w:r>
+      <w:proofErr w:type="spellEnd"/>
+      <w:r>
+        <w:rPr>
+          <w:rFonts w:ascii="Arial" w:hAnsi="Arial" w:cs="Arial"/>
+          <w:i/>
+          <w:iCs/>
+          <w:lang w:val="en-US"/>
+        </w:rPr>
+        <w:t xml:space="preserve"> 2023), Datasets and Benchmarks Track</w:t>
       </w:r>
       <w:r>
         <w:rPr>
@@ -10488,7 +11123,6 @@
   <w:style w:type="character" w:default="1" w:styleId="Fuentedeprrafopredeter">
     <w:name w:val="Default Paragraph Font"/>
     <w:uiPriority w:val="1"/>
-    <w:semiHidden/>
     <w:unhideWhenUsed/>
   </w:style>
   <w:style w:type="table" w:default="1" w:styleId="Tablanormal">
@@ -10970,6 +11604,27 @@
 </file>
 
 <file path=customXml/item1.xml><?xml version="1.0" encoding="utf-8"?>
+<b:Sources xmlns:b="http://schemas.openxmlformats.org/officeDocument/2006/bibliography" xmlns="http://schemas.openxmlformats.org/officeDocument/2006/bibliography" SelectedStyle="\APASixthEditionOfficeOnline.xsl" StyleName="APA" Version="6"/>
+</file>
+
+<file path=customXml/item2.xml><?xml version="1.0" encoding="utf-8"?>
+<p:properties xmlns:p="http://schemas.microsoft.com/office/2006/metadata/properties" xmlns:xsi="http://www.w3.org/2001/XMLSchema-instance" xmlns:pc="http://schemas.microsoft.com/office/infopath/2007/PartnerControls">
+  <documentManagement>
+    <ReferenceId xmlns="d921d922-e586-4070-94cf-401e9ff1332c" xsi:nil="true"/>
+  </documentManagement>
+</p:properties>
+</file>
+
+<file path=customXml/item3.xml><?xml version="1.0" encoding="utf-8"?>
+<?mso-contentType ?>
+<FormTemplates xmlns="http://schemas.microsoft.com/sharepoint/v3/contenttype/forms">
+  <Display>DocumentLibraryForm</Display>
+  <Edit>DocumentLibraryForm</Edit>
+  <New>DocumentLibraryForm</New>
+</FormTemplates>
+</file>
+
+<file path=customXml/item4.xml><?xml version="1.0" encoding="utf-8"?>
 <ct:contentTypeSchema xmlns:ct="http://schemas.microsoft.com/office/2006/metadata/contentType" xmlns:ma="http://schemas.microsoft.com/office/2006/metadata/properties/metaAttributes" ct:_="" ma:_="" ma:contentTypeName="Document" ma:contentTypeID="0x0101006AF304BD0D0B7C4698522C08709C00BB" ma:contentTypeVersion="4" ma:contentTypeDescription="Create a new document." ma:contentTypeScope="" ma:versionID="d87bf246123dbc96f665515db9402ea3">
   <xsd:schema xmlns:xsd="http://www.w3.org/2001/XMLSchema" xmlns:xs="http://www.w3.org/2001/XMLSchema" xmlns:p="http://schemas.microsoft.com/office/2006/metadata/properties" xmlns:ns2="d921d922-e586-4070-94cf-401e9ff1332c" targetNamespace="http://schemas.microsoft.com/office/2006/metadata/properties" ma:root="true" ma:fieldsID="814706c9f71ffcccbcbebef487bdee00" ns2:_="">
     <xsd:import namespace="d921d922-e586-4070-94cf-401e9ff1332c"/>
@@ -11113,28 +11768,33 @@
 </ct:contentTypeSchema>
 </file>
 
-<file path=customXml/item2.xml><?xml version="1.0" encoding="utf-8"?>
-<?mso-contentType ?>
-<FormTemplates xmlns="http://schemas.microsoft.com/sharepoint/v3/contenttype/forms">
-  <Display>DocumentLibraryForm</Display>
-  <Edit>DocumentLibraryForm</Edit>
-  <New>DocumentLibraryForm</New>
-</FormTemplates>
+<file path=customXml/itemProps1.xml><?xml version="1.0" encoding="utf-8"?>
+<ds:datastoreItem xmlns:ds="http://schemas.openxmlformats.org/officeDocument/2006/customXml" ds:itemID="{2A81F8F4-56D4-4EE4-AC7B-B3FAD30CD657}">
+  <ds:schemaRefs>
+    <ds:schemaRef ds:uri="http://schemas.openxmlformats.org/officeDocument/2006/bibliography"/>
+  </ds:schemaRefs>
+</ds:datastoreItem>
 </file>
 
-<file path=customXml/item3.xml><?xml version="1.0" encoding="utf-8"?>
-<p:properties xmlns:p="http://schemas.microsoft.com/office/2006/metadata/properties" xmlns:xsi="http://www.w3.org/2001/XMLSchema-instance" xmlns:pc="http://schemas.microsoft.com/office/infopath/2007/PartnerControls">
-  <documentManagement>
-    <ReferenceId xmlns="d921d922-e586-4070-94cf-401e9ff1332c" xsi:nil="true"/>
-  </documentManagement>
-</p:properties>
+<file path=customXml/itemProps2.xml><?xml version="1.0" encoding="utf-8"?>
+<ds:datastoreItem xmlns:ds="http://schemas.openxmlformats.org/officeDocument/2006/customXml" ds:itemID="{0A485150-6D8C-4680-B13D-3C6444219884}">
+  <ds:schemaRefs>
+    <ds:schemaRef ds:uri="http://schemas.microsoft.com/office/2006/metadata/properties"/>
+    <ds:schemaRef ds:uri="http://schemas.microsoft.com/office/infopath/2007/PartnerControls"/>
+    <ds:schemaRef ds:uri="d921d922-e586-4070-94cf-401e9ff1332c"/>
+  </ds:schemaRefs>
+</ds:datastoreItem>
 </file>
 
-<file path=customXml/item4.xml><?xml version="1.0" encoding="utf-8"?>
-<b:Sources xmlns:b="http://schemas.openxmlformats.org/officeDocument/2006/bibliography" xmlns="http://schemas.openxmlformats.org/officeDocument/2006/bibliography" SelectedStyle="\APASixthEditionOfficeOnline.xsl" StyleName="APA" Version="6"/>
+<file path=customXml/itemProps3.xml><?xml version="1.0" encoding="utf-8"?>
+<ds:datastoreItem xmlns:ds="http://schemas.openxmlformats.org/officeDocument/2006/customXml" ds:itemID="{C7DAC258-E4DA-446C-926C-E7A60E0F13CC}">
+  <ds:schemaRefs>
+    <ds:schemaRef ds:uri="http://schemas.microsoft.com/sharepoint/v3/contenttype/forms"/>
+  </ds:schemaRefs>
+</ds:datastoreItem>
 </file>
 
-<file path=customXml/itemProps1.xml><?xml version="1.0" encoding="utf-8"?>
+<file path=customXml/itemProps4.xml><?xml version="1.0" encoding="utf-8"?>
 <ds:datastoreItem xmlns:ds="http://schemas.openxmlformats.org/officeDocument/2006/customXml" ds:itemID="{66617E81-A932-4195-A0D0-208078D8F9E1}">
   <ds:schemaRefs>
     <ds:schemaRef ds:uri="http://schemas.microsoft.com/office/2006/metadata/contentType"/>
@@ -11150,30 +11810,4 @@
     <ds:schemaRef ds:uri="http://schemas.microsoft.com/internal/obd"/>
   </ds:schemaRefs>
 </ds:datastoreItem>
-</file>
-
-<file path=customXml/itemProps2.xml><?xml version="1.0" encoding="utf-8"?>
-<ds:datastoreItem xmlns:ds="http://schemas.openxmlformats.org/officeDocument/2006/customXml" ds:itemID="{C7DAC258-E4DA-446C-926C-E7A60E0F13CC}">
-  <ds:schemaRefs>
-    <ds:schemaRef ds:uri="http://schemas.microsoft.com/sharepoint/v3/contenttype/forms"/>
-  </ds:schemaRefs>
-</ds:datastoreItem>
-</file>
-
-<file path=customXml/itemProps3.xml><?xml version="1.0" encoding="utf-8"?>
-<ds:datastoreItem xmlns:ds="http://schemas.openxmlformats.org/officeDocument/2006/customXml" ds:itemID="{0A485150-6D8C-4680-B13D-3C6444219884}">
-  <ds:schemaRefs>
-    <ds:schemaRef ds:uri="http://schemas.microsoft.com/office/2006/metadata/properties"/>
-    <ds:schemaRef ds:uri="http://schemas.microsoft.com/office/infopath/2007/PartnerControls"/>
-    <ds:schemaRef ds:uri="d921d922-e586-4070-94cf-401e9ff1332c"/>
-  </ds:schemaRefs>
-</ds:datastoreItem>
-</file>
-
-<file path=customXml/itemProps4.xml><?xml version="1.0" encoding="utf-8"?>
-<ds:datastoreItem xmlns:ds="http://schemas.openxmlformats.org/officeDocument/2006/customXml" ds:itemID="{2A81F8F4-56D4-4EE4-AC7B-B3FAD30CD657}">
-  <ds:schemaRefs>
-    <ds:schemaRef ds:uri="http://schemas.openxmlformats.org/officeDocument/2006/bibliography"/>
-  </ds:schemaRefs>
-</ds:datastoreItem>
 </file>
</xml_diff>